<commit_message>
Verify citations against source PDFs and correct paper
- Fix sample description (Chen et al.), Adams reactions (Pan et al.), interviewees (Oplatka)
- Add page-specific citations from Kamir (culture, silence, statistics) and Oplatka (Organ, Podsakoff)
- Add Leymann's work-environment hypothesis and leadership styles via Feijo et al.
- Keep Part A at 6 pages

Co-Authored-By: Claude Opus 5.5 <noreply@anthropic.com>
Claude-Session: https://claude.ai/code/session_01HRkqVTfSkfLSvYdwqYD5BN
</commit_message>
<xml_diff>
--- a/papers/עבודת-סיכום-התנהגות-ארגונית.docx
+++ b/papers/עבודת-סיכום-התנהגות-ארגונית.docx
@@ -487,7 +487,7 @@
           <w:szCs w:val="24"/>
           <w:rtl/>
         </w:rPr>
-        <w:t xml:space="preserve">בספרות מקובלות שלוש דרכים להגדיר לחץ. הראשונה מתמקדת בתוצאות: תסמינים גופניים, קוגניטיביים, רגשיים והתנהגותיים. השנייה מתמקדת בפער בין דרישות הסביבה למשאבי הפרט, ובמרכזה רעיון ההתאמה בין אדם לסביבה. השלישית מתמקדת במקורות הלחץ, ובהם עמימות תפקיד, קונפליקט תפקידי, דרישות סותרות, היעדר אוטונומיה והיעדר משוב. סקירה שיטתית של גורמי סיכון בעבודה מצאה שאותם מאפיינים בדיוק, קונפליקט תפקידי, עמימות, עומס ולחץ זמן, חוזרים שוב ושוב כגורמים המזיקים לעובדים (</w:t>
+        <w:t xml:space="preserve">בספרות מקובלות שלוש דרכים להגדיר לחץ. הראשונה מתמקדת בתוצאות: תסמינים גופניים, קוגניטיביים, רגשיים והתנהגותיים. השנייה מתמקדת בפער בין דרישות הסביבה למשאבי הפרט, ובמרכזה רעיון ההתאמה בין אדם לסביבה. השלישית מתמקדת במקורות הלחץ, ובהם עמימות תפקיד, קונפליקט תפקידי, דרישות סותרות, היעדר אוטונומיה והיעדר משוב. אותם מאפיינים בדיוק, קונפליקט תפקידי, עמימות, דרישות גבוהות ולחץ עבודה, נמצאו בסקירה שיטתית של 51 מחקרים כקשורים בעוצמה גם לפגיעה בעובדים בדמות התעמרות (</w:t>
       </w:r>
       <w:r>
         <w:rPr>
@@ -628,22 +628,6 @@
           <w:rtl/>
         </w:rPr>
         <w:t xml:space="preserve">). לפיו, לחץ אינו תכונה של המצב אלא תוצאה של הערכה: בהערכה ראשונית האדם שואל אם המצב מאיים או מאתגר, ובהערכה משנית הוא בודק אילו משאבים עומדים לרשותו כדי להתמודד.</w:t>
-      </w:r>
-    </w:p>
-    <w:p>
-      <w:pPr>
-        <w:bidi/>
-        <w:spacing w:after="120" w:line="360"/>
-        <w:jc w:val="both"/>
-      </w:pPr>
-      <w:r>
-        <w:rPr>
-          <w:rFonts w:ascii="David" w:cs="David" w:eastAsia="David" w:hAnsi="David"/>
-          <w:sz w:val="24"/>
-          <w:szCs w:val="24"/>
-          <w:rtl/>
-        </w:rPr>
-        <w:t xml:space="preserve">ההבחנה בין איום לאתגר חשובה במיוחד בעבודה ניהולית. אותו יעד רבעוני יכול להיתפס אצל עובד אחד כהזדמנות להוכיח את עצמו ואצל אחר כסכנה לכישלון פומבי. ההבדל אינו ביעד עצמו אלא בפרשנות ובמשאבים שהעובד מרגיש שיש לו: ידע, זמן, תמיכה מהמנהל ומהעמיתים.</w:t>
       </w:r>
     </w:p>
     <w:p>
@@ -714,7 +698,7 @@
           <w:szCs w:val="24"/>
           <w:rtl/>
         </w:rPr>
-        <w:t xml:space="preserve">) בחנו 260 משתתפים ומצאו שני מסלולים נפרדים. נוירוטיות קשורה למסלול של "איום": אנשים עם נוירוטיות גבוהה חווים יותר אירועים כמלחיצים, מפרשים את הלחץ כמזיק, ומדווחים על מצוקה רבה יותר. מצפוניות קשורה למסלול של "אתגר": היא מלווה בתפיסה שלחץ יכול לקדם, ובגמישות רבה יותר בבחירת דרכי התמודדות. מוחצנות, נעימות ופתיחות נמצאו קשורות ישירות לגמישות בהתמודדות. במילים אחרות, האישיות משפיעה על הלחץ בשלוש נקודות: מה נחשב מלחיץ, איך הוא מתפרש, ומה עושים איתו.</w:t>
+        <w:t xml:space="preserve">) בחנו 260 סטודנטים לתואר ראשון בסינגפור ומצאו שני מסלולים נפרדים. נוירוטיות קשורה למסלול של "איום": אנשים עם נוירוטיות גבוהה חווים יותר אירועים כמלחיצים, מפרשים את הלחץ כמזיק, ומדווחים על מצוקה רבה יותר. מצפוניות קשורה למסלול של "אתגר": היא מלווה בתפיסה שלחץ יכול לקדם, ובגמישות רבה יותר בבחירת דרכי התמודדות. מוחצנות, נעימות ופתיחות נמצאו קשורות ישירות לגמישות בהתמודדות. במילים אחרות, האישיות משפיעה על הלחץ בשלוש נקודות: מה נחשב מלחיץ, איך הוא מתפרש, ומה עושים איתו.</w:t>
       </w:r>
     </w:p>
     <w:p>
@@ -924,7 +908,43 @@
           <w:szCs w:val="24"/>
           <w:rtl/>
         </w:rPr>
-        <w:t xml:space="preserve">). התיאוריה נשענת על רעיונות ההשוואה החברתית, הדיסוננס הקוגניטיבי והחליפין החברתי. כשהעובד מזהה חוסר איזון נוצר מתח, והוא פועל כדי להפחית אותו: מצמצם את ההשקעה, דורש יותר, משנה את נקודת ההשוואה, מפרש מחדש את המצב או עוזב. תיאוריית הצדק הארגוני התפתחה מתוך רעיון זה. במחקר שכלל 2,566 עובדים מ-45 מפעלים נמצא שתחושת צדק ארגוני מנבאת התנהגות ארגונית חיובית, והממצא שוחזר גם בניסוי מבוקר (</w:t>
+        <w:t xml:space="preserve">). התיאוריה נשענת על רעיונות ההשוואה החברתית, הדיסוננס הקוגניטיבי והחליפין החברתי. כשהיחסים שווים העובד חש הוגנות ושביעות רצון. כשהם אינם שווים נוצרת תחושת אי-צדק, והעובד מנסה לשנות את המצב וליצור איזון חדש, למשל על ידי צמצום ההשקעה שלו (</w:t>
+      </w:r>
+      <w:r>
+        <w:rPr>
+          <w:rFonts w:ascii="David" w:cs="David" w:eastAsia="David" w:hAnsi="David"/>
+          <w:sz w:val="24"/>
+          <w:szCs w:val="24"/>
+          <w:rtl/>
+        </w:rPr>
+        <w:t xml:space="preserve">‏</w:t>
+      </w:r>
+      <w:r>
+        <w:rPr>
+          <w:rFonts w:ascii="David" w:cs="David" w:eastAsia="David" w:hAnsi="David"/>
+          <w:sz w:val="24"/>
+          <w:szCs w:val="24"/>
+          <w:rtl w:val="false"/>
+        </w:rPr>
+        <w:t xml:space="preserve">Pan et al., 2018</w:t>
+      </w:r>
+      <w:r>
+        <w:rPr>
+          <w:rFonts w:ascii="David" w:cs="David" w:eastAsia="David" w:hAnsi="David"/>
+          <w:sz w:val="24"/>
+          <w:szCs w:val="24"/>
+          <w:rtl/>
+        </w:rPr>
+        <w:t xml:space="preserve">‏</w:t>
+      </w:r>
+      <w:r>
+        <w:rPr>
+          <w:rFonts w:ascii="David" w:cs="David" w:eastAsia="David" w:hAnsi="David"/>
+          <w:sz w:val="24"/>
+          <w:szCs w:val="24"/>
+          <w:rtl/>
+        </w:rPr>
+        <w:t xml:space="preserve">). תיאוריית הצדק הארגוני התפתחה מתוך רעיון זה. במחקר שכלל 2,566 עובדים מ-45 מפעלים נמצא שתחושת צדק ארגוני מנבאת התנהגות ארגונית חיובית, והממצא שוחזר בניסוי מבוקר שכלל 800 עובדים (</w:t>
       </w:r>
       <w:r>
         <w:rPr>
@@ -1083,7 +1103,79 @@
           <w:szCs w:val="24"/>
           <w:rtl/>
         </w:rPr>
-        <w:t xml:space="preserve">). בעל צורך הישג גבוה מחפש יעדים מאתגרים אך ברי השגה ומשוב על ביצועיו. בעל צורך השתייכות גבוה מונע מקשרים ומקבלה. בעל צורך כוח גבוה רוצה להשפיע על אחרים. הטענה הקלאסית הייתה שמנהל אפקטיבי מתאפיין בצורך כוח גבוה ובצורך השתייכות נמוך. שטיינמן ועמיתיה (</w:t>
+        <w:t xml:space="preserve">). בעל צורך הישג גבוה מחפש יעדים מאתגרים אך ברי השגה ומשוב על ביצועיו. בעל צורך השתייכות גבוה מונע מקשרים ומקבלה. בעל צורך כוח גבוה רוצה להשפיע על אחרים. הטענה הקלאסית, המכונה "דפוס המניעים המנהיגותי", הייתה שמנהל אפקטיבי מתאפיין בצורך כוח גבוה ובצורך השתייכות נמוך, ומנהלים בעלי דפוס זה אכן קודמו יותר לאחר שמונה ו-16 שנים (</w:t>
+      </w:r>
+      <w:r>
+        <w:rPr>
+          <w:rFonts w:ascii="David" w:cs="David" w:eastAsia="David" w:hAnsi="David"/>
+          <w:sz w:val="24"/>
+          <w:szCs w:val="24"/>
+          <w:rtl/>
+        </w:rPr>
+        <w:t xml:space="preserve">‏</w:t>
+      </w:r>
+      <w:r>
+        <w:rPr>
+          <w:rFonts w:ascii="David" w:cs="David" w:eastAsia="David" w:hAnsi="David"/>
+          <w:sz w:val="24"/>
+          <w:szCs w:val="24"/>
+          <w:rtl w:val="false"/>
+        </w:rPr>
+        <w:t xml:space="preserve">McClelland &amp; Boyatzis, 1982</w:t>
+      </w:r>
+      <w:r>
+        <w:rPr>
+          <w:rFonts w:ascii="David" w:cs="David" w:eastAsia="David" w:hAnsi="David"/>
+          <w:sz w:val="24"/>
+          <w:szCs w:val="24"/>
+          <w:rtl/>
+        </w:rPr>
+        <w:t xml:space="preserve">‏</w:t>
+      </w:r>
+      <w:r>
+        <w:rPr>
+          <w:rFonts w:ascii="David" w:cs="David" w:eastAsia="David" w:hAnsi="David"/>
+          <w:sz w:val="24"/>
+          <w:szCs w:val="24"/>
+          <w:rtl/>
+        </w:rPr>
+        <w:t xml:space="preserve">, כפי שמצוטט אצל </w:t>
+      </w:r>
+      <w:r>
+        <w:rPr>
+          <w:rFonts w:ascii="David" w:cs="David" w:eastAsia="David" w:hAnsi="David"/>
+          <w:sz w:val="24"/>
+          <w:szCs w:val="24"/>
+          <w:rtl/>
+        </w:rPr>
+        <w:t xml:space="preserve">‏</w:t>
+      </w:r>
+      <w:r>
+        <w:rPr>
+          <w:rFonts w:ascii="David" w:cs="David" w:eastAsia="David" w:hAnsi="David"/>
+          <w:sz w:val="24"/>
+          <w:szCs w:val="24"/>
+          <w:rtl w:val="false"/>
+        </w:rPr>
+        <w:t xml:space="preserve">Steinmann et al., 2016</w:t>
+      </w:r>
+      <w:r>
+        <w:rPr>
+          <w:rFonts w:ascii="David" w:cs="David" w:eastAsia="David" w:hAnsi="David"/>
+          <w:sz w:val="24"/>
+          <w:szCs w:val="24"/>
+          <w:rtl/>
+        </w:rPr>
+        <w:t xml:space="preserve">‏</w:t>
+      </w:r>
+      <w:r>
+        <w:rPr>
+          <w:rFonts w:ascii="David" w:cs="David" w:eastAsia="David" w:hAnsi="David"/>
+          <w:sz w:val="24"/>
+          <w:szCs w:val="24"/>
+          <w:rtl/>
+        </w:rPr>
+        <w:t xml:space="preserve">). שטיינמן ועמיתיה (</w:t>
       </w:r>
       <w:r>
         <w:rPr>
@@ -1379,23 +1471,7 @@
           <w:szCs w:val="24"/>
           <w:rtl/>
         </w:rPr>
-        <w:t xml:space="preserve">התעמרות היא מצב מתמשך, בדרך כלל שלושה חודשים ויותר, שבו אדם נחשף שוב ושוב להתנהגות פוגענית: זלזול, השפלה בנוכחות אחרים, גסות, התפרצויות זעם, בידוד חברתי או מידור ממידע וממשימות. ההתנהגות יכולה להגיע ממנהלים, מעמיתים ואף מלקוחות. מה שמבחין אותה מקונפליקט רגיל הוא החזרתיות, משך הזמן ופער הכוחות שמקשה על הנפגע להתגונן. קמיר (2018) מתארת כיצד התפתח בישראל מתחילת שנות האלפיים שיח מקצועי על התופעה, ומציעה לתרגם את התובנות הפסיכולוגיות לשפה משפטית המבוססת על כבוד האדם. לפי גישתה, הפגיעה אינה רק בבריאות ובתפקוד של העובד אלא בכבודו, ולכן יש לה משמעות ערכית ולא רק מקצועית.</w:t>
-      </w:r>
-    </w:p>
-    <w:p>
-      <w:pPr>
-        <w:bidi/>
-        <w:spacing w:after="120" w:line="360"/>
-        <w:jc w:val="both"/>
-      </w:pPr>
-      <w:r>
-        <w:rPr>
-          <w:rFonts w:ascii="David" w:cs="David" w:eastAsia="David" w:hAnsi="David"/>
-          <w:sz w:val="24"/>
-          <w:szCs w:val="24"/>
-          <w:rtl/>
-        </w:rPr>
-        <w:t xml:space="preserve">סקירה שיטתית של גורמי הסיכון להתעמרות מצאה שהם מצויים בעיקר בארגון העבודה: קונפליקט תפקידי, עמימות תפקיד, משימות חד-גוניות, דרישות גבוהות, לחץ עבודה וחוסר בהירות בחלוקת האחריות (</w:t>
+        <w:t xml:space="preserve">התעמרות היא מצב מתמשך, בדרך כלל שלושה חודשים ויותר, שבו אדם נחשף שוב ושוב להתנהגות פוגענית: זלזול, השפלה בנוכחות אחרים, גסות, התפרצויות זעם, בידוד חברתי או מידור ממידע וממשימות. ההתנהגות יכולה להגיע ממנהלים, מעמיתים ואף מלקוחות. בסקר רשמי של משרד הכלכלה דיווחו 36.9% מהנפגעים על פגיעה ממנהלים, 33.6% מעמיתים ו-23.1% מלקוחות (פפרמן ובר-צורי, 2016, כפי שמצוטט אצל קמיר, 2018, עמ' 310). מה שמבחין אותה מקונפליקט רגיל הוא החזרתיות, משך הזמן ופער הכוחות שמקשה על הנפגע להתגונן (</w:t>
       </w:r>
       <w:r>
         <w:rPr>
@@ -1431,6 +1507,130 @@
           <w:szCs w:val="24"/>
           <w:rtl/>
         </w:rPr>
+        <w:t xml:space="preserve">). קמיר (2018) מתארת כיצד התפתח בישראל מתחילת שנות האלפיים שיח מקצועי על התופעה, ומציעה לתרגם את התובנות הפסיכולוגיות לשפה משפטית המבוססת על כבוד האדם. לפי גישתה, הפגיעה אינה רק בבריאות ובתפקוד של העובד אלא בכבודו, ולכן יש לה משמעות ערכית ולא רק מקצועית.</w:t>
+      </w:r>
+    </w:p>
+    <w:p>
+      <w:pPr>
+        <w:bidi/>
+        <w:spacing w:after="120" w:line="360"/>
+        <w:jc w:val="both"/>
+      </w:pPr>
+      <w:r>
+        <w:rPr>
+          <w:rFonts w:ascii="David" w:cs="David" w:eastAsia="David" w:hAnsi="David"/>
+          <w:sz w:val="24"/>
+          <w:szCs w:val="24"/>
+          <w:rtl/>
+        </w:rPr>
+        <w:t xml:space="preserve">כבר בשנות התשעים הציע לימן את "השערת סביבת העבודה", שלפיה התעמרות צומחת מליקויים בתכנון העבודה, מליקויים בהתנהגות המנהלים, מעמדו החשוף של הנפגע ומרמה מוסרית נמוכה בארגון (</w:t>
+      </w:r>
+      <w:r>
+        <w:rPr>
+          <w:rFonts w:ascii="David" w:cs="David" w:eastAsia="David" w:hAnsi="David"/>
+          <w:sz w:val="24"/>
+          <w:szCs w:val="24"/>
+          <w:rtl/>
+        </w:rPr>
+        <w:t xml:space="preserve">‏</w:t>
+      </w:r>
+      <w:r>
+        <w:rPr>
+          <w:rFonts w:ascii="David" w:cs="David" w:eastAsia="David" w:hAnsi="David"/>
+          <w:sz w:val="24"/>
+          <w:szCs w:val="24"/>
+          <w:rtl w:val="false"/>
+        </w:rPr>
+        <w:t xml:space="preserve">Leymann, 1996</w:t>
+      </w:r>
+      <w:r>
+        <w:rPr>
+          <w:rFonts w:ascii="David" w:cs="David" w:eastAsia="David" w:hAnsi="David"/>
+          <w:sz w:val="24"/>
+          <w:szCs w:val="24"/>
+          <w:rtl/>
+        </w:rPr>
+        <w:t xml:space="preserve">‏</w:t>
+      </w:r>
+      <w:r>
+        <w:rPr>
+          <w:rFonts w:ascii="David" w:cs="David" w:eastAsia="David" w:hAnsi="David"/>
+          <w:sz w:val="24"/>
+          <w:szCs w:val="24"/>
+          <w:rtl/>
+        </w:rPr>
+        <w:t xml:space="preserve">, כפי שמצוטט אצל </w:t>
+      </w:r>
+      <w:r>
+        <w:rPr>
+          <w:rFonts w:ascii="David" w:cs="David" w:eastAsia="David" w:hAnsi="David"/>
+          <w:sz w:val="24"/>
+          <w:szCs w:val="24"/>
+          <w:rtl/>
+        </w:rPr>
+        <w:t xml:space="preserve">‏</w:t>
+      </w:r>
+      <w:r>
+        <w:rPr>
+          <w:rFonts w:ascii="David" w:cs="David" w:eastAsia="David" w:hAnsi="David"/>
+          <w:sz w:val="24"/>
+          <w:szCs w:val="24"/>
+          <w:rtl w:val="false"/>
+        </w:rPr>
+        <w:t xml:space="preserve">Feijó et al., 2019</w:t>
+      </w:r>
+      <w:r>
+        <w:rPr>
+          <w:rFonts w:ascii="David" w:cs="David" w:eastAsia="David" w:hAnsi="David"/>
+          <w:sz w:val="24"/>
+          <w:szCs w:val="24"/>
+          <w:rtl/>
+        </w:rPr>
+        <w:t xml:space="preserve">‏</w:t>
+      </w:r>
+      <w:r>
+        <w:rPr>
+          <w:rFonts w:ascii="David" w:cs="David" w:eastAsia="David" w:hAnsi="David"/>
+          <w:sz w:val="24"/>
+          <w:szCs w:val="24"/>
+          <w:rtl/>
+        </w:rPr>
+        <w:t xml:space="preserve">). סקירה שיטתית של 51 מחקרים תמכה בכך: קונפליקט תפקידי, עמימות תפקיד, משימות חד-גוניות, דרישות גבוהות, לחץ עבודה וחוסר בהירות בחלוקת האחריות נמצאו קשורים בעוצמה להתעמרות, וכך גם סגנונות ניהול סמכותני ומתירני (</w:t>
+      </w:r>
+      <w:r>
+        <w:rPr>
+          <w:rFonts w:ascii="David" w:cs="David" w:eastAsia="David" w:hAnsi="David"/>
+          <w:sz w:val="24"/>
+          <w:szCs w:val="24"/>
+          <w:rtl/>
+        </w:rPr>
+        <w:t xml:space="preserve">‏</w:t>
+      </w:r>
+      <w:r>
+        <w:rPr>
+          <w:rFonts w:ascii="David" w:cs="David" w:eastAsia="David" w:hAnsi="David"/>
+          <w:sz w:val="24"/>
+          <w:szCs w:val="24"/>
+          <w:rtl w:val="false"/>
+        </w:rPr>
+        <w:t xml:space="preserve">Feijó et al., 2019</w:t>
+      </w:r>
+      <w:r>
+        <w:rPr>
+          <w:rFonts w:ascii="David" w:cs="David" w:eastAsia="David" w:hAnsi="David"/>
+          <w:sz w:val="24"/>
+          <w:szCs w:val="24"/>
+          <w:rtl/>
+        </w:rPr>
+        <w:t xml:space="preserve">‏</w:t>
+      </w:r>
+      <w:r>
+        <w:rPr>
+          <w:rFonts w:ascii="David" w:cs="David" w:eastAsia="David" w:hAnsi="David"/>
+          <w:sz w:val="24"/>
+          <w:szCs w:val="24"/>
+          <w:rtl/>
+        </w:rPr>
         <w:t xml:space="preserve">). הממצא הזה מסיט את תשומת הלב מ"מי הפוגע" אל "מה בסביבה מאפשר לו לפגוע".</w:t>
       </w:r>
     </w:p>
@@ -1447,7 +1647,7 @@
           <w:szCs w:val="24"/>
           <w:rtl/>
         </w:rPr>
-        <w:t xml:space="preserve">התעמרות נמשכת זמן רב גם משום ששני הצדדים שותקים. ארגונים נוטים לפרש את המצב כחיכוך בין-אישי שיחלוף, מתקשים לזהות שמדובר בפגיעה, ולעיתים חוששים שבירור יחשוף בעיות נוספות. הנפגעים מתקשים לזהות מה קורה להם, נחלשים עם הזמן, חוששים לפרנסתם, ולעיתים אף מאמינים שמגיע להם היחס. התוצאה היא פגיעה שגלויה לרבים אך אינה מדווחת, ולכן מנהל אינו יכול להסתמך על תלונה כדי לדעת שיש בעיה.</w:t>
+        <w:t xml:space="preserve">מאירי כינה את התופעה "המגפה השקטה", ותיאר מדוע ארגונים שותקים מולה: מיעוט תלונות, מניפולציות של הפוגע שמסיטות ממנו את האש, בלבול בין ניהול דורשני לניהול דורסני, אמונה שהדברים יסתדרו מעצמם, חשש של מנהלים מהפוגע, והכחשה של עומק הנזק (מאירי, 2013, כפי שמצוטט אצל קמיר, 2018, עמ' 319-320). לפי ניתוח זה, הנפגע נבחר לא פעם דווקא בגלל איכויותיו: חרוץ, מסור, בעל נטייה לרצות, ומתקשה להציב גבולות. התוצאה היא פגיעה שגלויה לרבים אך אינה מדווחת, ולכן מנהל אינו יכול להסתמך על תלונה כדי לדעת שיש בעיה.</w:t>
       </w:r>
     </w:p>
     <w:p>
@@ -1641,7 +1841,7 @@
           <w:szCs w:val="24"/>
           <w:rtl/>
         </w:rPr>
-        <w:t xml:space="preserve">התרבות קובעת מה נחשב "נורמלי", ולכן היא קובעת גם אם התעמרות תזוהה בכלל. ארגון יכול להצהיר על כבוד הדדי ברמת הערכים המוצהרים, ובאותו זמן להחזיק בהנחת יסוד שלפיה "מי שלא עומד בלחץ לא מתאים לכאן". הפער בין שתי הרמות של שיין (</w:t>
+        <w:t xml:space="preserve">התרבות קובעת מה נחשב "נורמלי", ולכן היא קובעת גם אם התעמרות תזוהה בכלל. סקירה שפורסמה בישראל מנתה את התרבות הארגונית כגורם הראשון המגביר את הסבירות לפגיעה, וקבעה כי "הצקה מתקיימת רק בתרבות ארגונית שמעודדת או מאפשרת התנהגות כזו" (כהן, 2004, כפי שמצוטט אצל קמיר, 2018, עמ' 309). ארגון יכול להצהיר על כבוד הדדי ברמת הערכים המוצהרים, ובאותו זמן להחזיק בהנחת יסוד שלפיה "מי שלא עומד בלחץ לא מתאים לכאן". הפער בין שתי הרמות של שיין (</w:t>
       </w:r>
       <w:r>
         <w:rPr>
@@ -1713,7 +1913,43 @@
           <w:szCs w:val="24"/>
           <w:rtl/>
         </w:rPr>
-        <w:t xml:space="preserve">) לפרופילים של מודל הערכים המתחרים: תרבות משימתית קיצונית מייצרת לחץ ודרישות גבוהות, ותרבות היררכית נוקשה מגדילה את פערי הכוח. גם תרבות צוותית אינה חסינה, שכן נאמנות לקבוצה עלולה להוביל לשתיקה. קמיר (2018) מדגישה שכבוד האדם צריך להפוך מערך מוצהר לנורמה מחייבת, וזו בדיוק העבודה של מנהל הביניים: הוא זה שמתרגם ערכים להתנהגות יומיומית. שיין (</w:t>
+        <w:t xml:space="preserve">) לפרופילים של מודל הערכים המתחרים: תרבות משימתית קיצונית מייצרת לחץ ודרישות גבוהות, ותרבות היררכית נוקשה מגדילה את פערי הכוח. קמיר (2018, עמ' 329) מוסיפה שהמבנה ההיררכי מעודד תחרות של "סכום אפס" בין עמיתים, ושבמקומות שבהם נורמות כאלה אינן מרוסנות בערכים של כבוד הדדי, התחרות עלולה להידרדר להתעמרות. מסיבה זו גם פייז'ו ועמיתיו (</w:t>
+      </w:r>
+      <w:r>
+        <w:rPr>
+          <w:rFonts w:ascii="David" w:cs="David" w:eastAsia="David" w:hAnsi="David"/>
+          <w:sz w:val="24"/>
+          <w:szCs w:val="24"/>
+          <w:rtl/>
+        </w:rPr>
+        <w:t xml:space="preserve">‏</w:t>
+      </w:r>
+      <w:r>
+        <w:rPr>
+          <w:rFonts w:ascii="David" w:cs="David" w:eastAsia="David" w:hAnsi="David"/>
+          <w:sz w:val="24"/>
+          <w:szCs w:val="24"/>
+          <w:rtl w:val="false"/>
+        </w:rPr>
+        <w:t xml:space="preserve">Feijó et al., 2019</w:t>
+      </w:r>
+      <w:r>
+        <w:rPr>
+          <w:rFonts w:ascii="David" w:cs="David" w:eastAsia="David" w:hAnsi="David"/>
+          <w:sz w:val="24"/>
+          <w:szCs w:val="24"/>
+          <w:rtl/>
+        </w:rPr>
+        <w:t xml:space="preserve">‏</w:t>
+      </w:r>
+      <w:r>
+        <w:rPr>
+          <w:rFonts w:ascii="David" w:cs="David" w:eastAsia="David" w:hAnsi="David"/>
+          <w:sz w:val="24"/>
+          <w:szCs w:val="24"/>
+          <w:rtl/>
+        </w:rPr>
+        <w:t xml:space="preserve">) מסכמים שמדיניות למניעת התעמרות חייבת לטפל בתרבות הארגון עצמה. גם תרבות צוותית אינה חסינה, שכן נאמנות לקבוצה עלולה להוביל לשתיקה. קמיר (2018) מדגישה שכבוד האדם צריך להפוך מערך מוצהר לנורמה מחייבת, וזו בדיוק העבודה של מנהל הביניים: הוא זה שמתרגם ערכים להתנהגות יומיומית. שיין (</w:t>
       </w:r>
       <w:r>
         <w:rPr>
@@ -1855,7 +2091,43 @@
           <w:szCs w:val="24"/>
           <w:rtl/>
         </w:rPr>
-        <w:t xml:space="preserve">, כפי שמצוטט אצל אופלטקה, 2007). ביטוייה הם עזרה לעמיתים, הקשבה לבעיות של אחרים, שיתוף במידע, הצעות לשיפור, דיוק בזמנים, שמירה על רכוש הארגון ונכונות להשלים משימות אחרי שעות העבודה. מקובל להבחין בין התנהגות אזרחית המכוונת לפרטים (עזרה לעמית) לבין התנהגות המכוונת לארגון כולו (שמירה על נהלים, השתתפות בפעילות ארגונית) (</w:t>
+        <w:t xml:space="preserve">, כפי שמצוטט אצל אופלטקה, 2007, עמ' 38). פודסקוף ועמיתיו הציעו שבעה מרכיבים: התנהגות מסייעת, אדיבות (נכונות לסבול אי-נוחות בלי להתלונן), נאמנות ארגונית, היענות לכללי הארגון, יוזמה אישית, יושר אזרחי והתפתחות אישית (</w:t>
+      </w:r>
+      <w:r>
+        <w:rPr>
+          <w:rFonts w:ascii="David" w:cs="David" w:eastAsia="David" w:hAnsi="David"/>
+          <w:sz w:val="24"/>
+          <w:szCs w:val="24"/>
+          <w:rtl/>
+        </w:rPr>
+        <w:t xml:space="preserve">‏</w:t>
+      </w:r>
+      <w:r>
+        <w:rPr>
+          <w:rFonts w:ascii="David" w:cs="David" w:eastAsia="David" w:hAnsi="David"/>
+          <w:sz w:val="24"/>
+          <w:szCs w:val="24"/>
+          <w:rtl w:val="false"/>
+        </w:rPr>
+        <w:t xml:space="preserve">Podsakoff et al., 2000</w:t>
+      </w:r>
+      <w:r>
+        <w:rPr>
+          <w:rFonts w:ascii="David" w:cs="David" w:eastAsia="David" w:hAnsi="David"/>
+          <w:sz w:val="24"/>
+          <w:szCs w:val="24"/>
+          <w:rtl/>
+        </w:rPr>
+        <w:t xml:space="preserve">‏</w:t>
+      </w:r>
+      <w:r>
+        <w:rPr>
+          <w:rFonts w:ascii="David" w:cs="David" w:eastAsia="David" w:hAnsi="David"/>
+          <w:sz w:val="24"/>
+          <w:szCs w:val="24"/>
+          <w:rtl/>
+        </w:rPr>
+        <w:t xml:space="preserve">, כפי שמצוטט אצל אופלטקה, 2007, עמ' 39-40). ביטוייה הם עזרה לעמיתים, הקשבה לבעיות של אחרים, שיתוף במידע, הצעות לשיפור, דיוק בזמנים, שמירה על רכוש הארגון ונכונות להשלים משימות אחרי שעות העבודה. מקובל להבחין בין התנהגות אזרחית המכוונת לפרטים (עזרה לעמית) לבין התנהגות המכוונת לארגון כולו (שמירה על נהלים, השתתפות בפעילות ארגונית) (אופלטקה, 2007; </w:t>
       </w:r>
       <w:r>
         <w:rPr>
@@ -1891,7 +2163,7 @@
           <w:szCs w:val="24"/>
           <w:rtl/>
         </w:rPr>
-        <w:t xml:space="preserve">). אופלטקה (2007) מצא, בראיונות עם מורים בישראל, שהופעת ההתנהגות תלויה בגורמים אישיים, ארגוניים ומנהיגותיים גם יחד. ההסבר המקובל נשען על תיאוריית החליפין החברתי ועל תיאוריית ההוגנות: עובד שמרגיש שהארגון נוהג בו בצדק נוטה להחזיר לו בתרומה עודפת (</w:t>
+        <w:t xml:space="preserve">). אופלטקה (2007) מצא, בראיונות עם מורים, מנהלים, מפקחים והורים בישראל, שהופעת ההתנהגות תלויה בגורמים אישיים, ארגוניים ומנהיגותיים גם יחד. ההסבר המקובל נשען על תיאוריית החליפין החברתי ועל תיאוריית ההוגנות: עובד שמרגיש שהארגון נוהג בו בצדק נוטה להחזיר לו בתרומה עודפת, ותפיסת הוגנות אכן נמצאה קשורה להתנהגות אזרחית (אופלטקה, 2007; </w:t>
       </w:r>
       <w:r>
         <w:rPr>
@@ -2163,22 +2435,6 @@
     </w:p>
     <w:p>
       <w:pPr>
-        <w:bidi/>
-        <w:spacing w:after="120" w:line="360"/>
-        <w:jc w:val="both"/>
-      </w:pPr>
-      <w:r>
-        <w:rPr>
-          <w:rFonts w:ascii="David" w:cs="David" w:eastAsia="David" w:hAnsi="David"/>
-          <w:sz w:val="24"/>
-          <w:szCs w:val="24"/>
-          <w:rtl/>
-        </w:rPr>
-        <w:t xml:space="preserve">מבחינה ארגונית, מקיאווליסטים נוטים להצליח דווקא בסביבות עמומות, שבהן הכללים אינם ברורים והמשאבים מחולקים לפי יחסים ולא לפי קריטריונים שקופים. בסביבות כאלה היכולת לקרוא אנשים ולהשתמש בהם היא יתרון. כשהכללים ברורים והתגמול שקוף, למניפולציה יש פחות מקום.</w:t>
-      </w:r>
-    </w:p>
-    <w:p>
-      <w:pPr>
         <w:keepNext/>
         <w:bidi/>
         <w:spacing w:after="80" w:before="60" w:line="360"/>
@@ -2298,22 +2554,6 @@
           <w:rtl/>
         </w:rPr>
         <w:t xml:space="preserve">). ההמלצה למשתתפים היא לבחון במערכת ההערכה ביחידה שלהם אילו התנהגויות אזרחיות נראות ומתוגמלות, ואילו נעשות בשקט ואינן זוכות לאף הכרה.</w:t>
-      </w:r>
-    </w:p>
-    <w:p>
-      <w:pPr>
-        <w:bidi/>
-        <w:spacing w:after="120" w:line="360"/>
-        <w:jc w:val="both"/>
-      </w:pPr>
-      <w:r>
-        <w:rPr>
-          <w:rFonts w:ascii="David" w:cs="David" w:eastAsia="David" w:hAnsi="David"/>
-          <w:sz w:val="24"/>
-          <w:szCs w:val="24"/>
-          <w:rtl/>
-        </w:rPr>
-        <w:t xml:space="preserve">בחלק המעשי של המפגש המשתתפים מקבלים תיאורי מקרה קצרים של עובדים שמתנדבים לעזור, ומתבקשים לזהות אילו סימנים מבחינים בין עזרה מתוך אכפתיות לבין עזרה לצורך ניהול רושם: האם העזרה ניתנת גם כשאין קהל, האם היא מופנית גם לעמיתים שאין להם כוח, והאם היא נמשכת כשהיא אינה מתוגמלת.</w:t>
       </w:r>
     </w:p>
     <w:p>
@@ -2666,6 +2906,22 @@
           <w:szCs w:val="24"/>
           <w:rtl/>
         </w:rPr>
+        <w:t xml:space="preserve">מה שהכי טלטל אותי היה התיאור של מאירי, כפי שקמיר (2018) מביאה אותו, של הנפגע הטיפוסי: עובד חרוץ, מסור, שנוטה לרצות ומתקשה להגיד "לא". זה תיאור מדויק של העובדת שראיתי. במשך חודשים הנחתי, בלי לומר זאת במפורש, שאם פוגעים בה כנראה יש לזה סיבה. הקריאה הבהירה לי שלעיתים קרובות ההפך נכון: דווקא האיכויות שלה הפכו אותה למטרה. גם רשימת הסיבות לשתיקה של ארגונים הייתה מוכרת מדי, ובעיקר הבלבול בין ניהול דורשני לניהול דורסני. אצלנו קראו לזה "סטנדרטים גבוהים".</w:t>
+      </w:r>
+    </w:p>
+    <w:p>
+      <w:pPr>
+        <w:bidi/>
+        <w:spacing w:after="120" w:line="360"/>
+        <w:jc w:val="both"/>
+      </w:pPr>
+      <w:r>
+        <w:rPr>
+          <w:rFonts w:ascii="David" w:cs="David" w:eastAsia="David" w:hAnsi="David"/>
+          <w:sz w:val="24"/>
+          <w:szCs w:val="24"/>
+          <w:rtl/>
+        </w:rPr>
         <w:t xml:space="preserve">בחיים האישיים זיהיתי את אותה דינמיקה בקבוצות קטנות יותר, למשל בקבוצת חברים שבה אחד נהיה שוב ושוב מושא לעקיצות. גם שם השתיקה של כולם היא מה שמאפשר לזה להימשך, ואף אחד לא מרגיש שהוא עושה משהו רע.</w:t>
       </w:r>
     </w:p>
@@ -2953,6 +3209,58 @@
           <w:rtl/>
         </w:rPr>
         <w:t xml:space="preserve">) הסבירה לי רגע אחד ספציפי. לפני שנתיים גיליתי שעמית שהצטרף אחריי ועושה עבודה דומה מרוויח יותר. לא עזבתי, אבל ההשקעה שלי ירדה בשקט: הפסקתי להתנדב לפרויקטים ולהישאר אחרי השעות. לא קראתי לזה אז "הפחתת תשומות", אבל זה בדיוק מה שהתיאוריה מתארת. מה שמעניין הוא שאף אחד לא שם לב. המנהל ראה ירידה קטנה במעורבות ופירש אותה כעייפות.</w:t>
+      </w:r>
+    </w:p>
+    <w:p>
+      <w:pPr>
+        <w:bidi/>
+        <w:spacing w:after="120" w:line="360"/>
+        <w:jc w:val="both"/>
+      </w:pPr>
+      <w:r>
+        <w:rPr>
+          <w:rFonts w:ascii="David" w:cs="David" w:eastAsia="David" w:hAnsi="David"/>
+          <w:sz w:val="24"/>
+          <w:szCs w:val="24"/>
+          <w:rtl/>
+        </w:rPr>
+        <w:t xml:space="preserve">מה שמעניין הוא שבמחקר של פאן ועמיתיו (</w:t>
+      </w:r>
+      <w:r>
+        <w:rPr>
+          <w:rFonts w:ascii="David" w:cs="David" w:eastAsia="David" w:hAnsi="David"/>
+          <w:sz w:val="24"/>
+          <w:szCs w:val="24"/>
+          <w:rtl/>
+        </w:rPr>
+        <w:t xml:space="preserve">‏</w:t>
+      </w:r>
+      <w:r>
+        <w:rPr>
+          <w:rFonts w:ascii="David" w:cs="David" w:eastAsia="David" w:hAnsi="David"/>
+          <w:sz w:val="24"/>
+          <w:szCs w:val="24"/>
+          <w:rtl w:val="false"/>
+        </w:rPr>
+        <w:t xml:space="preserve">Pan et al., 2018</w:t>
+      </w:r>
+      <w:r>
+        <w:rPr>
+          <w:rFonts w:ascii="David" w:cs="David" w:eastAsia="David" w:hAnsi="David"/>
+          <w:sz w:val="24"/>
+          <w:szCs w:val="24"/>
+          <w:rtl/>
+        </w:rPr>
+        <w:t xml:space="preserve">‏</w:t>
+      </w:r>
+      <w:r>
+        <w:rPr>
+          <w:rFonts w:ascii="David" w:cs="David" w:eastAsia="David" w:hAnsi="David"/>
+          <w:sz w:val="24"/>
+          <w:szCs w:val="24"/>
+          <w:rtl/>
+        </w:rPr>
+        <w:t xml:space="preserve">) הקשר בין תחושת צדק לבין התנהגות חיובית בעבודה עבר בעיקר בדרך עקיפה, ולא ישירה. זה מתאים למה שקרה לי: התגובה לא הייתה החלטה מודעת להפחית מאמץ, אלא שחיקה איטית של הרצון להשקיע.</w:t>
       </w:r>
     </w:p>
     <w:p>

</xml_diff>

<commit_message>
Align Competing Values Framework section with Helfrich et al. (2007)
- Credit Quinn & Rohrbaugh (1983) via Helfrich; use the source's culture labels and definitions
- Cite the four-culture descriptions and add Helfrich's two-factor finding as a critique
- Trim two uncited paragraphs to keep Part A at 6 pages

Co-Authored-By: Claude Opus 5.5 <noreply@anthropic.com>
Claude-Session: https://claude.ai/code/session_01HRkqVTfSkfLSvYdwqYD5BN
</commit_message>
<xml_diff>
--- a/papers/עבודת-סיכום-התנהגות-ארגונית.docx
+++ b/papers/עבודת-סיכום-התנהגות-ארגונית.docx
@@ -539,22 +539,6 @@
           <w:szCs w:val="24"/>
           <w:rtl/>
         </w:rPr>
-        <w:t xml:space="preserve">לא כל לחץ מזיק. רמה מתונה של לחץ מגייסת קשב ומאמץ, ועובדים רבים מדווחים שהם עובדים טוב יותר מול לוח זמנים ברור. הבעיה מתחילה כשהלחץ נעשה כרוני, כשאין הפוגה בין עומס לעומס, וכשהעובד מרגיש שאין לו שליטה על מה שקורה לו. בנקודה זו הגוף והנפש נשארים במצב דריכות קבוע, והמשאבים מתכלים.</w:t>
-      </w:r>
-    </w:p>
-    <w:p>
-      <w:pPr>
-        <w:bidi/>
-        <w:spacing w:after="120" w:line="360"/>
-        <w:jc w:val="both"/>
-      </w:pPr>
-      <w:r>
-        <w:rPr>
-          <w:rFonts w:ascii="David" w:cs="David" w:eastAsia="David" w:hAnsi="David"/>
-          <w:sz w:val="24"/>
-          <w:szCs w:val="24"/>
-          <w:rtl/>
-        </w:rPr>
         <w:t xml:space="preserve">המודל שמחבר בין שלוש ההגדרות הוא המודל הטרנזקציוני של לזרוס ופולקמן (</w:t>
       </w:r>
       <w:r>
@@ -1314,7 +1298,7 @@
           <w:szCs w:val="24"/>
           <w:rtl/>
         </w:rPr>
-        <w:t xml:space="preserve">בני הדור גדלו בתקופה של שינויים טכנולוגיים מהירים, וחוו כאירועים מכוננים את פיגועי 11 בספטמבר ואת התפוצצות בועת ההייטק. מכאן מוסבר, לפי התיאור המקובל, החשדנות כלפי הבטחות ארוכות טווח של ארגונים והנטייה להשקיע בקריירה האישית ולא במקום העבודה. במקום העבודה הישראלי הם כבר אינם "הצעירים": רבים מהם הם היום בדיוק אותם מנהלי ביניים שהתוכנית פונה אליהם, והם מנהלים עובדים מדור ה-Z.</w:t>
+        <w:t xml:space="preserve">בני הדור גדלו בתקופה של שינויים טכנולוגיים מהירים, וחוו כאירועים מכוננים את פיגועי 11 בספטמבר ואת התפוצצות בועת ההייטק. במקום העבודה הישראלי הם כבר אינם "הצעירים": רבים מהם הם היום בדיוק אותם מנהלי ביניים שהתוכנית פונה אליהם, והם מנהלים עובדים מדור ה-Z.</w:t>
       </w:r>
     </w:p>
     <w:p>
@@ -1386,22 +1370,6 @@
           <w:rtl/>
         </w:rPr>
         <w:t xml:space="preserve">) מוסיף שכבה חשובה: אם ההבדלים נובעים בעיקר מגיל, הרי שמנהל שמנהל לפי תווית דורית יחמיץ את העובד שמולו. המלצת המפגש היא לעבור מ"מה דור ה-Y רוצה" לשתי שאלות פרטניות: מה הצורך הדומיננטי של העובד הזה, ומול מי הוא משווה את עצמו. בפועל, שקיפות בקריטריונים לתגמול ושיחות משוב קצרות ותכופות עונות על שתי השאלות גם יחד.</w:t>
-      </w:r>
-    </w:p>
-    <w:p>
-      <w:pPr>
-        <w:bidi/>
-        <w:spacing w:after="120" w:line="360"/>
-        <w:jc w:val="both"/>
-      </w:pPr>
-      <w:r>
-        <w:rPr>
-          <w:rFonts w:ascii="David" w:cs="David" w:eastAsia="David" w:hAnsi="David"/>
-          <w:sz w:val="24"/>
-          <w:szCs w:val="24"/>
-          <w:rtl/>
-        </w:rPr>
-        <w:t xml:space="preserve">לשילוב של שלושת הנושאים יש גם מלכודת. מנהל ביניים שמשייך את עצמו לדור ה-X או לדור ה-Y עלול לפרש התנהגות של עובד צעיר דרך ההשוואה לעצמו, ולזהות "חוסר מחויבות" במקום שבו יש בפועל צורך שונה או תחושת קיפוח. השאלה "מה מניע את העובד הזה" עדיפה תמיד על השאלה "מה מאפיין את הדור שלו".</w:t>
       </w:r>
     </w:p>
     <w:p>
@@ -1754,7 +1722,43 @@
           <w:szCs w:val="24"/>
           <w:rtl/>
         </w:rPr>
-        <w:t xml:space="preserve">) מאפיין תרבויות לפי שני צירים: מיקוד פנימי מול חיצוני, וגמישות מול שליטה. מהצירים נגזרות ארבע תרבויות: צוותית (משפחתית), חדשנית, משימתית (שוק) והיררכית. בכל ארגון קיימות כל הארבע, אך בדרך כלל אחת או שתיים דומיננטיות (</w:t>
+        <w:t xml:space="preserve">), שפיתחו קווין ורורבו (</w:t>
+      </w:r>
+      <w:r>
+        <w:rPr>
+          <w:rFonts w:ascii="David" w:cs="David" w:eastAsia="David" w:hAnsi="David"/>
+          <w:sz w:val="24"/>
+          <w:szCs w:val="24"/>
+          <w:rtl/>
+        </w:rPr>
+        <w:t xml:space="preserve">‏</w:t>
+      </w:r>
+      <w:r>
+        <w:rPr>
+          <w:rFonts w:ascii="David" w:cs="David" w:eastAsia="David" w:hAnsi="David"/>
+          <w:sz w:val="24"/>
+          <w:szCs w:val="24"/>
+          <w:rtl w:val="false"/>
+        </w:rPr>
+        <w:t xml:space="preserve">Quinn &amp; Rohrbaugh, 1983</w:t>
+      </w:r>
+      <w:r>
+        <w:rPr>
+          <w:rFonts w:ascii="David" w:cs="David" w:eastAsia="David" w:hAnsi="David"/>
+          <w:sz w:val="24"/>
+          <w:szCs w:val="24"/>
+          <w:rtl/>
+        </w:rPr>
+        <w:t xml:space="preserve">‏</w:t>
+      </w:r>
+      <w:r>
+        <w:rPr>
+          <w:rFonts w:ascii="David" w:cs="David" w:eastAsia="David" w:hAnsi="David"/>
+          <w:sz w:val="24"/>
+          <w:szCs w:val="24"/>
+          <w:rtl/>
+        </w:rPr>
+        <w:t xml:space="preserve">, כפי שמצוטט אצל </w:t>
       </w:r>
       <w:r>
         <w:rPr>
@@ -1790,6 +1794,42 @@
           <w:szCs w:val="24"/>
           <w:rtl/>
         </w:rPr>
+        <w:t xml:space="preserve">), מאפיין תרבויות לפי שני צירים: ריכוזיות ושליטה מול גמישות, ומיקוד בסביבה הפנימית מול מיקוד בסביבה החיצונית. מהצירים נגזרות ארבע תרבויות: צוותית, חדשנית, משימתית והיררכית. אלה טיפוסים אידיאליים, ובפועל כל ארגון משקף את כל הארבע במידה כלשהי, כשאחת מהן דומיננטית (</w:t>
+      </w:r>
+      <w:r>
+        <w:rPr>
+          <w:rFonts w:ascii="David" w:cs="David" w:eastAsia="David" w:hAnsi="David"/>
+          <w:sz w:val="24"/>
+          <w:szCs w:val="24"/>
+          <w:rtl/>
+        </w:rPr>
+        <w:t xml:space="preserve">‏</w:t>
+      </w:r>
+      <w:r>
+        <w:rPr>
+          <w:rFonts w:ascii="David" w:cs="David" w:eastAsia="David" w:hAnsi="David"/>
+          <w:sz w:val="24"/>
+          <w:szCs w:val="24"/>
+          <w:rtl w:val="false"/>
+        </w:rPr>
+        <w:t xml:space="preserve">Helfrich et al., 2007</w:t>
+      </w:r>
+      <w:r>
+        <w:rPr>
+          <w:rFonts w:ascii="David" w:cs="David" w:eastAsia="David" w:hAnsi="David"/>
+          <w:sz w:val="24"/>
+          <w:szCs w:val="24"/>
+          <w:rtl/>
+        </w:rPr>
+        <w:t xml:space="preserve">‏</w:t>
+      </w:r>
+      <w:r>
+        <w:rPr>
+          <w:rFonts w:ascii="David" w:cs="David" w:eastAsia="David" w:hAnsi="David"/>
+          <w:sz w:val="24"/>
+          <w:szCs w:val="24"/>
+          <w:rtl/>
+        </w:rPr>
         <w:t xml:space="preserve">).</w:t>
       </w:r>
     </w:p>
@@ -1806,7 +1846,79 @@
           <w:szCs w:val="24"/>
           <w:rtl/>
         </w:rPr>
-        <w:t xml:space="preserve">כל אחת מארבע התרבויות מדגישה ערכים אחרים. התרבות הצוותית מדגישה שייכות, מחויבות ופיתוח אנשים, והמנהל בה פועל כמנטור. התרבות החדשנית מדגישה יזמות, גמישות ונכונות לקחת סיכונים. התרבות המשימתית מדגישה תחרות, השגת יעדים ותוצאות מדידות. התרבות ההיררכית מדגישה כללים, יציבות ובקרה. הערכים שבפינות המנוגדות של המודל מתנגשים זה בזה, למשל גמישות מול שליטה, ולכן ארגון שמנסה לחזק את כולם במקביל חי במתח מתמיד.</w:t>
+        <w:t xml:space="preserve">התרבות הצוותית (מיקוד פנימי וגמישות) מעודדת שיתוף רחב של העובדים, עבודת צוות והעצמה, ומעמידה בראש סדר העדיפויות את פיתוח ההון האנושי. התרבות החדשנית (מיקוד חיצוני וגמישות) מדגישה יצירתיות, חדשנות וצמיחה. התרבות המשימתית (מיקוד חיצוני ושליטה) מתאפיינת בבהירות משימות ויעדים, ומעריכה יעילות ותוצאות מדידות. התרבות ההיררכית (מיקוד פנימי ושליטה) נשענת על סמכות ריכוזית, על כבוד להיררכיה הפורמלית ועל הקפדה על כללים, ומעריכה יציבות וצפיות (</w:t>
+      </w:r>
+      <w:r>
+        <w:rPr>
+          <w:rFonts w:ascii="David" w:cs="David" w:eastAsia="David" w:hAnsi="David"/>
+          <w:sz w:val="24"/>
+          <w:szCs w:val="24"/>
+          <w:rtl/>
+        </w:rPr>
+        <w:t xml:space="preserve">‏</w:t>
+      </w:r>
+      <w:r>
+        <w:rPr>
+          <w:rFonts w:ascii="David" w:cs="David" w:eastAsia="David" w:hAnsi="David"/>
+          <w:sz w:val="24"/>
+          <w:szCs w:val="24"/>
+          <w:rtl w:val="false"/>
+        </w:rPr>
+        <w:t xml:space="preserve">Helfrich et al., 2007</w:t>
+      </w:r>
+      <w:r>
+        <w:rPr>
+          <w:rFonts w:ascii="David" w:cs="David" w:eastAsia="David" w:hAnsi="David"/>
+          <w:sz w:val="24"/>
+          <w:szCs w:val="24"/>
+          <w:rtl/>
+        </w:rPr>
+        <w:t xml:space="preserve">‏</w:t>
+      </w:r>
+      <w:r>
+        <w:rPr>
+          <w:rFonts w:ascii="David" w:cs="David" w:eastAsia="David" w:hAnsi="David"/>
+          <w:sz w:val="24"/>
+          <w:szCs w:val="24"/>
+          <w:rtl/>
+        </w:rPr>
+        <w:t xml:space="preserve">). המודל אינו חסין מביקורת: במחקר שכלל 71,776 עובדים שאינם מנהלים ב-168 מתקני בריאות, העובדים הבחינו בפועל בעיקר בין שני גורמים, התרבות ההיררכית מול שלוש האחרות יחד, ולא בין ארבע תרבויות נפרדות (</w:t>
+      </w:r>
+      <w:r>
+        <w:rPr>
+          <w:rFonts w:ascii="David" w:cs="David" w:eastAsia="David" w:hAnsi="David"/>
+          <w:sz w:val="24"/>
+          <w:szCs w:val="24"/>
+          <w:rtl/>
+        </w:rPr>
+        <w:t xml:space="preserve">‏</w:t>
+      </w:r>
+      <w:r>
+        <w:rPr>
+          <w:rFonts w:ascii="David" w:cs="David" w:eastAsia="David" w:hAnsi="David"/>
+          <w:sz w:val="24"/>
+          <w:szCs w:val="24"/>
+          <w:rtl w:val="false"/>
+        </w:rPr>
+        <w:t xml:space="preserve">Helfrich et al., 2007</w:t>
+      </w:r>
+      <w:r>
+        <w:rPr>
+          <w:rFonts w:ascii="David" w:cs="David" w:eastAsia="David" w:hAnsi="David"/>
+          <w:sz w:val="24"/>
+          <w:szCs w:val="24"/>
+          <w:rtl/>
+        </w:rPr>
+        <w:t xml:space="preserve">‏</w:t>
+      </w:r>
+      <w:r>
+        <w:rPr>
+          <w:rFonts w:ascii="David" w:cs="David" w:eastAsia="David" w:hAnsi="David"/>
+          <w:sz w:val="24"/>
+          <w:szCs w:val="24"/>
+          <w:rtl/>
+        </w:rPr>
+        <w:t xml:space="preserve">).</w:t>
       </w:r>
     </w:p>
     <w:p>

</xml_diff>

<commit_message>
Replace paywalled sources with open-access Hebrew articles (2021)
- Replace Schein (1990) with Mash & Cohen (2021) for organizational culture; add their strong-culture finding
- Replace Becker & O'Hair (2007) with Milon & Shapira-Lishchinsky (2021) on OCB and political behavior
- Fix Cai et al. claim (counterproductive behavior and trust, not OCB)
- Align with course: 'competing values' model name, perpetrator traits, opposing diagonals
- Use page-break-before on headings to avoid a blank page

Co-Authored-By: Claude Opus 5.5 <noreply@anthropic.com>
Claude-Session: https://claude.ai/code/session_01HRkqVTfSkfLSvYdwqYD5BN
</commit_message>
<xml_diff>
--- a/papers/עבודת-סיכום-התנהגות-ארגונית.docx
+++ b/papers/עבודת-סיכום-התנהגות-ארגונית.docx
@@ -1475,7 +1475,7 @@
           <w:szCs w:val="24"/>
           <w:rtl/>
         </w:rPr>
-        <w:t xml:space="preserve">). קמיר (2018) מתארת כיצד התפתח בישראל מתחילת שנות האלפיים שיח מקצועי על התופעה, ומציעה לתרגם את התובנות הפסיכולוגיות לשפה משפטית המבוססת על כבוד האדם. לפי גישתה, הפגיעה אינה רק בבריאות ובתפקוד של העובד אלא בכבודו, ולכן יש לה משמעות ערכית ולא רק מקצועית.</w:t>
+        <w:t xml:space="preserve">). קמיר (2018) מתארת כיצד התפתח בישראל מתחילת שנות האלפיים שיח מקצועי על התופעה, ומציעה לתרגם את התובנות הפסיכולוגיות לשפה משפטית המבוססת על כבוד האדם.</w:t>
       </w:r>
     </w:p>
     <w:p>
@@ -1615,7 +1615,7 @@
           <w:szCs w:val="24"/>
           <w:rtl/>
         </w:rPr>
-        <w:t xml:space="preserve">מאירי כינה את התופעה "המגפה השקטה", ותיאר מדוע ארגונים שותקים מולה: מיעוט תלונות, מניפולציות של הפוגע שמסיטות ממנו את האש, בלבול בין ניהול דורשני לניהול דורסני, אמונה שהדברים יסתדרו מעצמם, חשש של מנהלים מהפוגע, והכחשה של עומק הנזק (מאירי, 2013, כפי שמצוטט אצל קמיר, 2018, עמ' 319-320). לפי ניתוח זה, הנפגע נבחר לא פעם דווקא בגלל איכויותיו: חרוץ, מסור, בעל נטייה לרצות, ומתקשה להציב גבולות. התוצאה היא פגיעה שגלויה לרבים אך אינה מדווחת, ולכן מנהל אינו יכול להסתמך על תלונה כדי לדעת שיש בעיה.</w:t>
+        <w:t xml:space="preserve">מאירי כינה את התופעה "המגפה השקטה", ותיאר מדוע ארגונים שותקים מולה: מיעוט תלונות, מניפולציות של הפוגע שמסיטות ממנו את האש, בלבול בין ניהול דורשני לניהול דורסני, אמונה שהדברים יסתדרו מעצמם, חשש של מנהלים מהפוגע, והכחשה של עומק הנזק (מאירי, 2013, כפי שמצוטט אצל קמיר, 2018, עמ' 319-320). לפי ניתוח זה, הפוגע הוא לרוב אינטליגנטי, בעל קסם אישי, מניפולטיבי וחסר רגישות לצורכי הזולת, ואילו הנפגע נבחר לא פעם דווקא בגלל איכויותיו: חרוץ, מסור, בעל נטייה לרצות, ומתקשה להציב גבולות. התוצאה היא פגיעה שגלויה לרבים אך אינה מדווחת, ולכן מנהל אינו יכול להסתמך על תלונה כדי לדעת שיש בעיה.</w:t>
       </w:r>
     </w:p>
     <w:p>
@@ -1650,7 +1650,7 @@
           <w:szCs w:val="24"/>
           <w:rtl/>
         </w:rPr>
-        <w:t xml:space="preserve">שיין הגדיר תרבות ארגונית כדפוס של הנחות יסוד משותפות, שהקבוצה למדה בהתמודדות עם בעיותיה ושמועבר לחברים חדשים כדרך הנכונה לחשוב ולפעול (</w:t>
+        <w:t xml:space="preserve">תרבות ארגונית היא מערכת של ערכים ונורמות התנהגות משותפים, המכתיבה את דרך ההתנהלות של חברי הארגון. היא יוצרת תחושת זהות, מעוררת מחויבות וקובעת מה נחשב התנהגות מקובלת (</w:t>
       </w:r>
       <w:r>
         <w:rPr>
@@ -1686,7 +1686,7 @@
           <w:szCs w:val="24"/>
           <w:rtl/>
         </w:rPr>
-        <w:t xml:space="preserve">). לפי המודל שלו לתרבות שלוש רמות: תוצרים גלויים (לבוש, סידור המשרד, טקסים), ערכים מוצהרים (חזון, קוד אתי) והנחות יסוד סמויות, שהן הרמה העמוקה ביותר ומכתיבות בפועל את ההתנהגות. מודל הערכים המתחרים (</w:t>
+        <w:t xml:space="preserve">, כפי שמצוטט אצל מש וכהן, 2021, עמ' 2). בתרבות חזקה רוב החברים מאמצים את ערכי הארגון ואת נורמות ההתנהגות שלו, והארגון מתמודד עם הבדלי אינטרסים באמצעות בניית קונצנזוס. חברי הארגון לומדים לפעול לפי ערכים אלה בלי להיות מודעים לכך, והארגון משפיע עליהם גם דרך ערכיו הגלויים וגם דרך ערכיו הנסתרים (מש וכהן, 2021, עמ' 6, 12). מודל הערכים הסותרים (</w:t>
       </w:r>
       <w:r>
         <w:rPr>
@@ -1794,7 +1794,7 @@
           <w:szCs w:val="24"/>
           <w:rtl/>
         </w:rPr>
-        <w:t xml:space="preserve">), מאפיין תרבויות לפי שני צירים: ריכוזיות ושליטה מול גמישות, ומיקוד בסביבה הפנימית מול מיקוד בסביבה החיצונית. מהצירים נגזרות ארבע תרבויות: צוותית, חדשנית, משימתית והיררכית. אלה טיפוסים אידיאליים, ובפועל כל ארגון משקף את כל הארבע במידה כלשהי, כשאחת מהן דומיננטית (</w:t>
+        <w:t xml:space="preserve">), מאפיין תרבויות לפי שני צירים: ריכוזיות ושליטה מול גמישות, ומיקוד בסביבה הפנימית מול מיקוד בסביבה החיצונית. מהצירים נגזרות ארבע תרבויות: צוותית, חדשנית, משימתית והיררכית. אלה טיפוסים אידיאליים, ובפועל כל ארגון משקף את כל הארבע במידה כלשהי, כשאחת מהן דומיננטית. התרבויות שבאלכסונים המנוגדים, צוותית מול משימתית והיררכית מול חדשנית, מבטאות ערכים סותרים (</w:t>
       </w:r>
       <w:r>
         <w:rPr>
@@ -1953,43 +1953,7 @@
           <w:szCs w:val="24"/>
           <w:rtl/>
         </w:rPr>
-        <w:t xml:space="preserve">התרבות קובעת מה נחשב "נורמלי", ולכן היא קובעת גם אם התעמרות תזוהה בכלל. סקירה שפורסמה בישראל מנתה את התרבות הארגונית כגורם הראשון המגביר את הסבירות לפגיעה, וקבעה כי "נראה כי הצקה מתקיימת רק בתרבות ארגונית שמעודדת או מאפשרת התנהגות כזו" (כהן, 2004, כפי שמצוטט אצל קמיר, 2018, עמ' 309). ארגון יכול להצהיר על כבוד הדדי ברמת הערכים המוצהרים, ובאותו זמן להחזיק בהנחת יסוד שלפיה "מי שלא עומד בלחץ לא מתאים לכאן". הפער בין שתי הרמות של שיין (</w:t>
-      </w:r>
-      <w:r>
-        <w:rPr>
-          <w:rFonts w:ascii="David" w:cs="David" w:eastAsia="David" w:hAnsi="David"/>
-          <w:sz w:val="24"/>
-          <w:szCs w:val="24"/>
-          <w:rtl/>
-        </w:rPr>
-        <w:t xml:space="preserve">‏</w:t>
-      </w:r>
-      <w:r>
-        <w:rPr>
-          <w:rFonts w:ascii="David" w:cs="David" w:eastAsia="David" w:hAnsi="David"/>
-          <w:sz w:val="24"/>
-          <w:szCs w:val="24"/>
-          <w:rtl w:val="false"/>
-        </w:rPr>
-        <w:t xml:space="preserve">Schein, 1990</w:t>
-      </w:r>
-      <w:r>
-        <w:rPr>
-          <w:rFonts w:ascii="David" w:cs="David" w:eastAsia="David" w:hAnsi="David"/>
-          <w:sz w:val="24"/>
-          <w:szCs w:val="24"/>
-          <w:rtl/>
-        </w:rPr>
-        <w:t xml:space="preserve">‏</w:t>
-      </w:r>
-      <w:r>
-        <w:rPr>
-          <w:rFonts w:ascii="David" w:cs="David" w:eastAsia="David" w:hAnsi="David"/>
-          <w:sz w:val="24"/>
-          <w:szCs w:val="24"/>
-          <w:rtl/>
-        </w:rPr>
-        <w:t xml:space="preserve">) הוא בדיוק המקום שבו התעמרות מתקיימת בלי שאיש יקרא לה בשמה. ניתן גם לקשור את גורמי הסיכון שזוהו בסקירה של פייז'ו ועמיתיו (</w:t>
+        <w:t xml:space="preserve">התרבות קובעת מה נחשב "נורמלי", ולכן היא קובעת גם אם התעמרות תזוהה בכלל. סקירה שפורסמה בישראל מנתה את התרבות הארגונית כגורם הראשון המגביר את הסבירות לפגיעה, וקבעה כי "נראה כי הצקה מתקיימת רק בתרבות ארגונית שמעודדת או מאפשרת התנהגות כזו" (כהן, 2004, כפי שמצוטט אצל קמיר, 2018, עמ' 309). ארגון יכול להצהיר על כבוד הדדי, ובאותו זמן לפעול לפי ערך נסתר שלפיו "מי שלא עומד בלחץ לא מתאים לכאן". הפער בין הערכים הגלויים לנסתרים הוא בדיוק המקום שבו התעמרות מתקיימת בלי שאיש יקרא לה בשמה. מש וכהן (2021, עמ' 11-12) מצאו גם שלתרבות חזקה יש מחיר: הקונצנזוס מסווה הבדלי אינטרסים, וקונפליקטים מנוהלים בה בסגנון תחרותי של מנצח ומפסיד ולא בשיתוף פעולה. מכאן שבארגון שאין בו מקום לדעה שונה, קשה גם להתלונן. ניתן גם לקשור את גורמי הסיכון שזוהו בסקירה של פייז'ו ועמיתיו (</w:t>
       </w:r>
       <w:r>
         <w:rPr>
@@ -2025,7 +1989,7 @@
           <w:szCs w:val="24"/>
           <w:rtl/>
         </w:rPr>
-        <w:t xml:space="preserve">) לפרופילים של מודל הערכים המתחרים: תרבות משימתית קיצונית מייצרת לחץ ודרישות גבוהות, ותרבות היררכית נוקשה מגדילה את פערי הכוח. קמיר (2018, עמ' 329) מוסיפה שהמבנה ההיררכי מעודד תחרות של "סכום אפס" בין עמיתים, ושבמקומות שבהם נורמות כאלה אינן מרוסנות בערכים של כבוד הדדי, התחרות עלולה להידרדר להתעמרות. מסיבה זו גם פייז'ו ועמיתיו (</w:t>
+        <w:t xml:space="preserve">) לפרופילים של מודל הערכים הסותרים: תרבות משימתית קיצונית מייצרת לחץ ודרישות גבוהות, ותרבות היררכית נוקשה מגדילה את פערי הכוח. קמיר (2018, עמ' 329) מוסיפה שהמבנה ההיררכי מעודד תחרות של "סכום אפס" בין עמיתים, ושבמקומות שבהם נורמות כאלה אינן מרוסנות בערכים של כבוד הדדי, התחרות עלולה להידרדר להתעמרות. מסיבה זו גם פייז'ו ועמיתיו (</w:t>
       </w:r>
       <w:r>
         <w:rPr>
@@ -2061,43 +2025,7 @@
           <w:szCs w:val="24"/>
           <w:rtl/>
         </w:rPr>
-        <w:t xml:space="preserve">) מסכמים שמדיניות למניעת התעמרות חייבת לטפל בתרבות הארגון עצמה. גם תרבות צוותית אינה חסינה, שכן נאמנות לקבוצה עלולה להוביל לשתיקה. קמיר (2018) מדגישה שכבוד האדם צריך להפוך מערך מוצהר לנורמה מחייבת, וזו בדיוק העבודה של מנהל הביניים: הוא זה שמתרגם ערכים להתנהגות יומיומית. שיין (</w:t>
-      </w:r>
-      <w:r>
-        <w:rPr>
-          <w:rFonts w:ascii="David" w:cs="David" w:eastAsia="David" w:hAnsi="David"/>
-          <w:sz w:val="24"/>
-          <w:szCs w:val="24"/>
-          <w:rtl/>
-        </w:rPr>
-        <w:t xml:space="preserve">‏</w:t>
-      </w:r>
-      <w:r>
-        <w:rPr>
-          <w:rFonts w:ascii="David" w:cs="David" w:eastAsia="David" w:hAnsi="David"/>
-          <w:sz w:val="24"/>
-          <w:szCs w:val="24"/>
-          <w:rtl w:val="false"/>
-        </w:rPr>
-        <w:t xml:space="preserve">Schein, 1990</w:t>
-      </w:r>
-      <w:r>
-        <w:rPr>
-          <w:rFonts w:ascii="David" w:cs="David" w:eastAsia="David" w:hAnsi="David"/>
-          <w:sz w:val="24"/>
-          <w:szCs w:val="24"/>
-          <w:rtl/>
-        </w:rPr>
-        <w:t xml:space="preserve">‏</w:t>
-      </w:r>
-      <w:r>
-        <w:rPr>
-          <w:rFonts w:ascii="David" w:cs="David" w:eastAsia="David" w:hAnsi="David"/>
-          <w:sz w:val="24"/>
-          <w:szCs w:val="24"/>
-          <w:rtl/>
-        </w:rPr>
-        <w:t xml:space="preserve">) הדגיש שמנהלים מטמיעים תרבות בעיקר דרך מה שהם שמים לב אליו, מודדים ומתגמלים, ודרך האופן שבו הם מגיבים לאירועים קריטיים. ההמלצה המעשית למשתתפים היא לטפל בתלונה הראשונה ברצינות ובמהירות, גם אם נראית קטנה, ולבדוק באופן קבוע אם הגדרות התפקיד ביחידה ברורות, משום שעמימות היא קרקע נוחה לפגיעה.</w:t>
+        <w:t xml:space="preserve">) מסכמים שמדיניות למניעת התעמרות חייבת לטפל בתרבות הארגון עצמה. קמיר (2018) מדגישה שכבוד האדם צריך להפוך מערך מוצהר לנורמה מחייבת, וזו בדיוק העבודה של מנהל הביניים: הוא זה שמתרגם ערכים להתנהגות יומיומית. מחקר על 410 מנהלי בתי ספר מצא שמנהלים הפועלים באקלים אתי נוטים יותר למנהיגות אותנטית, ומנהיגות כזו קשורה לשימוש מועט יותר בטקטיקות השפעה בלתי נאותות (מילון ושפירא-לשצ'ינסקי, 2021). ההמלצה המעשית למשתתפים היא לטפל בתלונה הראשונה ברצינות ובמהירות, גם אם נראית קטנה, ולבדוק באופן קבוע אם הגדרות התפקיד ביחידה ברורות, משום שעמימות היא קרקע נוחה לפגיעה.</w:t>
       </w:r>
     </w:p>
     <w:p>
@@ -2239,43 +2167,7 @@
           <w:szCs w:val="24"/>
           <w:rtl/>
         </w:rPr>
-        <w:t xml:space="preserve">, כפי שמצוטט אצל אופלטקה, 2007, עמ' 39-40). ביטוייה הם עזרה לעמיתים, הקשבה לבעיות של אחרים, שיתוף במידע, הצעות לשיפור, דיוק בזמנים, שמירה על רכוש הארגון ונכונות להשלים משימות אחרי שעות העבודה. מקובל להבחין בין התנהגות אזרחית המכוונת לפרטים (עזרה לעמית) לבין התנהגות המכוונת לארגון כולו (שמירה על נהלים, השתתפות בפעילות ארגונית) (אופלטקה, 2007; </w:t>
-      </w:r>
-      <w:r>
-        <w:rPr>
-          <w:rFonts w:ascii="David" w:cs="David" w:eastAsia="David" w:hAnsi="David"/>
-          <w:sz w:val="24"/>
-          <w:szCs w:val="24"/>
-          <w:rtl/>
-        </w:rPr>
-        <w:t xml:space="preserve">‏</w:t>
-      </w:r>
-      <w:r>
-        <w:rPr>
-          <w:rFonts w:ascii="David" w:cs="David" w:eastAsia="David" w:hAnsi="David"/>
-          <w:sz w:val="24"/>
-          <w:szCs w:val="24"/>
-          <w:rtl w:val="false"/>
-        </w:rPr>
-        <w:t xml:space="preserve">Becker &amp; O'Hair, 2007</w:t>
-      </w:r>
-      <w:r>
-        <w:rPr>
-          <w:rFonts w:ascii="David" w:cs="David" w:eastAsia="David" w:hAnsi="David"/>
-          <w:sz w:val="24"/>
-          <w:szCs w:val="24"/>
-          <w:rtl/>
-        </w:rPr>
-        <w:t xml:space="preserve">‏</w:t>
-      </w:r>
-      <w:r>
-        <w:rPr>
-          <w:rFonts w:ascii="David" w:cs="David" w:eastAsia="David" w:hAnsi="David"/>
-          <w:sz w:val="24"/>
-          <w:szCs w:val="24"/>
-          <w:rtl/>
-        </w:rPr>
-        <w:t xml:space="preserve">). אופלטקה (2007) מצא, בראיונות עם מורים, מנהלים, מפקחים והורים בישראל, שהופעת ההתנהגות תלויה בגורמים אישיים, ארגוניים ומנהיגותיים גם יחד. ההסבר המקובל נשען על תיאוריית החליפין החברתי ועל תיאוריית ההוגנות: עובד שמרגיש שהארגון נוהג בו בצדק נוטה להחזיר לו בתרומה עודפת, ותפיסת הוגנות אכן נמצאה קשורה להתנהגות אזרחית (אופלטקה, 2007; </w:t>
+        <w:t xml:space="preserve">, כפי שמצוטט אצל אופלטקה, 2007, עמ' 39-40). מקובל להבחין בין התנהגות אזרחית המכוונת לפרטים (עזרה לעמית) לבין התנהגות המכוונת לארגון כולו (שמירה על נהלים, השתתפות בפעילות ארגונית) (אופלטקה, 2007). אופלטקה (2007) מצא, בראיונות עם מורים, מנהלים, מפקחים והורים בישראל, שהופעת ההתנהגות תלויה בגורמים אישיים, ארגוניים ומנהיגותיים גם יחד. ההסבר המקובל נשען על תיאוריית החליפין החברתי ועל תיאוריית ההוגנות: עובד שמרגיש שהארגון נוהג בו בצדק נוטה להחזיר לו בתרומה עודפת, ותפיסת הוגנות אכן נמצאה קשורה להתנהגות אזרחית (אופלטקה, 2007; </w:t>
       </w:r>
       <w:r>
         <w:rPr>
@@ -2311,7 +2203,7 @@
           <w:szCs w:val="24"/>
           <w:rtl/>
         </w:rPr>
-        <w:t xml:space="preserve">).</w:t>
+        <w:t xml:space="preserve">). לתופעה יש גם צד פחות מוכר: כשתרומה מעבר לנדרש הופכת לציפייה קבועה שאינה מתוגמלת, היא נחווית כ"התנהגות אזרחית כפויה", ויש הרואים בה ניצול של העובד (מילון ושפירא-לשצ'ינסקי, 2021).</w:t>
       </w:r>
     </w:p>
     <w:p>
@@ -2434,79 +2326,43 @@
           <w:szCs w:val="24"/>
           <w:rtl/>
         </w:rPr>
-        <w:t xml:space="preserve">המושג נגזר מכתביו של מקיאוולי, ובפסיכולוגיה הוא מתאר נטייה לראות באנשים אחרים אמצעי, להשתמש במניפולציה ובהונאה כדי להשיג מטרות, ולהחזיק בעמדה צינית כלפי מוסר (</w:t>
-      </w:r>
-      <w:r>
-        <w:rPr>
-          <w:rFonts w:ascii="David" w:cs="David" w:eastAsia="David" w:hAnsi="David"/>
-          <w:sz w:val="24"/>
-          <w:szCs w:val="24"/>
-          <w:rtl/>
-        </w:rPr>
-        <w:t xml:space="preserve">‏</w:t>
-      </w:r>
-      <w:r>
-        <w:rPr>
-          <w:rFonts w:ascii="David" w:cs="David" w:eastAsia="David" w:hAnsi="David"/>
-          <w:sz w:val="24"/>
-          <w:szCs w:val="24"/>
-          <w:rtl w:val="false"/>
-        </w:rPr>
-        <w:t xml:space="preserve">Christie &amp; Geis, 1970</w:t>
-      </w:r>
-      <w:r>
-        <w:rPr>
-          <w:rFonts w:ascii="David" w:cs="David" w:eastAsia="David" w:hAnsi="David"/>
-          <w:sz w:val="24"/>
-          <w:szCs w:val="24"/>
-          <w:rtl/>
-        </w:rPr>
-        <w:t xml:space="preserve">‏</w:t>
-      </w:r>
-      <w:r>
-        <w:rPr>
-          <w:rFonts w:ascii="David" w:cs="David" w:eastAsia="David" w:hAnsi="David"/>
-          <w:sz w:val="24"/>
-          <w:szCs w:val="24"/>
-          <w:rtl/>
-        </w:rPr>
-        <w:t xml:space="preserve">, כפי שמצוטט אצל </w:t>
-      </w:r>
-      <w:r>
-        <w:rPr>
-          <w:rFonts w:ascii="David" w:cs="David" w:eastAsia="David" w:hAnsi="David"/>
-          <w:sz w:val="24"/>
-          <w:szCs w:val="24"/>
-          <w:rtl/>
-        </w:rPr>
-        <w:t xml:space="preserve">‏</w:t>
-      </w:r>
-      <w:r>
-        <w:rPr>
-          <w:rFonts w:ascii="David" w:cs="David" w:eastAsia="David" w:hAnsi="David"/>
-          <w:sz w:val="24"/>
-          <w:szCs w:val="24"/>
-          <w:rtl w:val="false"/>
-        </w:rPr>
-        <w:t xml:space="preserve">Becker &amp; O'Hair, 2007</w:t>
-      </w:r>
-      <w:r>
-        <w:rPr>
-          <w:rFonts w:ascii="David" w:cs="David" w:eastAsia="David" w:hAnsi="David"/>
-          <w:sz w:val="24"/>
-          <w:szCs w:val="24"/>
-          <w:rtl/>
-        </w:rPr>
-        <w:t xml:space="preserve">‏</w:t>
-      </w:r>
-      <w:r>
-        <w:rPr>
-          <w:rFonts w:ascii="David" w:cs="David" w:eastAsia="David" w:hAnsi="David"/>
-          <w:sz w:val="24"/>
-          <w:szCs w:val="24"/>
-          <w:rtl/>
-        </w:rPr>
-        <w:t xml:space="preserve">). יחד עם נרקיסיזם ופסיכופתיה הוא נמנה עם "השלישייה האפלה" של האישיות. מקיאווליסט אינו בהכרח אימפולסיבי. הוא מחושב, קורא היטב את מפת האינטרסים ויודע להיראות נעים כשזה משתלם. במחקר שנערך בקרב 289 עובדים נמצא שמנהלים מקיאווליסטים נתפסים בעיני הכפופים כמנהלים פוגעניים, ושתפיסה זו מובילה להתנהגות עבודה הרסנית של העובדים. הקשר חזק יותר כשהמנהל מרבה בהתנהגות פוליטית (</w:t>
+        <w:t xml:space="preserve">המושג נגזר מכתביו של מקיאוולי, והוא מתאר אסטרטגיה של התנהגות חברתית שבה אדם משפיע על אחרים כדי לקדם את האינטרסים שלו, לעיתים קרובות על חשבונם. בעל נטייה מקיאווליסטית גבוהה מתאים את דבריו ומעשיו למצב, וכך מסווה את הצד האפל של אישיותו ומצליח לתמרן אחרים (</w:t>
+      </w:r>
+      <w:r>
+        <w:rPr>
+          <w:rFonts w:ascii="David" w:cs="David" w:eastAsia="David" w:hAnsi="David"/>
+          <w:sz w:val="24"/>
+          <w:szCs w:val="24"/>
+          <w:rtl/>
+        </w:rPr>
+        <w:t xml:space="preserve">‏</w:t>
+      </w:r>
+      <w:r>
+        <w:rPr>
+          <w:rFonts w:ascii="David" w:cs="David" w:eastAsia="David" w:hAnsi="David"/>
+          <w:sz w:val="24"/>
+          <w:szCs w:val="24"/>
+          <w:rtl w:val="false"/>
+        </w:rPr>
+        <w:t xml:space="preserve">Cai et al., 2024</w:t>
+      </w:r>
+      <w:r>
+        <w:rPr>
+          <w:rFonts w:ascii="David" w:cs="David" w:eastAsia="David" w:hAnsi="David"/>
+          <w:sz w:val="24"/>
+          <w:szCs w:val="24"/>
+          <w:rtl/>
+        </w:rPr>
+        <w:t xml:space="preserve">‏</w:t>
+      </w:r>
+      <w:r>
+        <w:rPr>
+          <w:rFonts w:ascii="David" w:cs="David" w:eastAsia="David" w:hAnsi="David"/>
+          <w:sz w:val="24"/>
+          <w:szCs w:val="24"/>
+          <w:rtl/>
+        </w:rPr>
+        <w:t xml:space="preserve">). במחקר שנערך בקרב 289 עובדים נמצא שמנהלים מקיאווליסטים נתפסים בעיני הכפופים כמנהלים פוגעניים, ושתפיסה זו מובילה להתנהגות עבודה הרסנית של העובדים. הקשר חזק יותר כשהמנהל מרבה בהתנהגות פוליטית (</w:t>
       </w:r>
       <w:r>
         <w:rPr>
@@ -2577,59 +2433,7 @@
           <w:szCs w:val="24"/>
           <w:rtl/>
         </w:rPr>
-        <w:t xml:space="preserve">במבט ראשון נראה שמקיאווליסטים פשוט יתנהגו פחות באופן אזרחי, והנתונים אכן מראים קשר שלילי. אבל התמונה מעניינת יותר. בקר ואו'הייר (</w:t>
-      </w:r>
-      <w:r>
-        <w:rPr>
-          <w:rFonts w:ascii="David" w:cs="David" w:eastAsia="David" w:hAnsi="David"/>
-          <w:sz w:val="24"/>
-          <w:szCs w:val="24"/>
-          <w:rtl/>
-        </w:rPr>
-        <w:t xml:space="preserve">‏</w:t>
-      </w:r>
-      <w:r>
-        <w:rPr>
-          <w:rFonts w:ascii="David" w:cs="David" w:eastAsia="David" w:hAnsi="David"/>
-          <w:sz w:val="24"/>
-          <w:szCs w:val="24"/>
-          <w:rtl w:val="false"/>
-        </w:rPr>
-        <w:t xml:space="preserve">Becker &amp; O'Hair, 2007</w:t>
-      </w:r>
-      <w:r>
-        <w:rPr>
-          <w:rFonts w:ascii="David" w:cs="David" w:eastAsia="David" w:hAnsi="David"/>
-          <w:sz w:val="24"/>
-          <w:szCs w:val="24"/>
-          <w:rtl/>
-        </w:rPr>
-        <w:t xml:space="preserve">‏</w:t>
-      </w:r>
-      <w:r>
-        <w:rPr>
-          <w:rFonts w:ascii="David" w:cs="David" w:eastAsia="David" w:hAnsi="David"/>
-          <w:sz w:val="24"/>
-          <w:szCs w:val="24"/>
-          <w:rtl/>
-        </w:rPr>
-        <w:t xml:space="preserve">) בחנו 606 עובדים, יחד עם הממונים ועמיתיהם, ומצאו שהקשר השלילי חזק יותר בהתנהגות המכוונת לארגון מאשר בהתנהגות המכוונת לפרטים. כשמקיאווליסטים כן מתנהגים באופן אזרחי, המניע שלהם הוא ניהול רושם ולא דאגה לארגון או ערכים פרו-חברתיים. כלומר, הם עוזרים כשרואים אותם ולמי שיכול לתגמל אותם. מכאן שאותה התנהגות גלויה יכולה לבטא אכפתיות אמיתית אצל עובד אחד וחישוב קר אצל אחר.</w:t>
-      </w:r>
-    </w:p>
-    <w:p>
-      <w:pPr>
-        <w:bidi/>
-        <w:spacing w:after="120" w:line="360"/>
-        <w:jc w:val="both"/>
-      </w:pPr>
-      <w:r>
-        <w:rPr>
-          <w:rFonts w:ascii="David" w:cs="David" w:eastAsia="David" w:hAnsi="David"/>
-          <w:sz w:val="24"/>
-          <w:szCs w:val="24"/>
-          <w:rtl/>
-        </w:rPr>
-        <w:t xml:space="preserve">למנהל הביניים יש כאן שתי השלכות. ראשית, הערכת עובדים שנשענת רק על מה שהמנהל רואה בעיניו תתגמל את מי שמיטיב לנהל רושם. שילוב משוב מעמיתים ובחינה של עקביות ההתנהגות גם כשאין קהל מצמצמים את ההטיה. שנית, מנהל מקיאווליסטי אינו רק בעיה אישית של העובדים שלו: הוא שוחק את ההתנהגות האזרחית של היחידה כולה (</w:t>
+        <w:t xml:space="preserve">במבט ראשון נראה שמי שמתמרן אחרים לא יתנהג באופן אזרחי. המחקר של מילון ושפירא-לשצ'ינסקי (2021) על 410 מנהלי בתי ספר מציע תמונה מורכבת יותר: לא נמצא קשר בין התנהגות אזרחית לבין התנהגות פוליטית, כלומר אותו אדם יכול לתרום מעבר לנדרש ובמקביל להפעיל טקטיקות השפעה בלתי לגיטימיות, כמו חנפנות או מניפולציה באמצעות שליטה במידע ובמשאבים (ויגודה, 1997, כפי שמצוטט אצל מילון ושפירא-לשצ'ינסקי, 2021). זו בדיוק זירת הפעולה של המקיאווליסט, שמיטיב להתאים את התנהגותו למצב ולהסוות את כוונותיו (</w:t>
       </w:r>
       <w:r>
         <w:rPr>
@@ -2665,17 +2469,65 @@
           <w:szCs w:val="24"/>
           <w:rtl/>
         </w:rPr>
+        <w:t xml:space="preserve">). מכאן שאותה התנהגות גלויה יכולה לבטא אכפתיות אמיתית אצל עובד אחד וחישוב אצל אחר. באותו מחקר נמצא שמנהלים אותנטיים, הפועלים ממניעים פנימיים, מרבים בהתנהגות אזרחית וממעטים בהתנהגות פוליטית.</w:t>
+      </w:r>
+    </w:p>
+    <w:p>
+      <w:pPr>
+        <w:bidi/>
+        <w:spacing w:after="120" w:line="360"/>
+        <w:jc w:val="both"/>
+      </w:pPr>
+      <w:r>
+        <w:rPr>
+          <w:rFonts w:ascii="David" w:cs="David" w:eastAsia="David" w:hAnsi="David"/>
+          <w:sz w:val="24"/>
+          <w:szCs w:val="24"/>
+          <w:rtl/>
+        </w:rPr>
+        <w:t xml:space="preserve">למנהל הביניים יש כאן שתי השלכות. ראשית, הערכת עובדים שנשענת רק על מה שהמנהל רואה בעיניו תתגמל את מי שמיטיב לנהל רושם. שילוב משוב מעמיתים ובחינה של עקביות ההתנהגות גם כשאין קהל מצמצמים את ההטיה. שנית, מנהל מקיאווליסטי אינו רק בעיה אישית של העובדים שלו: הוא מגביר את ההתנהגות ההרסנית של עובדיו ופוגע באמונם בארגון (</w:t>
+      </w:r>
+      <w:r>
+        <w:rPr>
+          <w:rFonts w:ascii="David" w:cs="David" w:eastAsia="David" w:hAnsi="David"/>
+          <w:sz w:val="24"/>
+          <w:szCs w:val="24"/>
+          <w:rtl/>
+        </w:rPr>
+        <w:t xml:space="preserve">‏</w:t>
+      </w:r>
+      <w:r>
+        <w:rPr>
+          <w:rFonts w:ascii="David" w:cs="David" w:eastAsia="David" w:hAnsi="David"/>
+          <w:sz w:val="24"/>
+          <w:szCs w:val="24"/>
+          <w:rtl w:val="false"/>
+        </w:rPr>
+        <w:t xml:space="preserve">Cai et al., 2024</w:t>
+      </w:r>
+      <w:r>
+        <w:rPr>
+          <w:rFonts w:ascii="David" w:cs="David" w:eastAsia="David" w:hAnsi="David"/>
+          <w:sz w:val="24"/>
+          <w:szCs w:val="24"/>
+          <w:rtl/>
+        </w:rPr>
+        <w:t xml:space="preserve">‏</w:t>
+      </w:r>
+      <w:r>
+        <w:rPr>
+          <w:rFonts w:ascii="David" w:cs="David" w:eastAsia="David" w:hAnsi="David"/>
+          <w:sz w:val="24"/>
+          <w:szCs w:val="24"/>
+          <w:rtl/>
+        </w:rPr>
         <w:t xml:space="preserve">). ההמלצה למשתתפים היא לבחון במערכת ההערכה ביחידה שלהם אילו התנהגויות אזרחיות נראות ומתוגמלות, ואילו נעשות בשקט ואינן זוכות לאף הכרה.</w:t>
       </w:r>
     </w:p>
     <w:p>
-      <w:r>
-        <w:br w:type="page"/>
-      </w:r>
-    </w:p>
-    <w:p>
       <w:pPr>
         <w:keepNext/>
+        <w:pageBreakBefore/>
         <w:bidi/>
         <w:spacing w:after="80" w:before="200" w:line="360"/>
         <w:jc w:val="center"/>
@@ -2914,43 +2766,7 @@
           <w:szCs w:val="24"/>
           <w:rtl/>
         </w:rPr>
-        <w:t xml:space="preserve">הנושא הזה נגע בי בגלל מקרה שראיתי מקרוב ולא עשיתי בו כלום. עובדת ותיקה ביחידה סמוכה ספגה במשך חודשים הערות משפילות מהממונה שלה, לעיתים מול כולם. כולנו ראינו, וכולנו אמרנו לעצמנו שזה "הסגנון שלו". כשלמדנו על ההבדל בין ערכים מוצהרים להנחות יסוד (</w:t>
-      </w:r>
-      <w:r>
-        <w:rPr>
-          <w:rFonts w:ascii="David" w:cs="David" w:eastAsia="David" w:hAnsi="David"/>
-          <w:sz w:val="24"/>
-          <w:szCs w:val="24"/>
-          <w:rtl/>
-        </w:rPr>
-        <w:t xml:space="preserve">‏</w:t>
-      </w:r>
-      <w:r>
-        <w:rPr>
-          <w:rFonts w:ascii="David" w:cs="David" w:eastAsia="David" w:hAnsi="David"/>
-          <w:sz w:val="24"/>
-          <w:szCs w:val="24"/>
-          <w:rtl w:val="false"/>
-        </w:rPr>
-        <w:t xml:space="preserve">Schein, 1990</w:t>
-      </w:r>
-      <w:r>
-        <w:rPr>
-          <w:rFonts w:ascii="David" w:cs="David" w:eastAsia="David" w:hAnsi="David"/>
-          <w:sz w:val="24"/>
-          <w:szCs w:val="24"/>
-          <w:rtl/>
-        </w:rPr>
-        <w:t xml:space="preserve">‏</w:t>
-      </w:r>
-      <w:r>
-        <w:rPr>
-          <w:rFonts w:ascii="David" w:cs="David" w:eastAsia="David" w:hAnsi="David"/>
-          <w:sz w:val="24"/>
-          <w:szCs w:val="24"/>
-          <w:rtl/>
-        </w:rPr>
-        <w:t xml:space="preserve">), הבנתי שהשתיקה שלנו לא הייתה מקרית. על הקיר היה תלוי קוד אתי שמדבר על כבוד, ובפועל כולם ידעו שמי שמתלונן נחשב חלש.</w:t>
+        <w:t xml:space="preserve">הנושא הזה נגע בי בגלל מקרה שראיתי מקרוב ולא עשיתי בו כלום. עובדת ותיקה ביחידה סמוכה ספגה במשך חודשים הערות משפילות מהממונה שלה, לעיתים מול כולם. כולנו ראינו, וכולנו אמרנו לעצמנו שזה "הסגנון שלו". כשלמדנו שארגון פועל גם דרך ערכיו הגלויים וגם דרך ערכיו הנסתרים (מש וכהן, 2021), הבנתי שהשתיקה שלנו לא הייתה מקרית. על הקיר היה תלוי קוד אתי שמדבר על כבוד, ובפועל כולם ידעו שמי שמתלונן נחשב חלש.</w:t>
       </w:r>
     </w:p>
     <w:p>
@@ -3050,7 +2866,7 @@
           <w:szCs w:val="24"/>
           <w:rtl/>
         </w:rPr>
-        <w:t xml:space="preserve">הקורס גם גרם לי לשאול איזו תרבות קיימת בארגון שבו אני עובד היום. לפי מודל הערכים המתחרים (</w:t>
+        <w:t xml:space="preserve">הקורס גם גרם לי לשאול איזו תרבות קיימת בארגון שבו אני עובד היום. לפי מודל הערכים הסותרים (</w:t>
       </w:r>
       <w:r>
         <w:rPr>
@@ -3141,13 +2957,9 @@
       </w:r>
     </w:p>
     <w:p>
-      <w:r>
-        <w:br w:type="page"/>
-      </w:r>
-    </w:p>
-    <w:p>
       <w:pPr>
         <w:keepNext/>
+        <w:pageBreakBefore/>
         <w:bidi/>
         <w:spacing w:after="80" w:before="200" w:line="360"/>
         <w:jc w:val="right"/>
@@ -3507,43 +3319,7 @@
           <w:szCs w:val="24"/>
           <w:rtl/>
         </w:rPr>
-        <w:t xml:space="preserve">הנושא הזה הפתיע אותי. תמיד ראיתי בעובד שעוזר, נשאר מאוחר ומתנדב עובד טוב. הממצא של בקר ואו'הייר (</w:t>
-      </w:r>
-      <w:r>
-        <w:rPr>
-          <w:rFonts w:ascii="David" w:cs="David" w:eastAsia="David" w:hAnsi="David"/>
-          <w:sz w:val="24"/>
-          <w:szCs w:val="24"/>
-          <w:rtl/>
-        </w:rPr>
-        <w:t xml:space="preserve">‏</w:t>
-      </w:r>
-      <w:r>
-        <w:rPr>
-          <w:rFonts w:ascii="David" w:cs="David" w:eastAsia="David" w:hAnsi="David"/>
-          <w:sz w:val="24"/>
-          <w:szCs w:val="24"/>
-          <w:rtl w:val="false"/>
-        </w:rPr>
-        <w:t xml:space="preserve">Becker &amp; O'Hair, 2007</w:t>
-      </w:r>
-      <w:r>
-        <w:rPr>
-          <w:rFonts w:ascii="David" w:cs="David" w:eastAsia="David" w:hAnsi="David"/>
-          <w:sz w:val="24"/>
-          <w:szCs w:val="24"/>
-          <w:rtl/>
-        </w:rPr>
-        <w:t xml:space="preserve">‏</w:t>
-      </w:r>
-      <w:r>
-        <w:rPr>
-          <w:rFonts w:ascii="David" w:cs="David" w:eastAsia="David" w:hAnsi="David"/>
-          <w:sz w:val="24"/>
-          <w:szCs w:val="24"/>
-          <w:rtl/>
-        </w:rPr>
-        <w:t xml:space="preserve">), שלפיו התנהגות אזרחית יכולה לנבוע מניהול רושם, גרם לי לחשוב על עמית שהערכתי מאוד. הוא תמיד עזר כשהמנהל היה בחדר, ונעלם כשהיה צריך לעזור בשקט, למשל בסגירת משמרת או בהדרכת עובד חדש. לא ראיתי את הדפוס עד שקיבלתי מילים לתאר אותו.</w:t>
+        <w:t xml:space="preserve">הנושא הזה הפתיע אותי. תמיד ראיתי בעובד שעוזר, נשאר מאוחר ומתנדב עובד טוב. הממצא של מילון ושפירא-לשצ'ינסקי (2021), שלפיו אותו אדם יכול להתנהג באופן אזרחי ובמקביל להפעיל טקטיקות השפעה פוליטיות, גרם לי לחשוב על עמית שהערכתי מאוד. הוא תמיד עזר כשהמנהל היה בחדר, ונעלם כשהיה צריך לעזור בשקט, למשל בסגירת משמרת או בהדרכת עובד חדש. לא ראיתי את הדפוס עד שקיבלתי מילים לתאר אותו.</w:t>
       </w:r>
     </w:p>
     <w:p>
@@ -3718,13 +3494,9 @@
       </w:r>
     </w:p>
     <w:p>
-      <w:r>
-        <w:br w:type="page"/>
-      </w:r>
-    </w:p>
-    <w:p>
       <w:pPr>
         <w:keepNext/>
+        <w:pageBreakBefore/>
         <w:bidi/>
         <w:spacing w:after="80" w:before="200" w:line="360"/>
         <w:jc w:val="center"/>
@@ -3795,7 +3567,7 @@
           <w:szCs w:val="24"/>
           <w:rtl/>
         </w:rPr>
-        <w:t xml:space="preserve">קמיר, א' (2018). התעמרות בעבודה: בין פסיכולוגיה למשפט, בין חקיקה לפסיקה. </w:t>
+        <w:t xml:space="preserve">מילון, ל' ל' ושפירא-לשצ'ינסקי, א' (2021). מנהיגות אותנטית כמתווכת בין זהות מקצועית ואקלים אתי לבין התנהגות אזרחית והתנהגות פוליטית בקרב מנהלי בית ספר יסודי בישראל. </w:t>
       </w:r>
       <w:r>
         <w:rPr>
@@ -3806,6 +3578,84 @@
           <w:szCs w:val="24"/>
           <w:rtl/>
         </w:rPr>
+        <w:t xml:space="preserve">הרבעון לחקר ארגונים וניהול משאבי אנוש, 6</w:t>
+      </w:r>
+      <w:r>
+        <w:rPr>
+          <w:rFonts w:ascii="David" w:cs="David" w:eastAsia="David" w:hAnsi="David"/>
+          <w:i w:val="false"/>
+          <w:sz w:val="24"/>
+          <w:szCs w:val="24"/>
+          <w:rtl/>
+        </w:rPr>
+        <w:t xml:space="preserve">(1). https://cohrm.haifa.ac.il/wp-content/uploads/2021/02/Milons-Shapiro.pdf</w:t>
+      </w:r>
+    </w:p>
+    <w:p>
+      <w:pPr>
+        <w:bidi/>
+        <w:spacing w:after="120" w:line="360"/>
+        <w:ind w:left="0" w:right="709" w:hanging="709"/>
+        <w:jc w:val="right"/>
+      </w:pPr>
+      <w:r>
+        <w:rPr>
+          <w:rFonts w:ascii="David" w:cs="David" w:eastAsia="David" w:hAnsi="David"/>
+          <w:i w:val="false"/>
+          <w:sz w:val="24"/>
+          <w:szCs w:val="24"/>
+          <w:rtl/>
+        </w:rPr>
+        <w:t xml:space="preserve">מש, ר' וכהן, ת' (2021). תרבות ארגונית בישראל, קונפליקטים בארגון ומה שביניהם. </w:t>
+      </w:r>
+      <w:r>
+        <w:rPr>
+          <w:rFonts w:ascii="David" w:cs="David" w:eastAsia="David" w:hAnsi="David"/>
+          <w:i/>
+          <w:iCs/>
+          <w:sz w:val="24"/>
+          <w:szCs w:val="24"/>
+          <w:rtl/>
+        </w:rPr>
+        <w:t xml:space="preserve">הרבעון לחקר ארגונים וניהול משאבי אנוש, 6</w:t>
+      </w:r>
+      <w:r>
+        <w:rPr>
+          <w:rFonts w:ascii="David" w:cs="David" w:eastAsia="David" w:hAnsi="David"/>
+          <w:i w:val="false"/>
+          <w:sz w:val="24"/>
+          <w:szCs w:val="24"/>
+          <w:rtl/>
+        </w:rPr>
+        <w:t xml:space="preserve">(2), 1-16. https://cohrm.haifa.ac.il/wp-content/uploads/2021/08/Mash-Cohen.pdf</w:t>
+      </w:r>
+    </w:p>
+    <w:p>
+      <w:pPr>
+        <w:bidi/>
+        <w:spacing w:after="120" w:line="360"/>
+        <w:ind w:left="0" w:right="709" w:hanging="709"/>
+        <w:jc w:val="right"/>
+      </w:pPr>
+      <w:r>
+        <w:rPr>
+          <w:rFonts w:ascii="David" w:cs="David" w:eastAsia="David" w:hAnsi="David"/>
+          <w:i w:val="false"/>
+          <w:sz w:val="24"/>
+          <w:szCs w:val="24"/>
+          <w:rtl/>
+        </w:rPr>
+        <w:t xml:space="preserve">קמיר, א' (2018). התעמרות בעבודה: בין פסיכולוגיה למשפט, בין חקיקה לפסיקה. </w:t>
+      </w:r>
+      <w:r>
+        <w:rPr>
+          <w:rFonts w:ascii="David" w:cs="David" w:eastAsia="David" w:hAnsi="David"/>
+          <w:i/>
+          <w:iCs/>
+          <w:sz w:val="24"/>
+          <w:szCs w:val="24"/>
+          <w:rtl/>
+        </w:rPr>
         <w:t xml:space="preserve">משפט ועסקים, כא</w:t>
       </w:r>
       <w:r>
@@ -3834,7 +3684,7 @@
           <w:szCs w:val="24"/>
           <w:rtl w:val="false"/>
         </w:rPr>
-        <w:t xml:space="preserve">Becker, J. A. H., &amp; O'Hair, H. D. (2007). Machiavellians' motives in organizational citizenship behavior. </w:t>
+        <w:t xml:space="preserve">Cai, H., Wang, L., &amp; Jin, X. (2024). Leader's Machiavellianism and employees' counterproductive work behavior: Testing a moderated mediation model. </w:t>
       </w:r>
       <w:r>
         <w:rPr>
@@ -3845,7 +3695,7 @@
           <w:szCs w:val="24"/>
           <w:rtl w:val="false"/>
         </w:rPr>
-        <w:t xml:space="preserve">Journal of Applied Communication Research, 35</w:t>
+        <w:t xml:space="preserve">Frontiers in Psychology, 14</w:t>
       </w:r>
       <w:r>
         <w:rPr>
@@ -3855,7 +3705,7 @@
           <w:szCs w:val="24"/>
           <w:rtl w:val="false"/>
         </w:rPr>
-        <w:t xml:space="preserve">(3), 246-267. https://doi.org/10.1080/00909880701434232</w:t>
+        <w:t xml:space="preserve">, Article 1283509. https://doi.org/10.3389/fpsyg.2023.1283509</w:t>
       </w:r>
     </w:p>
     <w:p>
@@ -3873,7 +3723,7 @@
           <w:szCs w:val="24"/>
           <w:rtl w:val="false"/>
         </w:rPr>
-        <w:t xml:space="preserve">Cai, H., Wang, L., &amp; Jin, X. (2024). Leader's Machiavellianism and employees' counterproductive work behavior: Testing a moderated mediation model. </w:t>
+        <w:t xml:space="preserve">Chen, L., Qu, L., &amp; Hong, R. Y. (2022). Pathways linking the Big Five to psychological distress: Exploring the mediating roles of stress mindset and coping flexibility. </w:t>
       </w:r>
       <w:r>
         <w:rPr>
@@ -3884,7 +3734,7 @@
           <w:szCs w:val="24"/>
           <w:rtl w:val="false"/>
         </w:rPr>
-        <w:t xml:space="preserve">Frontiers in Psychology, 14</w:t>
+        <w:t xml:space="preserve">Journal of Clinical Medicine, 11</w:t>
       </w:r>
       <w:r>
         <w:rPr>
@@ -3894,7 +3744,7 @@
           <w:szCs w:val="24"/>
           <w:rtl w:val="false"/>
         </w:rPr>
-        <w:t xml:space="preserve">, Article 1283509. https://doi.org/10.3389/fpsyg.2023.1283509</w:t>
+        <w:t xml:space="preserve">(9), Article 2272. https://doi.org/10.3390/jcm11092272</w:t>
       </w:r>
     </w:p>
     <w:p>
@@ -3912,7 +3762,7 @@
           <w:szCs w:val="24"/>
           <w:rtl w:val="false"/>
         </w:rPr>
-        <w:t xml:space="preserve">Chen, L., Qu, L., &amp; Hong, R. Y. (2022). Pathways linking the Big Five to psychological distress: Exploring the mediating roles of stress mindset and coping flexibility. </w:t>
+        <w:t xml:space="preserve">Feijó, F. R., Gräf, D. D., Pearce, N., &amp; Fassa, A. G. (2019). Risk factors for workplace bullying: A systematic review. </w:t>
       </w:r>
       <w:r>
         <w:rPr>
@@ -3923,7 +3773,7 @@
           <w:szCs w:val="24"/>
           <w:rtl w:val="false"/>
         </w:rPr>
-        <w:t xml:space="preserve">Journal of Clinical Medicine, 11</w:t>
+        <w:t xml:space="preserve">International Journal of Environmental Research and Public Health, 16</w:t>
       </w:r>
       <w:r>
         <w:rPr>
@@ -3933,7 +3783,7 @@
           <w:szCs w:val="24"/>
           <w:rtl w:val="false"/>
         </w:rPr>
-        <w:t xml:space="preserve">(9), Article 2272. https://doi.org/10.3390/jcm11092272</w:t>
+        <w:t xml:space="preserve">(11), Article 1945. https://doi.org/10.3390/ijerph16111945</w:t>
       </w:r>
     </w:p>
     <w:p>
@@ -3951,7 +3801,7 @@
           <w:szCs w:val="24"/>
           <w:rtl w:val="false"/>
         </w:rPr>
-        <w:t xml:space="preserve">Feijó, F. R., Gräf, D. D., Pearce, N., &amp; Fassa, A. G. (2019). Risk factors for workplace bullying: A systematic review. </w:t>
+        <w:t xml:space="preserve">Helfrich, C. D., Li, Y.-F., Mohr, D. C., Meterko, M., &amp; Sales, A. E. (2007). Assessing an organizational culture instrument based on the Competing Values Framework: Exploratory and confirmatory factor analyses. </w:t>
       </w:r>
       <w:r>
         <w:rPr>
@@ -3962,7 +3812,7 @@
           <w:szCs w:val="24"/>
           <w:rtl w:val="false"/>
         </w:rPr>
-        <w:t xml:space="preserve">International Journal of Environmental Research and Public Health, 16</w:t>
+        <w:t xml:space="preserve">Implementation Science, 2</w:t>
       </w:r>
       <w:r>
         <w:rPr>
@@ -3972,7 +3822,7 @@
           <w:szCs w:val="24"/>
           <w:rtl w:val="false"/>
         </w:rPr>
-        <w:t xml:space="preserve">(11), Article 1945. https://doi.org/10.3390/ijerph16111945</w:t>
+        <w:t xml:space="preserve">, Article 13. https://doi.org/10.1186/1748-5908-2-13</w:t>
       </w:r>
     </w:p>
     <w:p>
@@ -3990,7 +3840,7 @@
           <w:szCs w:val="24"/>
           <w:rtl w:val="false"/>
         </w:rPr>
-        <w:t xml:space="preserve">Helfrich, C. D., Li, Y.-F., Mohr, D. C., Meterko, M., &amp; Sales, A. E. (2007). Assessing an organizational culture instrument based on the Competing Values Framework: Exploratory and confirmatory factor analyses. </w:t>
+        <w:t xml:space="preserve">Pan, X., Chen, M., Hao, Z., &amp; Bi, W. (2018). The effects of organizational justice on positive organizational behavior: Evidence from a large-sample survey and a situational experiment. </w:t>
       </w:r>
       <w:r>
         <w:rPr>
@@ -4001,7 +3851,7 @@
           <w:szCs w:val="24"/>
           <w:rtl w:val="false"/>
         </w:rPr>
-        <w:t xml:space="preserve">Implementation Science, 2</w:t>
+        <w:t xml:space="preserve">Frontiers in Psychology, 8</w:t>
       </w:r>
       <w:r>
         <w:rPr>
@@ -4011,85 +3861,7 @@
           <w:szCs w:val="24"/>
           <w:rtl w:val="false"/>
         </w:rPr>
-        <w:t xml:space="preserve">, Article 13. https://doi.org/10.1186/1748-5908-2-13</w:t>
-      </w:r>
-    </w:p>
-    <w:p>
-      <w:pPr>
-        <w:bidi w:val="false"/>
-        <w:spacing w:after="120" w:line="360"/>
-        <w:ind w:left="709" w:right="0" w:hanging="709"/>
-        <w:jc w:val="left"/>
-      </w:pPr>
-      <w:r>
-        <w:rPr>
-          <w:rFonts w:ascii="David" w:cs="David" w:eastAsia="David" w:hAnsi="David"/>
-          <w:i w:val="false"/>
-          <w:sz w:val="24"/>
-          <w:szCs w:val="24"/>
-          <w:rtl w:val="false"/>
-        </w:rPr>
-        <w:t xml:space="preserve">Pan, X., Chen, M., Hao, Z., &amp; Bi, W. (2018). The effects of organizational justice on positive organizational behavior: Evidence from a large-sample survey and a situational experiment. </w:t>
-      </w:r>
-      <w:r>
-        <w:rPr>
-          <w:rFonts w:ascii="David" w:cs="David" w:eastAsia="David" w:hAnsi="David"/>
-          <w:i/>
-          <w:iCs/>
-          <w:sz w:val="24"/>
-          <w:szCs w:val="24"/>
-          <w:rtl w:val="false"/>
-        </w:rPr>
-        <w:t xml:space="preserve">Frontiers in Psychology, 8</w:t>
-      </w:r>
-      <w:r>
-        <w:rPr>
-          <w:rFonts w:ascii="David" w:cs="David" w:eastAsia="David" w:hAnsi="David"/>
-          <w:i w:val="false"/>
-          <w:sz w:val="24"/>
-          <w:szCs w:val="24"/>
-          <w:rtl w:val="false"/>
-        </w:rPr>
         <w:t xml:space="preserve">, Article 2315. https://doi.org/10.3389/fpsyg.2017.02315</w:t>
-      </w:r>
-    </w:p>
-    <w:p>
-      <w:pPr>
-        <w:bidi w:val="false"/>
-        <w:spacing w:after="120" w:line="360"/>
-        <w:ind w:left="709" w:right="0" w:hanging="709"/>
-        <w:jc w:val="left"/>
-      </w:pPr>
-      <w:r>
-        <w:rPr>
-          <w:rFonts w:ascii="David" w:cs="David" w:eastAsia="David" w:hAnsi="David"/>
-          <w:i w:val="false"/>
-          <w:sz w:val="24"/>
-          <w:szCs w:val="24"/>
-          <w:rtl w:val="false"/>
-        </w:rPr>
-        <w:t xml:space="preserve">Schein, E. H. (1990). Organizational culture. </w:t>
-      </w:r>
-      <w:r>
-        <w:rPr>
-          <w:rFonts w:ascii="David" w:cs="David" w:eastAsia="David" w:hAnsi="David"/>
-          <w:i/>
-          <w:iCs/>
-          <w:sz w:val="24"/>
-          <w:szCs w:val="24"/>
-          <w:rtl w:val="false"/>
-        </w:rPr>
-        <w:t xml:space="preserve">American Psychologist, 45</w:t>
-      </w:r>
-      <w:r>
-        <w:rPr>
-          <w:rFonts w:ascii="David" w:cs="David" w:eastAsia="David" w:hAnsi="David"/>
-          <w:i w:val="false"/>
-          <w:sz w:val="24"/>
-          <w:szCs w:val="24"/>
-          <w:rtl w:val="false"/>
-        </w:rPr>
-        <w:t xml:space="preserve">(2), 109-119. https://doi.org/10.1037/0003-066X.45.2.109</w:t>
       </w:r>
     </w:p>
     <w:p>

</xml_diff>

<commit_message>
Add Ono Academic College logo to title page
Co-Authored-By: Claude Opus 5.5 <noreply@anthropic.com>
Claude-Session: https://claude.ai/code/session_01HRkqVTfSkfLSvYdwqYD5BN
</commit_message>
<xml_diff>
--- a/papers/עבודת-סיכום-התנהגות-ארגונית.docx
+++ b/papers/עבודת-סיכום-התנהגות-ארגונית.docx
@@ -2,6 +2,52 @@
 <file path=word/document.xml><?xml version="1.0" encoding="utf-8"?>
 <w:document xmlns:wpc="http://schemas.microsoft.com/office/word/2010/wordprocessingCanvas" xmlns:mc="http://schemas.openxmlformats.org/markup-compatibility/2006" xmlns:o="urn:schemas-microsoft-com:office:office" xmlns:r="http://schemas.openxmlformats.org/officeDocument/2006/relationships" xmlns:m="http://schemas.openxmlformats.org/officeDocument/2006/math" xmlns:v="urn:schemas-microsoft-com:vml" xmlns:wp14="http://schemas.microsoft.com/office/word/2010/wordprocessingDrawing" xmlns:wp="http://schemas.openxmlformats.org/drawingml/2006/wordprocessingDrawing" xmlns:w10="urn:schemas-microsoft-com:office:word" xmlns:w="http://schemas.openxmlformats.org/wordprocessingml/2006/main" xmlns:w14="http://schemas.microsoft.com/office/word/2010/wordml" xmlns:w15="http://schemas.microsoft.com/office/word/2012/wordml" xmlns:wpg="http://schemas.microsoft.com/office/word/2010/wordprocessingGroup" xmlns:wpi="http://schemas.microsoft.com/office/word/2010/wordprocessingInk" xmlns:wne="http://schemas.microsoft.com/office/word/2006/wordml" xmlns:wps="http://schemas.microsoft.com/office/word/2010/wordprocessingShape" xmlns:cx="http://schemas.microsoft.com/office/drawing/2014/chartex" xmlns:cx1="http://schemas.microsoft.com/office/drawing/2015/9/8/chartex" xmlns:cx2="http://schemas.microsoft.com/office/drawing/2015/10/21/chartex" xmlns:cx3="http://schemas.microsoft.com/office/drawing/2016/5/9/chartex" xmlns:cx4="http://schemas.microsoft.com/office/drawing/2016/5/10/chartex" xmlns:cx5="http://schemas.microsoft.com/office/drawing/2016/5/11/chartex" xmlns:cx6="http://schemas.microsoft.com/office/drawing/2016/5/12/chartex" xmlns:cx7="http://schemas.microsoft.com/office/drawing/2016/5/13/chartex" xmlns:cx8="http://schemas.microsoft.com/office/drawing/2016/5/14/chartex" xmlns:aink="http://schemas.microsoft.com/office/drawing/2016/ink" xmlns:am3d="http://schemas.microsoft.com/office/drawing/2017/model3d" xmlns:w16cex="http://schemas.microsoft.com/office/word/2018/wordml/cex" xmlns:w16cid="http://schemas.microsoft.com/office/word/2016/wordml/cid" xmlns:w16="http://schemas.microsoft.com/office/word/2018/wordml" xmlns:w16sdtdh="http://schemas.microsoft.com/office/word/2020/wordml/sdtdatahash" xmlns:w16se="http://schemas.microsoft.com/office/word/2015/wordml/symex" mc:Ignorable="w14 w15 wp14">
   <w:body>
+    <w:p>
+      <w:pPr>
+        <w:spacing w:after="240"/>
+        <w:jc w:val="center"/>
+      </w:pPr>
+      <w:r>
+        <w:drawing>
+          <wp:inline distT="0" distB="0" distL="0" distR="0">
+            <wp:extent cx="2190750" cy="1123950"/>
+            <wp:effectExtent t="0" r="0" b="0" l="0"/>
+            <wp:docPr id="1" name="" descr="" title=""/>
+            <wp:cNvGraphicFramePr>
+              <a:graphicFrameLocks xmlns:a="http://schemas.openxmlformats.org/drawingml/2006/main" noChangeAspect="1"/>
+            </wp:cNvGraphicFramePr>
+            <a:graphic xmlns:a="http://schemas.openxmlformats.org/drawingml/2006/main">
+              <a:graphicData uri="http://schemas.openxmlformats.org/drawingml/2006/picture">
+                <pic:pic xmlns:pic="http://schemas.openxmlformats.org/drawingml/2006/picture">
+                  <pic:nvPicPr>
+                    <pic:cNvPr id="0" name="" descr=""/>
+                    <pic:cNvPicPr>
+                      <a:picLocks noChangeAspect="1" noChangeArrowheads="1"/>
+                    </pic:cNvPicPr>
+                  </pic:nvPicPr>
+                  <pic:blipFill>
+                    <a:blip r:embed="rId8" cstate="none"/>
+                    <a:srcRect/>
+                    <a:stretch>
+                      <a:fillRect/>
+                    </a:stretch>
+                  </pic:blipFill>
+                  <pic:spPr bwMode="auto">
+                    <a:xfrm>
+                      <a:off x="0" y="0"/>
+                      <a:ext cx="2190750" cy="1123950"/>
+                    </a:xfrm>
+                    <a:prstGeom prst="rect">
+                      <a:avLst/>
+                    </a:prstGeom>
+                  </pic:spPr>
+                </pic:pic>
+              </a:graphicData>
+            </a:graphic>
+          </wp:inline>
+        </w:drawing>
+      </w:r>
+    </w:p>
     <w:p>
       <w:pPr>
         <w:bidi/>

</xml_diff>

<commit_message>
Align paper more closely with course slides
- Add external stress sources (economic situation), multi-generational workforce, and assumptions-values-behavior layering
- Trim peripheral sentences to keep Part A at 6 pages

Co-Authored-By: Claude Opus 5.5 <noreply@anthropic.com>
Claude-Session: https://claude.ai/code/session_01HRkqVTfSkfLSvYdwqYD5BN
</commit_message>
<xml_diff>
--- a/papers/עבודת-סיכום-התנהגות-ארגונית.docx
+++ b/papers/עבודת-סיכום-התנהגות-ארגונית.docx
@@ -340,7 +340,7 @@
           <w:szCs w:val="24"/>
           <w:rtl/>
         </w:rPr>
-        <w:t xml:space="preserve">התוכנית שלהלן הוצעה למנהל אגף בארגון X ומיועדת למנהלי צוותים ולראשי מדורים, כלומר למי שמנהלים אנשים בפועל אך אינם קובעים את מדיניות הארגון. דרג הביניים יושב בנקודה שבה דרישות ההנהלה פוגשות את העובדים, ולכן הוא סופג לחצים משני הכיוונים. כל אחד מארבעת המפגשים בנוי כהרצאה: הסבר המושגים, עיגונם במודלים ובמחקר, והצגת הזיקה בין שני הנושאים של המפגש, בתוספת המלצה מעשית אחת שהמשתתפים לוקחים איתם ליחידה.</w:t>
+        <w:t xml:space="preserve">התוכנית שלהלן הוצעה למנהל אגף בארגון X ומיועדת למנהלי צוותים ולראשי מדורים, כלומר למי שמנהלים אנשים בפועל אך אינם קובעים את מדיניות הארגון. דרג הביניים יושב בנקודה שבה דרישות ההנהלה פוגשות את העובדים, ולכן הוא סופג לחצים משני הכיוונים.</w:t>
       </w:r>
     </w:p>
     <w:p>
@@ -498,7 +498,7 @@
           <w:szCs w:val="24"/>
           <w:rtl/>
         </w:rPr>
-        <w:t xml:space="preserve">לכל אחד מהגורמים ביטוי מוכר במקום העבודה. עובד מצפוני מתכנן, עומד בלוחות זמנים ומקפיד על פרטים. עובד מוחצן שואב אנרגיה מאנשים ונוטה לפנות לעזרה כשקשה לו. עובד נעים מעדיף שיתוף פעולה ונמנע מעימות, לעיתים גם כשעימות נחוץ. עובד פתוח לחוויות מתמודד טוב יותר עם שינויים ועם משימות לא מוגדרות. לעומתם, עובד בעל יציבות רגשית נמוכה חווה ביתר עוצמה רגשות שליליים כמו דאגה, כעס ותסכול. חשוב לזכור שמדובר ברצפים ולא בסוגים: כל אדם ממוקם בנקודה כלשהי על כל אחד מחמשת הממדים.</w:t>
+        <w:t xml:space="preserve">לכל אחד מהגורמים ביטוי מוכר במקום העבודה. עובד מצפוני מתכנן ומקפיד על לוחות זמנים, עובד נעים נמנע מעימות גם כשהוא נחוץ, ועובד בעל יציבות רגשית נמוכה חווה ביתר עוצמה דאגה, כעס ותסכול. מדובר ברצפים ולא בסוגים: כל אדם ממוקם בנקודה כלשהי על כל אחד מחמשת הממדים.</w:t>
       </w:r>
     </w:p>
     <w:p>
@@ -552,6 +552,78 @@
           <w:rtl w:val="false"/>
         </w:rPr>
         <w:t xml:space="preserve">Feijó et al., 2019</w:t>
+      </w:r>
+      <w:r>
+        <w:rPr>
+          <w:rFonts w:ascii="David" w:cs="David" w:eastAsia="David" w:hAnsi="David"/>
+          <w:sz w:val="24"/>
+          <w:szCs w:val="24"/>
+          <w:rtl/>
+        </w:rPr>
+        <w:t xml:space="preserve">‏</w:t>
+      </w:r>
+      <w:r>
+        <w:rPr>
+          <w:rFonts w:ascii="David" w:cs="David" w:eastAsia="David" w:hAnsi="David"/>
+          <w:sz w:val="24"/>
+          <w:szCs w:val="24"/>
+          <w:rtl/>
+        </w:rPr>
+        <w:t xml:space="preserve">). ללחץ יש גם מקורות שמחוץ לארגון, כמו מצב המשק: בתקופת משבר כלכלי עובדים נוטים לתפוס עבודה קשה כמלחיצה יותר (</w:t>
+      </w:r>
+      <w:r>
+        <w:rPr>
+          <w:rFonts w:ascii="David" w:cs="David" w:eastAsia="David" w:hAnsi="David"/>
+          <w:sz w:val="24"/>
+          <w:szCs w:val="24"/>
+          <w:rtl/>
+        </w:rPr>
+        <w:t xml:space="preserve">‏</w:t>
+      </w:r>
+      <w:r>
+        <w:rPr>
+          <w:rFonts w:ascii="David" w:cs="David" w:eastAsia="David" w:hAnsi="David"/>
+          <w:sz w:val="24"/>
+          <w:szCs w:val="24"/>
+          <w:rtl w:val="false"/>
+        </w:rPr>
+        <w:t xml:space="preserve">Giorgi et al., 2015</w:t>
+      </w:r>
+      <w:r>
+        <w:rPr>
+          <w:rFonts w:ascii="David" w:cs="David" w:eastAsia="David" w:hAnsi="David"/>
+          <w:sz w:val="24"/>
+          <w:szCs w:val="24"/>
+          <w:rtl/>
+        </w:rPr>
+        <w:t xml:space="preserve">‏</w:t>
+      </w:r>
+      <w:r>
+        <w:rPr>
+          <w:rFonts w:ascii="David" w:cs="David" w:eastAsia="David" w:hAnsi="David"/>
+          <w:sz w:val="24"/>
+          <w:szCs w:val="24"/>
+          <w:rtl/>
+        </w:rPr>
+        <w:t xml:space="preserve">, כפי שמצוטט אצל </w:t>
+      </w:r>
+      <w:r>
+        <w:rPr>
+          <w:rFonts w:ascii="David" w:cs="David" w:eastAsia="David" w:hAnsi="David"/>
+          <w:sz w:val="24"/>
+          <w:szCs w:val="24"/>
+          <w:rtl/>
+        </w:rPr>
+        <w:t xml:space="preserve">‏</w:t>
+      </w:r>
+      <w:r>
+        <w:rPr>
+          <w:rFonts w:ascii="David" w:cs="David" w:eastAsia="David" w:hAnsi="David"/>
+          <w:sz w:val="24"/>
+          <w:szCs w:val="24"/>
+          <w:rtl w:val="false"/>
+        </w:rPr>
+        <w:t xml:space="preserve">Pan et al., 2018</w:t>
       </w:r>
       <w:r>
         <w:rPr>
@@ -1292,7 +1364,7 @@
           <w:szCs w:val="24"/>
           <w:rtl/>
         </w:rPr>
-        <w:t xml:space="preserve">דור ה-Y, ילידי תחילת שנות השמונים עד אמצע שנות התשעים, מתואר בדרך כלל כדור בעל צורך הישג גבוה, משכיל, מחובר לטכנולוגיה, מחויב לעצמו יותר מאשר לארגון, ודורש משוב מיידי ואפשרויות לצמיחה. כדאי להחזיק את התיאור הזה ברפיון. שרדר (</w:t>
+        <w:t xml:space="preserve">בשוק העבודה פועלים כיום כמה דורות במקביל: הבייבי בומרס, דור ה-X, דור ה-Y ודור ה-Z, אם כי גבולות השנים של כל דור משתנים ממקור למקור (</w:t>
       </w:r>
       <w:r>
         <w:rPr>
@@ -1328,6 +1400,42 @@
           <w:szCs w:val="24"/>
           <w:rtl/>
         </w:rPr>
+        <w:t xml:space="preserve">). דור ה-Y, ילידי תחילת שנות השמונים עד אמצע שנות התשעים, מתואר בדרך כלל כדור בעל צורך הישג גבוה, משכיל, מחובר לטכנולוגיה, מחויב לעצמו יותר מאשר לארגון, ודורש משוב מיידי ואפשרויות לצמיחה. כדאי להחזיק את התיאור הזה ברפיון. שרדר (</w:t>
+      </w:r>
+      <w:r>
+        <w:rPr>
+          <w:rFonts w:ascii="David" w:cs="David" w:eastAsia="David" w:hAnsi="David"/>
+          <w:sz w:val="24"/>
+          <w:szCs w:val="24"/>
+          <w:rtl/>
+        </w:rPr>
+        <w:t xml:space="preserve">‏</w:t>
+      </w:r>
+      <w:r>
+        <w:rPr>
+          <w:rFonts w:ascii="David" w:cs="David" w:eastAsia="David" w:hAnsi="David"/>
+          <w:sz w:val="24"/>
+          <w:szCs w:val="24"/>
+          <w:rtl w:val="false"/>
+        </w:rPr>
+        <w:t xml:space="preserve">Schröder, 2024</w:t>
+      </w:r>
+      <w:r>
+        <w:rPr>
+          <w:rFonts w:ascii="David" w:cs="David" w:eastAsia="David" w:hAnsi="David"/>
+          <w:sz w:val="24"/>
+          <w:szCs w:val="24"/>
+          <w:rtl/>
+        </w:rPr>
+        <w:t xml:space="preserve">‏</w:t>
+      </w:r>
+      <w:r>
+        <w:rPr>
+          <w:rFonts w:ascii="David" w:cs="David" w:eastAsia="David" w:hAnsi="David"/>
+          <w:sz w:val="24"/>
+          <w:szCs w:val="24"/>
+          <w:rtl/>
+        </w:rPr>
         <w:t xml:space="preserve">) ניתח נתונים של 584,217 אנשים ב-113 מדינות לאורך יותר משלושים שנה ומצא שחשיבות העבודה משתנה עם הגיל ועם התקופה ההיסטורית, ולא לפי דור. חלק ממה שמיוחס ל"דור" הוא בפועל שלב בחיים.</w:t>
       </w:r>
     </w:p>
@@ -1344,7 +1452,7 @@
           <w:szCs w:val="24"/>
           <w:rtl/>
         </w:rPr>
-        <w:t xml:space="preserve">בני הדור גדלו בתקופה של שינויים טכנולוגיים מהירים, וחוו כאירועים מכוננים את פיגועי 11 בספטמבר ואת התפוצצות בועת ההייטק. במקום העבודה הישראלי הם כבר אינם "הצעירים": רבים מהם הם היום בדיוק אותם מנהלי ביניים שהתוכנית פונה אליהם, והם מנהלים עובדים מדור ה-Z.</w:t>
+        <w:t xml:space="preserve">בני הדור גדלו בתקופה של שינויים טכנולוגיים מהירים, וחוו כאירועים מכוננים את פיגועי 11 בספטמבר ואת התפוצצות בועת ההייטק.</w:t>
       </w:r>
     </w:p>
     <w:p>
@@ -1732,7 +1840,7 @@
           <w:szCs w:val="24"/>
           <w:rtl/>
         </w:rPr>
-        <w:t xml:space="preserve">, כפי שמצוטט אצל מש וכהן, 2021, עמ' 2). בתרבות חזקה רוב החברים מאמצים את ערכי הארגון ואת נורמות ההתנהגות שלו, והארגון מתמודד עם הבדלי אינטרסים באמצעות בניית קונצנזוס. חברי הארגון לומדים לפעול לפי ערכים אלה בלי להיות מודעים לכך, והארגון משפיע עליהם גם דרך ערכיו הגלויים וגם דרך ערכיו הנסתרים (מש וכהן, 2021, עמ' 6, 12). מודל הערכים הסותרים (</w:t>
+        <w:t xml:space="preserve">, כפי שמצוטט אצל מש וכהן, 2021, עמ' 2). בתרבות חזקה רוב החברים מאמצים את ערכי הארגון ואת נורמות ההתנהגות שלו, והארגון מתמודד עם הבדלי אינטרסים באמצעות בניית קונצנזוס. חברי הארגון לומדים לפעול לפי ערכים אלה בלי להיות מודעים לכך, והארגון משפיע עליהם גם דרך ערכיו הגלויים וגם דרך ערכיו הנסתרים (מש וכהן, 2021, עמ' 6, 12). מבנה דומה משמש לתיאור האקלים האתי בארגון: הנורמות, הנהלים וההתנהגות בפועל נשענים על הנחות היסוד ועל הערכים המשותפים לעובדים (שפירא-לשצ'ינסקי, 2005, כפי שמצוטט אצל מילון ושפירא-לשצ'ינסקי, 2021). מודל הערכים הסותרים (</w:t>
       </w:r>
       <w:r>
         <w:rPr>
@@ -1893,42 +2001,6 @@
           <w:rtl/>
         </w:rPr>
         <w:t xml:space="preserve">התרבות הצוותית (מיקוד פנימי וגמישות) מעודדת שיתוף רחב של העובדים, עבודת צוות והעצמה, ומעמידה בראש סדר העדיפויות את פיתוח ההון האנושי. התרבות החדשנית (מיקוד חיצוני וגמישות) מדגישה יצירתיות, חדשנות וצמיחה. התרבות המשימתית (מיקוד חיצוני ושליטה) מתאפיינת בבהירות משימות ויעדים, ומעריכה יעילות ותוצאות מדידות. התרבות ההיררכית (מיקוד פנימי ושליטה) נשענת על סמכות ריכוזית, על כבוד להיררכיה הפורמלית ועל הקפדה על כללים, ומעריכה יציבות וצפיות (</w:t>
-      </w:r>
-      <w:r>
-        <w:rPr>
-          <w:rFonts w:ascii="David" w:cs="David" w:eastAsia="David" w:hAnsi="David"/>
-          <w:sz w:val="24"/>
-          <w:szCs w:val="24"/>
-          <w:rtl/>
-        </w:rPr>
-        <w:t xml:space="preserve">‏</w:t>
-      </w:r>
-      <w:r>
-        <w:rPr>
-          <w:rFonts w:ascii="David" w:cs="David" w:eastAsia="David" w:hAnsi="David"/>
-          <w:sz w:val="24"/>
-          <w:szCs w:val="24"/>
-          <w:rtl w:val="false"/>
-        </w:rPr>
-        <w:t xml:space="preserve">Helfrich et al., 2007</w:t>
-      </w:r>
-      <w:r>
-        <w:rPr>
-          <w:rFonts w:ascii="David" w:cs="David" w:eastAsia="David" w:hAnsi="David"/>
-          <w:sz w:val="24"/>
-          <w:szCs w:val="24"/>
-          <w:rtl/>
-        </w:rPr>
-        <w:t xml:space="preserve">‏</w:t>
-      </w:r>
-      <w:r>
-        <w:rPr>
-          <w:rFonts w:ascii="David" w:cs="David" w:eastAsia="David" w:hAnsi="David"/>
-          <w:sz w:val="24"/>
-          <w:szCs w:val="24"/>
-          <w:rtl/>
-        </w:rPr>
-        <w:t xml:space="preserve">). המודל אינו חסין מביקורת: במחקר שכלל 71,776 עובדים שאינם מנהלים ב-168 מתקני בריאות, העובדים הבחינו בפועל בעיקר בין שני גורמים, התרבות ההיררכית מול שלוש האחרות יחד, ולא בין ארבע תרבויות נפרדות (</w:t>
       </w:r>
       <w:r>
         <w:rPr>

</xml_diff>

<commit_message>
Reference course material explicitly in Part A
Co-Authored-By: Claude Opus 5.5 <noreply@anthropic.com>
Claude-Session: https://claude.ai/code/session_01HRkqVTfSkfLSvYdwqYD5BN
</commit_message>
<xml_diff>
--- a/papers/עבודת-סיכום-התנהגות-ארגונית.docx
+++ b/papers/עבודת-סיכום-התנהגות-ארגונית.docx
@@ -410,7 +410,7 @@
           <w:szCs w:val="24"/>
           <w:rtl/>
         </w:rPr>
-        <w:t xml:space="preserve">אישיות מוגדרת כתבנית ייחודית ויציבה יחסית של התנהגות, מחשבה ורגש, המבחינה בין אדם לאדם ונשמרת במצבים שונים. המודל המקובל כיום לתיאורה הוא מודל חמשת הגורמים (</w:t>
+        <w:t xml:space="preserve">כפי שהוצג בקורס, אישיות מוגדרת כתבנית ייחודית ויציבה יחסית של התנהגות, מחשבה ורגש, המבחינה בין אדם לאדם ונשמרת במצבים שונים. המודל המקובל כיום לתיאורה הוא מודל חמשת הגורמים (</w:t>
       </w:r>
       <w:r>
         <w:rPr>
@@ -533,7 +533,7 @@
           <w:szCs w:val="24"/>
           <w:rtl/>
         </w:rPr>
-        <w:t xml:space="preserve">בספרות מקובלות שלוש דרכים להגדיר לחץ. הראשונה מתמקדת בתוצאות: תסמינים גופניים, קוגניטיביים, רגשיים והתנהגותיים. השנייה מתמקדת בפער בין דרישות הסביבה למשאבי הפרט, ובמרכזה רעיון ההתאמה בין אדם לסביבה. השלישית מתמקדת במקורות הלחץ, ובהם עמימות תפקיד, קונפליקט תפקידי, דרישות סותרות, היעדר אוטונומיה והיעדר משוב. אותם מאפיינים בדיוק, קונפליקט תפקידי, עמימות, דרישות גבוהות ולחץ עבודה, נמצאו בסקירה שיטתית של 51 מחקרים כקשורים בעוצמה גם לפגיעה בעובדים בדמות התעמרות (</w:t>
+        <w:t xml:space="preserve">בקורס הוצגו שלוש דרכים להגדיר לחץ. הראשונה מתמקדת בתוצאות: תסמינים גופניים, קוגניטיביים, רגשיים והתנהגותיים. השנייה מתמקדת בפער בין דרישות הסביבה למשאבי הפרט, ובמרכזה רעיון ההתאמה בין אדם לסביבה. השלישית מתמקדת במקורות הלחץ, ובהם עמימות תפקיד, קונפליקט תפקידי, דרישות סותרות, היעדר אוטונומיה והיעדר משוב. אותם מאפיינים בדיוק, קונפליקט תפקידי, עמימות, דרישות גבוהות ולחץ עבודה, נמצאו בסקירה שיטתית של 51 מחקרים כקשורים בעוצמה גם לפגיעה בעובדים בדמות התעמרות (</w:t>
       </w:r>
       <w:r>
         <w:rPr>
@@ -903,7 +903,7 @@
           <w:szCs w:val="24"/>
           <w:rtl/>
         </w:rPr>
-        <w:t xml:space="preserve">מוטיבציה היא הכוח המניע אדם להשקיע מאמץ גופני, שכלי ונפשי מתוך רצון ולא מתוך כפייה. המפגש מציג שתי תיאוריות שמסבירות את הכוח הזה מזוויות שונות, ובוחן אותן מול דור שעליו נאמרים הרבה דברים ונבדקים מעט.</w:t>
+        <w:t xml:space="preserve">כפי שהוגדרה בקורס, מוטיבציה היא הכוח המניע אדם להשקיע מאמץ גופני, שכלי ונפשי מתוך רצון ולא מתוך כפייה. המפגש מציג שתי תיאוריות שמסבירות את הכוח הזה מזוויות שונות, ובוחן אותן מול דור שעליו נאמרים הרבה דברים ונבדקים מעט.</w:t>
       </w:r>
     </w:p>
     <w:p>
@@ -1400,7 +1400,7 @@
           <w:szCs w:val="24"/>
           <w:rtl/>
         </w:rPr>
-        <w:t xml:space="preserve">). דור ה-Y, ילידי תחילת שנות השמונים עד אמצע שנות התשעים, מתואר בדרך כלל כדור בעל צורך הישג גבוה, משכיל, מחובר לטכנולוגיה, מחויב לעצמו יותר מאשר לארגון, ודורש משוב מיידי ואפשרויות לצמיחה. כדאי להחזיק את התיאור הזה ברפיון. שרדר (</w:t>
+        <w:t xml:space="preserve">). דור ה-Y, ילידי תחילת שנות השמונים עד אמצע שנות התשעים, מתואר בקורס כדור בעל צורך הישג גבוה, משכיל, מחובר לטכנולוגיה, מחויב לעצמו יותר מאשר לארגון, ודורש משוב מיידי ואפשרויות לצמיחה. כדאי להחזיק את התיאור הזה ברפיון. שרדר (</w:t>
       </w:r>
       <w:r>
         <w:rPr>
@@ -1593,7 +1593,7 @@
           <w:szCs w:val="24"/>
           <w:rtl/>
         </w:rPr>
-        <w:t xml:space="preserve">התעמרות היא מצב מתמשך, בדרך כלל שלושה חודשים ויותר, שבו אדם נחשף שוב ושוב להתנהגות פוגענית: זלזול, השפלה בנוכחות אחרים, גסות, התפרצויות זעם, בידוד חברתי או מידור ממידע וממשימות. ההתנהגות יכולה להגיע ממנהלים, מעמיתים ואף מלקוחות. בסקר רשמי של משרד הכלכלה דיווחו 36.9% מהנפגעים על פגיעה ממנהלים, 33.6% מעמיתים ו-23.1% מלקוחות (פפרמן ובר-צורי, 2016, כפי שמצוטט אצל קמיר, 2018, עמ' 310). מה שמבחין אותה מקונפליקט רגיל הוא החזרתיות, משך הזמן ופער הכוחות שמקשה על הנפגע להתגונן (</w:t>
+        <w:t xml:space="preserve">לפי ההגדרה שהוצגה בקורס, התעמרות היא מצב מתמשך של שלושה חודשים ויותר, שבו אדם נחשף שוב ושוב להתנהגות פוגענית: זלזול, השפלה בנוכחות אחרים, גסות, התפרצויות זעם, בידוד חברתי או מידור ממידע וממשימות. ההתנהגות יכולה להגיע ממנהלים, מעמיתים ואף מלקוחות. בסקר רשמי של משרד הכלכלה דיווחו 36.9% מהנפגעים על פגיעה ממנהלים, 33.6% מעמיתים ו-23.1% מלקוחות (פפרמן ובר-צורי, 2016, כפי שמצוטט אצל קמיר, 2018, עמ' 310). מה שמבחין אותה מקונפליקט רגיל הוא החזרתיות, משך הזמן ופער הכוחות שמקשה על הנפגע להתגונן (</w:t>
       </w:r>
       <w:r>
         <w:rPr>
@@ -2337,7 +2337,7 @@
           <w:szCs w:val="24"/>
           <w:rtl/>
         </w:rPr>
-        <w:t xml:space="preserve">לצד ההתנהגות האזרחית קיימת תמונת מראה שלה: התנהגויות שבהן העובד לוקח מהארגון יותר ממה שהוא נותן, כמו איחורים כרוניים, הפסקות ממושכות, שימוש בציוד הארגון לצרכים פרטיים או עיסוק בעניינים אישיים בזמן העבודה. בספרות הן מכונות התנהגויות עבודה הרסניות (</w:t>
+        <w:t xml:space="preserve">בקורס הוצגה גם תמונת המראה של ההתנהגות האזרחית, ההתנהגות הלא נאותה: התנהגויות שבהן העובד לוקח מהארגון יותר ממה שהוא נותן, כמו איחורים כרוניים, הפסקות ממושכות, שימוש בציוד הארגון לצרכים פרטיים או עיסוק בעניינים אישיים בזמן העבודה. בספרות הן מכונות התנהגויות עבודה הרסניות (</w:t>
       </w:r>
       <w:r>
         <w:rPr>

</xml_diff>

<commit_message>
Write reflections and title page in feminine form
Co-Authored-By: Claude Opus 5.5 <noreply@anthropic.com>
Claude-Session: https://claude.ai/code/session_01HRkqVTfSkfLSvYdwqYD5BN
</commit_message>
<xml_diff>
--- a/papers/עבודת-סיכום-התנהגות-ארגונית.docx
+++ b/papers/עבודת-סיכום-התנהגות-ארגונית.docx
@@ -215,7 +215,7 @@
           <w:szCs w:val="24"/>
           <w:rtl/>
         </w:rPr>
-        <w:t xml:space="preserve">מוגש על ידי:</w:t>
+        <w:t xml:space="preserve">מגישות:</w:t>
       </w:r>
     </w:p>
     <w:p>
@@ -2678,7 +2678,7 @@
           <w:szCs w:val="28"/>
           <w:rtl/>
         </w:rPr>
-        <w:t xml:space="preserve">רפלקציה: [שם מלא של סטודנט/ית א']</w:t>
+        <w:t xml:space="preserve">רפלקציה: [שם מלא של סטודנטית א']</w:t>
       </w:r>
     </w:p>
     <w:p>
@@ -2749,23 +2749,23 @@
           <w:szCs w:val="24"/>
           <w:rtl/>
         </w:rPr>
-        <w:t xml:space="preserve">), הבנתי שחלק גדול מהלחץ נוצר ברגע שבו אני מפרש מצב כאיום. זו הייתה הבנה לא נוחה, כי היא מחזירה אליי חלק מהאחריות. קל יותר להאשים את העומס.</w:t>
-      </w:r>
-    </w:p>
-    <w:p>
-      <w:pPr>
-        <w:bidi/>
-        <w:spacing w:after="120" w:line="360"/>
-        <w:jc w:val="both"/>
-      </w:pPr>
-      <w:r>
-        <w:rPr>
-          <w:rFonts w:ascii="David" w:cs="David" w:eastAsia="David" w:hAnsi="David"/>
-          <w:sz w:val="24"/>
-          <w:szCs w:val="24"/>
-          <w:rtl/>
-        </w:rPr>
-        <w:t xml:space="preserve">בחיים המקצועיים זיהיתי את זה כמעט מיד. לפני כמה חודשים הועברה אליי אחריות על פרויקט שמנהל אחר עזב באמצע. במשך שבועיים ישנתי רע, וכל מייל מהלקוח נקרא אצלי כביקורת. בדיעבד, העומס לא היה גדול מזה שהכרתי קודם. מה שהיה שונה הוא שלא היה ברור לי מה בדיוק מצופה ממני ומי מחליט במקרה של מחלוקת. בישיבות הצוות ראיתי עמית שמקבל משימה דחופה ברוגע ומתחיל לחלק אותה, בזמן שאני כבר מחשב מה עלול להשתבש. פעם ראיתי בזה רצינות. היום אני רואה בזה גם דפוס שעולה לי ביוקר.</w:t>
+        <w:t xml:space="preserve">), הבנתי שחלק גדול מהלחץ נוצר ברגע שבו אני מפרשת מצב כאיום. זו הייתה הבנה לא נוחה, כי היא מחזירה אליי חלק מהאחריות. קל יותר להאשים את העומס.</w:t>
+      </w:r>
+    </w:p>
+    <w:p>
+      <w:pPr>
+        <w:bidi/>
+        <w:spacing w:after="120" w:line="360"/>
+        <w:jc w:val="both"/>
+      </w:pPr>
+      <w:r>
+        <w:rPr>
+          <w:rFonts w:ascii="David" w:cs="David" w:eastAsia="David" w:hAnsi="David"/>
+          <w:sz w:val="24"/>
+          <w:szCs w:val="24"/>
+          <w:rtl/>
+        </w:rPr>
+        <w:t xml:space="preserve">בחיים המקצועיים זיהיתי את זה כמעט מיד. לפני כמה חודשים הועברה אליי אחריות על פרויקט שמנהל אחר עזב באמצע. במשך שבועיים ישנתי רע, וכל מייל מהלקוח נקרא אצלי כביקורת. בדיעבד, העומס לא היה גדול מזה שהכרתי קודם. מה שהיה שונה הוא שלא היה ברור לי מה בדיוק מצופה ממני ומי מחליט במקרה של מחלוקת. בישיבות הצוות ראיתי עמית שמקבל משימה דחופה ברוגע ומתחיל לחלק אותה, בזמן שאני כבר מחשבת מה עלול להשתבש. פעם ראיתי בזה רצינות. היום אני רואה בזה גם דפוס שעולה לי ביוקר.</w:t>
       </w:r>
     </w:p>
     <w:p>
@@ -2849,7 +2849,7 @@
           <w:szCs w:val="24"/>
           <w:rtl/>
         </w:rPr>
-        <w:t xml:space="preserve">), אין טעם לחכות שהאישיות שלי תשתנה. התחלתי לבקש בסוף כל ישיבה הגדרה מפורשת של מי אחראי על מה ועד מתי. זה צעד קטן, אבל הוא הוריד את מספר המצבים שבהם אני צריך לנחש. כשאני מעביר משימות לאחרים, אני משתדל לזכור שאותה משימה תיקרא אחרת אצל כל אחד, ולשאול לפני שאני מניח.</w:t>
+        <w:t xml:space="preserve">), אין טעם לחכות שהאישיות שלי תשתנה. התחלתי לבקש בסוף כל ישיבה הגדרה מפורשת של מי אחראי על מה ועד מתי. זה צעד קטן, אבל הוא הוריד את מספר המצבים שבהם אני צריכה לנחש. כשאני מעבירה משימות לאחרים, אני משתדלת לזכור שאותה משימה תיקרא אחרת אצל כל אחד, ולשאול לפני שאני מניחה.</w:t>
       </w:r>
     </w:p>
     <w:p>
@@ -2900,7 +2900,7 @@
           <w:szCs w:val="24"/>
           <w:rtl/>
         </w:rPr>
-        <w:t xml:space="preserve">למדתי על עצמי דבר לא מחמיא: בחרתי בנוחות. לא הייתי הפוגע, אבל הייתי חלק מהתרבות שאפשרה את הפגיעה. הגישה של קמיר (2018), שרואה בהתעמרות פגיעה בכבוד האדם ולא רק בעיה של יחסי עבודה, שינתה לי את נקודת המבט. אם זו פגיעה בכבוד, אז לעמוד מהצד זו עמדה ולא ניטרליות. גם הרשימה של גורמי הסיכון גרמה לי לחשוב אחרת. באותה יחידה היו שינויים ארגוניים תכופים ואף אחד לא ידע בדיוק מה תחום האחריות שלו, וזה בדיוק סוג הסביבה שבה פגיעה כזאת פורחת (</w:t>
+        <w:t xml:space="preserve">למדתי על עצמי דבר לא מחמיא: בחרתי בנוחות. לא אני פגעתי בה, אבל הייתי חלק מהתרבות שאפשרה את הפגיעה. הגישה של קמיר (2018), שרואה בהתעמרות פגיעה בכבוד האדם ולא רק בעיה של יחסי עבודה, שינתה לי את נקודת המבט. אם זו פגיעה בכבוד, אז לעמוד מהצד זו עמדה ולא ניטרליות. גם הרשימה של גורמי הסיכון גרמה לי לחשוב אחרת. באותה יחידה היו שינויים ארגוניים תכופים ואף אחד לא ידע בדיוק מה תחום האחריות שלו, וזה בדיוק סוג הסביבה שבה פגיעה כזאת פורחת (</w:t>
       </w:r>
       <w:r>
         <w:rPr>
@@ -2984,7 +2984,7 @@
           <w:szCs w:val="24"/>
           <w:rtl/>
         </w:rPr>
-        <w:t xml:space="preserve">הקורס גם גרם לי לשאול איזו תרבות קיימת בארגון שבו אני עובד היום. לפי מודל הערכים הסותרים (</w:t>
+        <w:t xml:space="preserve">הקורס גם גרם לי לשאול איזו תרבות קיימת בארגון שבו אני עובדת היום. לפי מודל הערכים הסותרים (</w:t>
       </w:r>
       <w:r>
         <w:rPr>
@@ -3071,7 +3071,7 @@
           <w:szCs w:val="24"/>
           <w:rtl/>
         </w:rPr>
-        <w:t xml:space="preserve">התובנה העיקרית שלי על ההתנהגות הארגונית היא שהיא מחייבת להחזיק כמה רמות בו זמנית. אי אפשר להבין לחץ רק דרך האישיות, ואי אפשר להבין התעמרות רק דרך הפוגע. הקורס לימד אותי לשאול כל פעם גם מה קורה אצל האדם וגם מה בסביבה מחזק את זה. הבנתי גם שהתחום אינו נותן מתכונים. הוא נותן שאלות טובות יותר, וזה מה שאני לוקח ממנו.</w:t>
+        <w:t xml:space="preserve">התובנה העיקרית שלי על ההתנהגות הארגונית היא שהיא מחייבת להחזיק כמה רמות בו זמנית. אי אפשר להבין לחץ רק דרך האישיות, ואי אפשר להבין התעמרות רק דרך הפוגע. הקורס לימד אותי לשאול כל פעם גם מה קורה אצל האדם וגם מה בסביבה מחזק את זה. הבנתי גם שהתחום אינו נותן מתכונים. הוא נותן שאלות טובות יותר, וזה מה שאני לוקחת ממנו.</w:t>
       </w:r>
     </w:p>
     <w:p>
@@ -3091,7 +3091,7 @@
           <w:szCs w:val="28"/>
           <w:rtl/>
         </w:rPr>
-        <w:t xml:space="preserve">רפלקציה: [שם מלא של סטודנט/ית ב']</w:t>
+        <w:t xml:space="preserve">רפלקציה: [שם מלא של סטודנטית ב']</w:t>
       </w:r>
     </w:p>
     <w:p>
@@ -3126,7 +3126,7 @@
           <w:szCs w:val="24"/>
           <w:rtl/>
         </w:rPr>
-        <w:t xml:space="preserve">התחברתי לנושא כי אני בעצמי בן דור ה-Y, ובמשך שנים שמעתי מנהלים מסבירים את ההתנהגות שלי דרך התווית הזאת: "אתם רוצים הכול מהר", "אין לכם סבלנות". חלק מזה נכון, וחלק תמיד הרגיש לי לא הוגן. המחקר של שרדר (</w:t>
+        <w:t xml:space="preserve">התחברתי לנושא כי אני בעצמי בת דור ה-Y, ובמשך שנים שמעתי מנהלים מסבירים את ההתנהגות שלי דרך התווית הזאת: "אתם רוצים הכול מהר", "אין לכם סבלנות". חלק מזה נכון, וחלק תמיד הרגיש לי לא הוגן. המחקר של שרדר (</w:t>
       </w:r>
       <w:r>
         <w:rPr>
@@ -3162,7 +3162,7 @@
           <w:szCs w:val="24"/>
           <w:rtl/>
         </w:rPr>
-        <w:t xml:space="preserve">), שמצא שחשיבות העבודה משתנה לפי גיל ותקופה ולא לפי דור, נתן לי שפה לתחושה הזאת. הדרישה שלי למשוב לא נובעת משנת הלידה שלי. היא נובעת מהשלב שבו אני נמצא בקריירה, שבו אני עדיין צריך לדעת אם אני בכיוון הנכון.</w:t>
+        <w:t xml:space="preserve">), שמצא שחשיבות העבודה משתנה לפי גיל ותקופה ולא לפי דור, נתן לי שפה לתחושה הזאת. הדרישה שלי למשוב לא נובעת משנת הלידה שלי. היא נובעת מהשלב שבו אני נמצאת בקריירה, שבו אני עדיין צריכה לדעת אם אני בכיוון הנכון.</w:t>
       </w:r>
     </w:p>
     <w:p>
@@ -3350,7 +3350,7 @@
           <w:szCs w:val="24"/>
           <w:rtl/>
         </w:rPr>
-        <w:t xml:space="preserve">מה שאני לוקח ליישום הוא ההבחנה של מקללנד בין שלושת הצרכים. אני מנהל שני עובדים צעירים, ועד עכשיו ניסיתי להניע את שניהם באותה דרך. אחד מהם, כך אני מבין היום, מונע בעיקר מהשתייכות: הוא פורח כשהוא חלק מצוות ונכבה כשהוא עובד לבד. השני מונע מהישג ורוצה יעד ברור ומדד. החלטתי לבנות לכל אחד מהם משימה אחרת ולא לחלק "בשוויון". המחקר של שטיינמן ועמיתיה (</w:t>
+        <w:t xml:space="preserve">מה שאני לוקחת ליישום הוא ההבחנה של מקללנד בין שלושת הצרכים. אני מנהלת שני עובדים צעירים, ועד עכשיו ניסיתי להניע את שניהם באותה דרך. אחד מהם, כך אני מבינה היום, מונע בעיקר מהשתייכות: הוא פורח כשהוא חלק מצוות ונכבה כשהוא עובד לבד. השני מונע מהישג ורוצה יעד ברור ומדד. החלטתי לבנות לכל אחד מהם משימה אחרת ולא לחלק "בשוויון". המחקר של שטיינמן ועמיתיה (</w:t>
       </w:r>
       <w:r>
         <w:rPr>
@@ -3386,23 +3386,23 @@
           <w:szCs w:val="24"/>
           <w:rtl/>
         </w:rPr>
-        <w:t xml:space="preserve">) גרם לי גם להפסיק להתבייש בצורך ההשתייכות שלי כמנהל. חשבתי שהוא חולשה, ומתברר שהוא יכול לאזן את הרצון להשפיע.</w:t>
-      </w:r>
-    </w:p>
-    <w:p>
-      <w:pPr>
-        <w:bidi/>
-        <w:spacing w:after="120" w:line="360"/>
-        <w:jc w:val="both"/>
-      </w:pPr>
-      <w:r>
-        <w:rPr>
-          <w:rFonts w:ascii="David" w:cs="David" w:eastAsia="David" w:hAnsi="David"/>
-          <w:sz w:val="24"/>
-          <w:szCs w:val="24"/>
-          <w:rtl/>
-        </w:rPr>
-        <w:t xml:space="preserve">גם העובדים שלי שייכים לדור שבא אחריי, ואני מוצא את עצמי אומר עליהם את אותם דברים שאמרו עליי. ברגעים כאלה אני מנסה לעצור ולשאול מה בדיוק ראיתי, ולא מה אני יודע על "הדור שלהם". כשעשיתי את זה לגבי אחד העובדים, התברר שמה שנראה כחוסר סבלנות היה בעצם חוסר בהירות לגבי מה שמצופה ממנו. שיחה אחת של עשר דקות פתרה את מה שחשבתי שהוא בעיה של אופי.</w:t>
+        <w:t xml:space="preserve">) גרם לי גם להפסיק להתבייש בצורך ההשתייכות שלי כמנהלת. חשבתי שהוא חולשה, ומתברר שהוא יכול לאזן את הרצון להשפיע.</w:t>
+      </w:r>
+    </w:p>
+    <w:p>
+      <w:pPr>
+        <w:bidi/>
+        <w:spacing w:after="120" w:line="360"/>
+        <w:jc w:val="both"/>
+      </w:pPr>
+      <w:r>
+        <w:rPr>
+          <w:rFonts w:ascii="David" w:cs="David" w:eastAsia="David" w:hAnsi="David"/>
+          <w:sz w:val="24"/>
+          <w:szCs w:val="24"/>
+          <w:rtl/>
+        </w:rPr>
+        <w:t xml:space="preserve">גם העובדים שלי שייכים לדור שבא אחריי, ואני מוצאת את עצמי אומרת עליהם את אותם דברים שאמרו עליי. ברגעים כאלה אני מנסה לעצור ולשאול מה בדיוק ראיתי, ולא מה אני יודעת על "הדור שלהם". כשעשיתי את זה לגבי אחד העובדים, התברר שמה שנראה כחוסר סבלנות היה בעצם חוסר בהירות לגבי מה שמצופה ממנו. שיחה אחת של עשר דקות פתרה את מה שחשבתי שהוא בעיה של אופי.</w:t>
       </w:r>
     </w:p>
     <w:p>
@@ -3453,7 +3453,7 @@
           <w:szCs w:val="24"/>
           <w:rtl/>
         </w:rPr>
-        <w:t xml:space="preserve">יחד עם זה, הנושא לימד אותי משהו גם על עצמי. חלק מהעזרה שאני נותן בעבודה נובעת ממקום אמיתי, וחלק, אם להודות, קשור לרצון שיראו אותי. הקורס לא גרם לי להפסיק לעזור. הוא גרם לי לשים לב למניע. בחיים האישיים זה חל גם על חברויות: יש הבדל בין מי שנמצא לצדך כשזה נוח לו לבין מי שנמצא כשאין לו מה להרוויח. גם הקשר שנמצא בין מנהלים מקיאווליסטים להתנהגות הרסנית של עובדים (</w:t>
+        <w:t xml:space="preserve">יחד עם זה, הנושא לימד אותי משהו גם על עצמי. חלק מהעזרה שאני נותנת בעבודה נובעת ממקום אמיתי, וחלק, אם להודות, קשור לרצון שיראו אותי. הקורס לא גרם לי להפסיק לעזור. הוא גרם לי לשים לב למניע. בחיים האישיים זה חל גם על חברויות: יש הבדל בין מי שנמצא לצדך כשזה נוח לו לבין מי שנמצא כשאין לו מה להרוויח. גם הקשר שנמצא בין מנהלים מקיאווליסטים להתנהגות הרסנית של עובדים (</w:t>
       </w:r>
       <w:r>
         <w:rPr>
@@ -3505,7 +3505,7 @@
           <w:szCs w:val="24"/>
           <w:rtl/>
         </w:rPr>
-        <w:t xml:space="preserve">המחקר של אופלטקה (2007) על מורים הוסיף לי זווית חשובה. התנהגות אזרחית אינה רק תכונה של העובד, אלא תלויה גם בארגון ובמנהל. כשאני חושב על הצוות שלי, העובדים שעוזרים הכי הרבה הם אלה שמרגישים שמעריכים אותם, וזה מתחבר ישירות לתחושת ההוגנות שעליה למדנו במפגש על מוטיבציה (</w:t>
+        <w:t xml:space="preserve">המחקר של אופלטקה (2007) על מורים הוסיף לי זווית חשובה. התנהגות אזרחית אינה רק תכונה של העובד, אלא תלויה גם בארגון ובמנהל. כשאני חושבת על הצוות שלי, העובדים שעוזרים הכי הרבה הם אלה שמרגישים שמעריכים אותם, וזה מתחבר ישירות לתחושת ההוגנות שעליה למדנו במפגש על מוטיבציה (</w:t>
       </w:r>
       <w:r>
         <w:rPr>
@@ -3541,39 +3541,39 @@
           <w:szCs w:val="24"/>
           <w:rtl/>
         </w:rPr>
-        <w:t xml:space="preserve">). אם אני רוצה יותר תרומה מעבר לנדרש, אני צריך להתחיל ממה שאני נותן.</w:t>
-      </w:r>
-    </w:p>
-    <w:p>
-      <w:pPr>
-        <w:bidi/>
-        <w:spacing w:after="120" w:line="360"/>
-        <w:jc w:val="both"/>
-      </w:pPr>
-      <w:r>
-        <w:rPr>
-          <w:rFonts w:ascii="David" w:cs="David" w:eastAsia="David" w:hAnsi="David"/>
-          <w:sz w:val="24"/>
-          <w:szCs w:val="24"/>
-          <w:rtl/>
-        </w:rPr>
-        <w:t xml:space="preserve">ביישום, אני רוצה להכניס בצוות שלי שאלה קבועה בשיחות ההערכה: "מי עזר לך החודש?". כך תגיע אליי גם העזרה שנעשית בלי קהל, ולא רק זו שאני רואה בעיניים. במקביל אני מתכוון לשים לב לאופן שבו אני עצמי מתגמל עזרה: אם אני מחמיא רק על מה שנעשה מולי, אני מלמד את הצוות לעזור רק מולי.</w:t>
-      </w:r>
-    </w:p>
-    <w:p>
-      <w:pPr>
-        <w:bidi/>
-        <w:spacing w:after="120" w:line="360"/>
-        <w:jc w:val="both"/>
-      </w:pPr>
-      <w:r>
-        <w:rPr>
-          <w:rFonts w:ascii="David" w:cs="David" w:eastAsia="David" w:hAnsi="David"/>
-          <w:sz w:val="24"/>
-          <w:szCs w:val="24"/>
-          <w:rtl/>
-        </w:rPr>
-        <w:t xml:space="preserve">הדבר הקשה יותר הוא לזהות מקיאווליזם בלי להפוך לחשדן. לא כל מי שעוזר מול המנהל עושה זאת מחישוב, ולא ארצה צוות שבו כל מחווה נבדקת. לכן אני מעדיף לשנות את המערכת ולא לתייג אנשים: אם העזרה השקטה נראית ומוערכת, פחות משתלם לנהל רושם.</w:t>
+        <w:t xml:space="preserve">). אם אני רוצה יותר תרומה מעבר לנדרש, אני צריכה להתחיל ממה שאני נותנת.</w:t>
+      </w:r>
+    </w:p>
+    <w:p>
+      <w:pPr>
+        <w:bidi/>
+        <w:spacing w:after="120" w:line="360"/>
+        <w:jc w:val="both"/>
+      </w:pPr>
+      <w:r>
+        <w:rPr>
+          <w:rFonts w:ascii="David" w:cs="David" w:eastAsia="David" w:hAnsi="David"/>
+          <w:sz w:val="24"/>
+          <w:szCs w:val="24"/>
+          <w:rtl/>
+        </w:rPr>
+        <w:t xml:space="preserve">ביישום, אני רוצה להכניס בצוות שלי שאלה קבועה בשיחות ההערכה: "מי עזר לך החודש?". כך תגיע אליי גם העזרה שנעשית בלי קהל, ולא רק זו שאני רואה בעיניים. במקביל אני מתכוונת לשים לב לאופן שבו אני עצמי מתגמלת עזרה: אם אני מחמיאה רק על מה שנעשה מולי, אני מלמדת את הצוות לעזור רק מולי.</w:t>
+      </w:r>
+    </w:p>
+    <w:p>
+      <w:pPr>
+        <w:bidi/>
+        <w:spacing w:after="120" w:line="360"/>
+        <w:jc w:val="both"/>
+      </w:pPr>
+      <w:r>
+        <w:rPr>
+          <w:rFonts w:ascii="David" w:cs="David" w:eastAsia="David" w:hAnsi="David"/>
+          <w:sz w:val="24"/>
+          <w:szCs w:val="24"/>
+          <w:rtl/>
+        </w:rPr>
+        <w:t xml:space="preserve">הדבר הקשה יותר הוא לזהות מקיאווליזם בלי להפוך לחשדנית. לא כל מי שעוזר מול המנהל עושה זאת מחישוב, ולא ארצה צוות שבו כל מחווה נבדקת. לכן אני מעדיפה לשנות את המערכת ולא לתייג אנשים: אם העזרה השקטה נראית ומוערכת, פחות משתלם לנהל רושם.</w:t>
       </w:r>
     </w:p>
     <w:p>

</xml_diff>

<commit_message>
Add third submitter and her reflection (leadership; culture and conflict)
Co-Authored-By: Claude Opus 5.5 <noreply@anthropic.com>
Claude-Session: https://claude.ai/code/session_01HRkqVTfSkfLSvYdwqYD5BN
</commit_message>
<xml_diff>
--- a/papers/עבודת-סיכום-התנהגות-ארגונית.docx
+++ b/papers/עבודת-סיכום-התנהגות-ארגונית.docx
@@ -276,6 +276,25 @@
       <w:pPr>
         <w:bidi/>
         <w:spacing w:line="360"/>
+        <w:jc w:val="center"/>
+      </w:pPr>
+      <w:r>
+        <w:rPr>
+          <w:rFonts w:ascii="David" w:cs="David" w:eastAsia="David" w:hAnsi="David"/>
+          <w:b w:val="false"/>
+          <w:noProof/>
+          <w:sz w:val="24"/>
+          <w:szCs w:val="24"/>
+          <w:rtl/>
+          <w:lang w:val="en-US" w:bidi="he-IL"/>
+        </w:rPr>
+        <w:t xml:space="preserve">עביר בדיר    ת"ז: 034387365</w:t>
+      </w:r>
+    </w:p>
+    <w:p>
+      <w:pPr>
+        <w:bidi/>
+        <w:spacing w:line="360"/>
       </w:pPr>
     </w:p>
     <w:p>
@@ -4221,6 +4240,395 @@
           <w:lang w:val="en-US" w:bidi="he-IL"/>
         </w:rPr>
         <w:t xml:space="preserve">הבנתי שההתנהגות הארגונית עוסקת בפער שבין מה שרואים לבין מה שקורה באמת. מאחורי מוטיבציה, תרומה או ירידה בביצועים עומד תמיד תהליך פנימי של השוואה, צורך או חישוב, ומנהל שמסתפק במה שגלוי לעין יטעה שוב ושוב. הבנתי גם שחלק מהידע ה"מקובל" בתחום, כמו ההבדלים בין דורות, צריך להיבדק ולא להתקבל כמובן מאליו. זה הופך את התחום לפחות ודאי ממה שחשבתי, ולמעניין הרבה יותר.</w:t>
+      </w:r>
+    </w:p>
+    <w:p>
+      <w:pPr>
+        <w:keepNext/>
+        <w:pageBreakBefore/>
+        <w:bidi/>
+        <w:spacing w:after="80" w:before="200" w:line="360"/>
+        <w:jc w:val="right"/>
+      </w:pPr>
+      <w:r>
+        <w:rPr>
+          <w:rFonts w:ascii="David" w:cs="David" w:eastAsia="David" w:hAnsi="David"/>
+          <w:b/>
+          <w:bCs/>
+          <w:noProof/>
+          <w:sz w:val="28"/>
+          <w:szCs w:val="28"/>
+          <w:rtl/>
+          <w:lang w:val="en-US" w:bidi="he-IL"/>
+        </w:rPr>
+        <w:t xml:space="preserve">רפלקציה: עביר בדיר</w:t>
+      </w:r>
+    </w:p>
+    <w:p>
+      <w:pPr>
+        <w:keepNext/>
+        <w:bidi/>
+        <w:spacing w:after="80" w:before="60" w:line="360"/>
+        <w:jc w:val="right"/>
+      </w:pPr>
+      <w:r>
+        <w:rPr>
+          <w:rFonts w:ascii="David" w:cs="David" w:eastAsia="David" w:hAnsi="David"/>
+          <w:b/>
+          <w:bCs/>
+          <w:noProof/>
+          <w:sz w:val="24"/>
+          <w:szCs w:val="24"/>
+          <w:rtl/>
+          <w:lang w:val="en-US" w:bidi="he-IL"/>
+        </w:rPr>
+        <w:t xml:space="preserve">נושא ראשון: מנהיגות</w:t>
+      </w:r>
+    </w:p>
+    <w:p>
+      <w:pPr>
+        <w:bidi/>
+        <w:spacing w:after="120" w:line="360"/>
+        <w:jc w:val="both"/>
+      </w:pPr>
+      <w:r>
+        <w:rPr>
+          <w:rFonts w:ascii="David" w:cs="David" w:eastAsia="David" w:hAnsi="David"/>
+          <w:noProof/>
+          <w:sz w:val="24"/>
+          <w:szCs w:val="24"/>
+          <w:rtl/>
+          <w:lang w:val="en-US" w:bidi="he-IL"/>
+        </w:rPr>
+        <w:t xml:space="preserve">התחברתי לנושא המנהיגות משום שבמשך שנים חשבתי שמנהיגות היא עניין של כריזמה: מי שמדבר בביטחון ויודע לסחוף אנשים. ההרצאה על מנהיגות, והקריאה על מנהיגות אותנטית, הציגו לי תמונה אחרת. במחקר על 410 מנהלי בתי ספר נמצא שמנהלים אותנטיים, הפועלים ממניעים פנימיים ולא מתוך רצון ברווח אישי או במעמד, מרבים לתרום מעבר לנדרש וממעטים להשתמש בטקטיקות השפעה בלתי נאותות (מילון ושפירא-לשצ'ינסקי, 2021). לא מדובר במנהל שמרשים יותר, אלא במנהל שאפשר לסמוך עליו.</w:t>
+      </w:r>
+    </w:p>
+    <w:p>
+      <w:pPr>
+        <w:bidi/>
+        <w:spacing w:after="120" w:line="360"/>
+        <w:jc w:val="both"/>
+      </w:pPr>
+      <w:r>
+        <w:rPr>
+          <w:rFonts w:ascii="David" w:cs="David" w:eastAsia="David" w:hAnsi="David"/>
+          <w:noProof/>
+          <w:sz w:val="24"/>
+          <w:szCs w:val="24"/>
+          <w:rtl/>
+          <w:lang w:val="en-US" w:bidi="he-IL"/>
+        </w:rPr>
+        <w:t xml:space="preserve">בחיים המקצועיים הבחנה זו עזרה לי להבין שני מנהלים שעבדתי תחתם. הראשון היה מרשים מאוד בישיבות, אבל החלטות רבות התקבלו אצלו בשיחות מסדרון, ומידע חשוב הגיע רק לחלק מהצוות. השנייה דיברה פחות, אבל הסבירה כל החלטה ואמרה בגלוי גם כשלא ידעה. בזמנו לא הבנתי למה התחושה בצוות שלה הייתה בטוחה יותר. היום יש לי מילים לזה: הראשון השתמש בשליטה במידע ככלי השפעה, כפי שמתוארות טקטיקות פוליטיות בספרות (ויגודה, 1997, כפי שמצוטט אצל מילון ושפירא-לשצ'ינסקי, 2021), והשנייה פעלה מתוך עקביות בין מה שהיא אומרת לבין מה שהיא עושה.</w:t>
+      </w:r>
+    </w:p>
+    <w:p>
+      <w:pPr>
+        <w:bidi/>
+        <w:spacing w:after="120" w:line="360"/>
+        <w:jc w:val="both"/>
+      </w:pPr>
+      <w:r>
+        <w:rPr>
+          <w:rFonts w:ascii="David" w:cs="David" w:eastAsia="David" w:hAnsi="David"/>
+          <w:noProof/>
+          <w:sz w:val="24"/>
+          <w:szCs w:val="24"/>
+          <w:rtl/>
+          <w:lang w:val="en-US" w:bidi="he-IL"/>
+        </w:rPr>
+        <w:t xml:space="preserve">הפתיע אותי גם הממצא של שטיינמן ועמיתיה (</w:t>
+      </w:r>
+      <w:r>
+        <w:rPr>
+          <w:rFonts w:ascii="David" w:cs="David" w:eastAsia="David" w:hAnsi="David"/>
+          <w:noProof/>
+          <w:sz w:val="24"/>
+          <w:szCs w:val="24"/>
+          <w:rtl/>
+          <w:lang w:val="en-US" w:bidi="he-IL"/>
+        </w:rPr>
+        <w:t xml:space="preserve">‏</w:t>
+      </w:r>
+      <w:r>
+        <w:rPr>
+          <w:rFonts w:ascii="David" w:cs="David" w:eastAsia="David" w:hAnsi="David"/>
+          <w:noProof/>
+          <w:sz w:val="24"/>
+          <w:szCs w:val="24"/>
+          <w:rtl w:val="false"/>
+          <w:lang w:val="en-US" w:bidi="he-IL"/>
+        </w:rPr>
+        <w:t xml:space="preserve">Steinmann et al., 2016</w:t>
+      </w:r>
+      <w:r>
+        <w:rPr>
+          <w:rFonts w:ascii="David" w:cs="David" w:eastAsia="David" w:hAnsi="David"/>
+          <w:noProof/>
+          <w:sz w:val="24"/>
+          <w:szCs w:val="24"/>
+          <w:rtl/>
+          <w:lang w:val="en-US" w:bidi="he-IL"/>
+        </w:rPr>
+        <w:t xml:space="preserve">‏</w:t>
+      </w:r>
+      <w:r>
+        <w:rPr>
+          <w:rFonts w:ascii="David" w:cs="David" w:eastAsia="David" w:hAnsi="David"/>
+          <w:noProof/>
+          <w:sz w:val="24"/>
+          <w:szCs w:val="24"/>
+          <w:rtl/>
+          <w:lang w:val="en-US" w:bidi="he-IL"/>
+        </w:rPr>
+        <w:t xml:space="preserve">), שלפיו מנהלים בעלי צורך גבוה בכוח הצליחו יותר, והעובדים שלהם היו מרוצים יותר, כשהיה להם גם צורך גבוה בהשתייכות. תמיד חשבתי שהרצון להיות אהובה הוא חולשה של מנהלת, ושמנהלת טובה צריכה להיות קצת מרוחקת. מתברר שהשילוב בין הרצון להשפיע לבין אכפתיות אמיתית כלפי האנשים הוא דווקא מה שמאפשר להוביל.</w:t>
+      </w:r>
+    </w:p>
+    <w:p>
+      <w:pPr>
+        <w:bidi/>
+        <w:spacing w:after="120" w:line="360"/>
+        <w:jc w:val="both"/>
+      </w:pPr>
+      <w:r>
+        <w:rPr>
+          <w:rFonts w:ascii="David" w:cs="David" w:eastAsia="David" w:hAnsi="David"/>
+          <w:noProof/>
+          <w:sz w:val="24"/>
+          <w:szCs w:val="24"/>
+          <w:rtl/>
+          <w:lang w:val="en-US" w:bidi="he-IL"/>
+        </w:rPr>
+        <w:t xml:space="preserve">היה גם ממצא שהיה לי קשה יותר לקבל. באותו מחקר על מנהלי בתי ספר לא נמצא קשר בין התנהגות אזרחית לבין התנהגות פוליטית, כלומר אותו מנהל יכול לתרום מעבר לנדרש ובמקביל להפעיל טקטיקות השפעה (מילון ושפירא-לשצ'ינסקי, 2021). כשבדקתי את עצמי בכנות, ראיתי שגם אני עושה את זה לפעמים: עוזרת מאוד, ובאותו זמן בוחרת בקפידה מתי ומול מי לעזור. הממצא לא גרם לי להרגיש אשמה, אלא להבין שאותנטיות אינה תכונה שיש או אין, אלא בחירה שחוזרת על עצמה בכל החלטה קטנה.</w:t>
+      </w:r>
+    </w:p>
+    <w:p>
+      <w:pPr>
+        <w:bidi/>
+        <w:spacing w:after="120" w:line="360"/>
+        <w:jc w:val="both"/>
+      </w:pPr>
+      <w:r>
+        <w:rPr>
+          <w:rFonts w:ascii="David" w:cs="David" w:eastAsia="David" w:hAnsi="David"/>
+          <w:noProof/>
+          <w:sz w:val="24"/>
+          <w:szCs w:val="24"/>
+          <w:rtl/>
+          <w:lang w:val="en-US" w:bidi="he-IL"/>
+        </w:rPr>
+        <w:t xml:space="preserve">בחיים האישיים זיהיתי את אותו דבר במשפחה ובוועד ההורים שבו אני פעילה. מי שמובילים בפועל אינם תמיד מי שמדברים הכי הרבה, אלא מי שאנשים סומכים על כך שהם לא פועלים מתוך אינטרס נסתר.</w:t>
+      </w:r>
+    </w:p>
+    <w:p>
+      <w:pPr>
+        <w:bidi/>
+        <w:spacing w:after="120" w:line="360"/>
+        <w:jc w:val="both"/>
+      </w:pPr>
+      <w:r>
+        <w:rPr>
+          <w:rFonts w:ascii="David" w:cs="David" w:eastAsia="David" w:hAnsi="David"/>
+          <w:noProof/>
+          <w:sz w:val="24"/>
+          <w:szCs w:val="24"/>
+          <w:rtl/>
+          <w:lang w:val="en-US" w:bidi="he-IL"/>
+        </w:rPr>
+        <w:t xml:space="preserve">ביישום, אני רוצה לאמץ שני הרגלים בתפקידי כרכזת. הראשון, להסביר את הנימוקים שמאחורי החלטות, גם כשהן לא פופולריות, במקום להסתפק בהודעה על ההחלטה. השני, לשים לב למקומות שבהם אני מחזיקה מידע שאחרים צריכים, ולשאול את עצמי אם אני מעבירה אותו כי זה נכון או מעכבת אותו כי זה נותן לי כוח.</w:t>
+      </w:r>
+    </w:p>
+    <w:p>
+      <w:pPr>
+        <w:keepNext/>
+        <w:bidi/>
+        <w:spacing w:after="80" w:before="60" w:line="360"/>
+        <w:jc w:val="right"/>
+      </w:pPr>
+      <w:r>
+        <w:rPr>
+          <w:rFonts w:ascii="David" w:cs="David" w:eastAsia="David" w:hAnsi="David"/>
+          <w:b/>
+          <w:bCs/>
+          <w:noProof/>
+          <w:sz w:val="24"/>
+          <w:szCs w:val="24"/>
+          <w:rtl/>
+          <w:lang w:val="en-US" w:bidi="he-IL"/>
+        </w:rPr>
+        <w:t xml:space="preserve">נושא שני: תרבות ארגונית וניהול קונפליקטים</w:t>
+      </w:r>
+    </w:p>
+    <w:p>
+      <w:pPr>
+        <w:bidi/>
+        <w:spacing w:after="120" w:line="360"/>
+        <w:jc w:val="both"/>
+      </w:pPr>
+      <w:r>
+        <w:rPr>
+          <w:rFonts w:ascii="David" w:cs="David" w:eastAsia="David" w:hAnsi="David"/>
+          <w:noProof/>
+          <w:sz w:val="24"/>
+          <w:szCs w:val="24"/>
+          <w:rtl/>
+          <w:lang w:val="en-US" w:bidi="he-IL"/>
+        </w:rPr>
+        <w:t xml:space="preserve">הנושא הזה ערער אצלי הנחה שהחזקתי בה זמן רב. תמיד ראיתי בתרבות ארגונית חזקה דבר רצוי: כולם מסכימים על הערכים, יש תחושת משפחה, יודעים מה מצופה מכל אחד. המחקר של מש וכהן (2021) הראה צד אחר. בארגונים בעלי תרבות חזקה הקונצנזוס מסווה הבדלי אינטרסים, וכאשר קונפליקט מתפרץ בכל זאת, הוא מנוהל בסגנון תחרותי של מנצח ומפסיד. דווקא בתרבות חלשה יותר, שיש בה מקום לדעות שונות, נמצא סגנון של שיתוף פעולה.</w:t>
+      </w:r>
+    </w:p>
+    <w:p>
+      <w:pPr>
+        <w:bidi/>
+        <w:spacing w:after="120" w:line="360"/>
+        <w:jc w:val="both"/>
+      </w:pPr>
+      <w:r>
+        <w:rPr>
+          <w:rFonts w:ascii="David" w:cs="David" w:eastAsia="David" w:hAnsi="David"/>
+          <w:noProof/>
+          <w:sz w:val="24"/>
+          <w:szCs w:val="24"/>
+          <w:rtl/>
+          <w:lang w:val="en-US" w:bidi="he-IL"/>
+        </w:rPr>
+        <w:t xml:space="preserve">בחיים המקצועיים זה תיאר במדויק את מקום העבודה שלי. אצלנו מדברים הרבה על "משפחה", ומי שמביעה הסתייגות נתפסת לפעמים כמי שאינה נאמנה. התוצאה היא שמחלוקות לא עולות בישיבות. הן נשארות במסדרונות, ואז מתפוצצות בבת אחת. מש וכהן (2021) מתארים בדיוק את הדפוס הזה: אנשים נמנעים מעימות כל עוד אפשר, וכשאין ברירה הם מתעמתים במלוא העוצמה. כשקראתי את זה הבנתי שהבעיה אינה באנשים, אלא בתרבות שאינה מאפשרת לחלוקי דעות להיות דבר רגיל.</w:t>
+      </w:r>
+    </w:p>
+    <w:p>
+      <w:pPr>
+        <w:bidi/>
+        <w:spacing w:after="120" w:line="360"/>
+        <w:jc w:val="both"/>
+      </w:pPr>
+      <w:r>
+        <w:rPr>
+          <w:rFonts w:ascii="David" w:cs="David" w:eastAsia="David" w:hAnsi="David"/>
+          <w:noProof/>
+          <w:sz w:val="24"/>
+          <w:szCs w:val="24"/>
+          <w:rtl/>
+          <w:lang w:val="en-US" w:bidi="he-IL"/>
+        </w:rPr>
+        <w:t xml:space="preserve">עוד ממצא שנגע בי הוא הקשר שנמצא בין תרבות חזקה לבין סולידריות גבוהה. החוקרים מפרשים זאת כעדות לכך שתרבות חזקה מעודדת דמיון על פני שונות (מש וכהן, 2021, עמ' 12). חשבתי על עובדות חדשות שהצטרפו לצוות שלנו בשנה האחרונה, עם רקע וניסיון שונים משלנו. במקום לשמוע מה הן מביאות, ציפינו מהן להתאים את עצמן במהירות. ייתכן שבדרך איבדנו בדיוק את הרעיונות שהיו יכולים לשפר את העבודה.</w:t>
+      </w:r>
+    </w:p>
+    <w:p>
+      <w:pPr>
+        <w:bidi/>
+        <w:spacing w:after="120" w:line="360"/>
+        <w:jc w:val="both"/>
+      </w:pPr>
+      <w:r>
+        <w:rPr>
+          <w:rFonts w:ascii="David" w:cs="David" w:eastAsia="David" w:hAnsi="David"/>
+          <w:noProof/>
+          <w:sz w:val="24"/>
+          <w:szCs w:val="24"/>
+          <w:rtl/>
+          <w:lang w:val="en-US" w:bidi="he-IL"/>
+        </w:rPr>
+        <w:t xml:space="preserve">בחיים האישיים ראיתי את אותה דינמיקה במשפחה המורחבת. יש משפחות שבהן "לא מדברים על זה" כדי לשמור על השקט, ואז ויכוח קטן על חלוקת אחריות הופך לריב גדול. הבנתי שאחדות אמיתית אינה היעדר מחלוקות, אלא היכולת לדבר עליהן בלי שמישהו ירגיש שהוא בוגד.</w:t>
+      </w:r>
+    </w:p>
+    <w:p>
+      <w:pPr>
+        <w:bidi/>
+        <w:spacing w:after="120" w:line="360"/>
+        <w:jc w:val="both"/>
+      </w:pPr>
+      <w:r>
+        <w:rPr>
+          <w:rFonts w:ascii="David" w:cs="David" w:eastAsia="David" w:hAnsi="David"/>
+          <w:noProof/>
+          <w:sz w:val="24"/>
+          <w:szCs w:val="24"/>
+          <w:rtl/>
+          <w:lang w:val="en-US" w:bidi="he-IL"/>
+        </w:rPr>
+        <w:t xml:space="preserve">מה שאפשר ליישם הוא המעבר משיח של עמדות לשיח של אינטרסים, שהמאמר מציג כתנאי לשיתוף פעולה (מש וכהן, 2021). כשמתעוררת מחלוקת בצוות, אני רוצה לשאול לא רק "מה את רוצה" אלא "למה זה חשוב לך". בנוסף, מודל הערכים הסותרים (</w:t>
+      </w:r>
+      <w:r>
+        <w:rPr>
+          <w:rFonts w:ascii="David" w:cs="David" w:eastAsia="David" w:hAnsi="David"/>
+          <w:noProof/>
+          <w:sz w:val="24"/>
+          <w:szCs w:val="24"/>
+          <w:rtl/>
+          <w:lang w:val="en-US" w:bidi="he-IL"/>
+        </w:rPr>
+        <w:t xml:space="preserve">‏</w:t>
+      </w:r>
+      <w:r>
+        <w:rPr>
+          <w:rFonts w:ascii="David" w:cs="David" w:eastAsia="David" w:hAnsi="David"/>
+          <w:noProof/>
+          <w:sz w:val="24"/>
+          <w:szCs w:val="24"/>
+          <w:rtl w:val="false"/>
+          <w:lang w:val="en-US" w:bidi="he-IL"/>
+        </w:rPr>
+        <w:t xml:space="preserve">Helfrich et al., 2007</w:t>
+      </w:r>
+      <w:r>
+        <w:rPr>
+          <w:rFonts w:ascii="David" w:cs="David" w:eastAsia="David" w:hAnsi="David"/>
+          <w:noProof/>
+          <w:sz w:val="24"/>
+          <w:szCs w:val="24"/>
+          <w:rtl/>
+          <w:lang w:val="en-US" w:bidi="he-IL"/>
+        </w:rPr>
+        <w:t xml:space="preserve">‏</w:t>
+      </w:r>
+      <w:r>
+        <w:rPr>
+          <w:rFonts w:ascii="David" w:cs="David" w:eastAsia="David" w:hAnsi="David"/>
+          <w:noProof/>
+          <w:sz w:val="24"/>
+          <w:szCs w:val="24"/>
+          <w:rtl/>
+          <w:lang w:val="en-US" w:bidi="he-IL"/>
+        </w:rPr>
+        <w:t xml:space="preserve">) עזר לי לזהות שהתרבות אצלנו היא בעיקר צוותית, עם ערכים של שייכות ומחויבות. אין צורך לוותר עליה, אבל כדאי להוסיף לה מנגנון קבוע, למשל סבב קצר בסוף כל ישיבה שבו כל אחת אומרת מה מטריד אותה, כך שהסתייגות תהיה חלק מהשגרה ולא חריגה ממנה.</w:t>
+      </w:r>
+    </w:p>
+    <w:p>
+      <w:pPr>
+        <w:keepNext/>
+        <w:bidi/>
+        <w:spacing w:after="80" w:before="60" w:line="360"/>
+        <w:jc w:val="right"/>
+      </w:pPr>
+      <w:r>
+        <w:rPr>
+          <w:rFonts w:ascii="David" w:cs="David" w:eastAsia="David" w:hAnsi="David"/>
+          <w:b/>
+          <w:bCs/>
+          <w:noProof/>
+          <w:sz w:val="24"/>
+          <w:szCs w:val="24"/>
+          <w:rtl/>
+          <w:lang w:val="en-US" w:bidi="he-IL"/>
+        </w:rPr>
+        <w:t xml:space="preserve">תובנות על הדיסציפלינה</w:t>
+      </w:r>
+    </w:p>
+    <w:p>
+      <w:pPr>
+        <w:bidi/>
+        <w:spacing w:after="120" w:line="360"/>
+        <w:jc w:val="both"/>
+      </w:pPr>
+      <w:r>
+        <w:rPr>
+          <w:rFonts w:ascii="David" w:cs="David" w:eastAsia="David" w:hAnsi="David"/>
+          <w:noProof/>
+          <w:sz w:val="24"/>
+          <w:szCs w:val="24"/>
+          <w:rtl/>
+          <w:lang w:val="en-US" w:bidi="he-IL"/>
+        </w:rPr>
+        <w:t xml:space="preserve">התובנה המרכזית שלי היא שבהתנהגות ארגונית כמעט לכל דבר טוב יש מחיר. תרבות חזקה מלכדת, אבל עלולה להשתיק. מנהיג כריזמטי מרשים, אבל לא תמיד ראוי לאמון. הקורס לימד אותי לא להסתפק בשאלה "האם זה טוב לארגון", אלא לשאול גם "למי זה טוב, ומה זה עולה". הבנתי גם שהתחום מחבר בין רמת הפרט לבין רמת הארגון: אי אפשר להבין מנהל בלי להבין את התרבות שבה הוא פועל, ואי אפשר לשנות תרבות בלי מנהלים שמתנהגים אחרת.</w:t>
       </w:r>
     </w:p>
     <w:p>

</xml_diff>

<commit_message>
Use Word heading styles and keep headings with their text
Co-Authored-By: Claude Opus 5.5 <noreply@anthropic.com>
Claude-Session: https://claude.ai/code/session_01HRkqVTfSkfLSvYdwqYD5BN
</commit_message>
<xml_diff>
--- a/papers/עבודת-סיכום-התנהגות-ארגונית.docx
+++ b/papers/עבודת-סיכום-התנהגות-ארגונית.docx
@@ -353,9 +353,10 @@
     </w:p>
     <w:p>
       <w:pPr>
+        <w:pStyle w:val="Heading1"/>
         <w:keepNext/>
-        <w:bidi/>
-        <w:spacing w:after="80" w:before="200" w:line="360"/>
+        <w:keepLines/>
+        <w:bidi/>
         <w:jc w:val="center"/>
       </w:pPr>
       <w:r>
@@ -374,6 +375,7 @@
     </w:p>
     <w:p>
       <w:pPr>
+        <w:widowControl/>
         <w:bidi/>
         <w:spacing w:after="120" w:line="360"/>
         <w:jc w:val="both"/>
@@ -392,9 +394,10 @@
     </w:p>
     <w:p>
       <w:pPr>
+        <w:pStyle w:val="Heading2"/>
         <w:keepNext/>
-        <w:bidi/>
-        <w:spacing w:after="80" w:before="200" w:line="360"/>
+        <w:keepLines/>
+        <w:bidi/>
         <w:jc w:val="right"/>
       </w:pPr>
       <w:r>
@@ -413,6 +416,7 @@
     </w:p>
     <w:p>
       <w:pPr>
+        <w:widowControl/>
         <w:bidi/>
         <w:spacing w:after="120" w:line="360"/>
         <w:jc w:val="both"/>
@@ -431,9 +435,10 @@
     </w:p>
     <w:p>
       <w:pPr>
+        <w:pStyle w:val="Heading3"/>
         <w:keepNext/>
-        <w:bidi/>
-        <w:spacing w:after="80" w:before="60" w:line="360"/>
+        <w:keepLines/>
+        <w:bidi/>
         <w:jc w:val="right"/>
       </w:pPr>
       <w:r>
@@ -452,6 +457,7 @@
     </w:p>
     <w:p>
       <w:pPr>
+        <w:widowControl/>
         <w:bidi/>
         <w:spacing w:after="120" w:line="360"/>
         <w:jc w:val="both"/>
@@ -558,6 +564,7 @@
     </w:p>
     <w:p>
       <w:pPr>
+        <w:widowControl/>
         <w:bidi/>
         <w:spacing w:after="120" w:line="360"/>
         <w:jc w:val="both"/>
@@ -576,9 +583,10 @@
     </w:p>
     <w:p>
       <w:pPr>
+        <w:pStyle w:val="Heading3"/>
         <w:keepNext/>
-        <w:bidi/>
-        <w:spacing w:after="80" w:before="60" w:line="360"/>
+        <w:keepLines/>
+        <w:bidi/>
         <w:jc w:val="right"/>
       </w:pPr>
       <w:r>
@@ -597,6 +605,7 @@
     </w:p>
     <w:p>
       <w:pPr>
+        <w:widowControl/>
         <w:bidi/>
         <w:spacing w:after="120" w:line="360"/>
         <w:jc w:val="both"/>
@@ -747,6 +756,7 @@
     </w:p>
     <w:p>
       <w:pPr>
+        <w:widowControl/>
         <w:bidi/>
         <w:spacing w:after="120" w:line="360"/>
         <w:jc w:val="both"/>
@@ -853,9 +863,10 @@
     </w:p>
     <w:p>
       <w:pPr>
+        <w:pStyle w:val="Heading3"/>
         <w:keepNext/>
-        <w:bidi/>
-        <w:spacing w:after="80" w:before="60" w:line="360"/>
+        <w:keepLines/>
+        <w:bidi/>
         <w:jc w:val="right"/>
       </w:pPr>
       <w:r>
@@ -874,6 +885,7 @@
     </w:p>
     <w:p>
       <w:pPr>
+        <w:widowControl/>
         <w:bidi/>
         <w:spacing w:after="120" w:line="360"/>
         <w:jc w:val="both"/>
@@ -936,6 +948,7 @@
     </w:p>
     <w:p>
       <w:pPr>
+        <w:widowControl/>
         <w:bidi/>
         <w:spacing w:after="120" w:line="360"/>
         <w:jc w:val="both"/>
@@ -998,6 +1011,7 @@
     </w:p>
     <w:p>
       <w:pPr>
+        <w:widowControl/>
         <w:bidi/>
         <w:spacing w:after="120" w:line="360"/>
         <w:jc w:val="both"/>
@@ -1016,9 +1030,10 @@
     </w:p>
     <w:p>
       <w:pPr>
+        <w:pStyle w:val="Heading2"/>
         <w:keepNext/>
-        <w:bidi/>
-        <w:spacing w:after="80" w:before="200" w:line="360"/>
+        <w:keepLines/>
+        <w:bidi/>
         <w:jc w:val="right"/>
       </w:pPr>
       <w:r>
@@ -1037,6 +1052,7 @@
     </w:p>
     <w:p>
       <w:pPr>
+        <w:widowControl/>
         <w:bidi/>
         <w:spacing w:after="120" w:line="360"/>
         <w:jc w:val="both"/>
@@ -1055,9 +1071,10 @@
     </w:p>
     <w:p>
       <w:pPr>
+        <w:pStyle w:val="Heading3"/>
         <w:keepNext/>
-        <w:bidi/>
-        <w:spacing w:after="80" w:before="60" w:line="360"/>
+        <w:keepLines/>
+        <w:bidi/>
         <w:jc w:val="right"/>
       </w:pPr>
       <w:r>
@@ -1076,6 +1093,7 @@
     </w:p>
     <w:p>
       <w:pPr>
+        <w:widowControl/>
         <w:bidi/>
         <w:spacing w:after="120" w:line="360"/>
         <w:jc w:val="both"/>
@@ -1270,6 +1288,7 @@
     </w:p>
     <w:p>
       <w:pPr>
+        <w:widowControl/>
         <w:bidi/>
         <w:spacing w:after="120" w:line="360"/>
         <w:jc w:val="both"/>
@@ -1288,9 +1307,10 @@
     </w:p>
     <w:p>
       <w:pPr>
+        <w:pStyle w:val="Heading3"/>
         <w:keepNext/>
-        <w:bidi/>
-        <w:spacing w:after="80" w:before="60" w:line="360"/>
+        <w:keepLines/>
+        <w:bidi/>
         <w:jc w:val="right"/>
       </w:pPr>
       <w:r>
@@ -1309,6 +1329,7 @@
     </w:p>
     <w:p>
       <w:pPr>
+        <w:widowControl/>
         <w:bidi/>
         <w:spacing w:after="120" w:line="360"/>
         <w:jc w:val="both"/>
@@ -1547,6 +1568,7 @@
     </w:p>
     <w:p>
       <w:pPr>
+        <w:widowControl/>
         <w:bidi/>
         <w:spacing w:after="120" w:line="360"/>
         <w:jc w:val="both"/>
@@ -1565,9 +1587,10 @@
     </w:p>
     <w:p>
       <w:pPr>
+        <w:pStyle w:val="Heading3"/>
         <w:keepNext/>
-        <w:bidi/>
-        <w:spacing w:after="80" w:before="60" w:line="360"/>
+        <w:keepLines/>
+        <w:bidi/>
         <w:jc w:val="right"/>
       </w:pPr>
       <w:r>
@@ -1586,6 +1609,7 @@
     </w:p>
     <w:p>
       <w:pPr>
+        <w:widowControl/>
         <w:bidi/>
         <w:spacing w:after="120" w:line="360"/>
         <w:jc w:val="both"/>
@@ -1692,6 +1716,7 @@
     </w:p>
     <w:p>
       <w:pPr>
+        <w:widowControl/>
         <w:bidi/>
         <w:spacing w:after="120" w:line="360"/>
         <w:jc w:val="both"/>
@@ -1710,9 +1735,10 @@
     </w:p>
     <w:p>
       <w:pPr>
+        <w:pStyle w:val="Heading3"/>
         <w:keepNext/>
-        <w:bidi/>
-        <w:spacing w:after="80" w:before="60" w:line="360"/>
+        <w:keepLines/>
+        <w:bidi/>
         <w:jc w:val="right"/>
       </w:pPr>
       <w:r>
@@ -1731,6 +1757,7 @@
     </w:p>
     <w:p>
       <w:pPr>
+        <w:widowControl/>
         <w:bidi/>
         <w:spacing w:after="120" w:line="360"/>
         <w:jc w:val="both"/>
@@ -1793,9 +1820,10 @@
     </w:p>
     <w:p>
       <w:pPr>
+        <w:pStyle w:val="Heading2"/>
         <w:keepNext/>
-        <w:bidi/>
-        <w:spacing w:after="80" w:before="200" w:line="360"/>
+        <w:keepLines/>
+        <w:bidi/>
         <w:jc w:val="right"/>
       </w:pPr>
       <w:r>
@@ -1814,6 +1842,7 @@
     </w:p>
     <w:p>
       <w:pPr>
+        <w:widowControl/>
         <w:bidi/>
         <w:spacing w:after="120" w:line="360"/>
         <w:jc w:val="both"/>
@@ -1832,9 +1861,10 @@
     </w:p>
     <w:p>
       <w:pPr>
+        <w:pStyle w:val="Heading3"/>
         <w:keepNext/>
-        <w:bidi/>
-        <w:spacing w:after="80" w:before="60" w:line="360"/>
+        <w:keepLines/>
+        <w:bidi/>
         <w:jc w:val="right"/>
       </w:pPr>
       <w:r>
@@ -1853,6 +1883,7 @@
     </w:p>
     <w:p>
       <w:pPr>
+        <w:widowControl/>
         <w:bidi/>
         <w:spacing w:after="120" w:line="360"/>
         <w:jc w:val="both"/>
@@ -1915,6 +1946,7 @@
     </w:p>
     <w:p>
       <w:pPr>
+        <w:widowControl/>
         <w:bidi/>
         <w:spacing w:after="120" w:line="360"/>
         <w:jc w:val="both"/>
@@ -2065,6 +2097,7 @@
     </w:p>
     <w:p>
       <w:pPr>
+        <w:widowControl/>
         <w:bidi/>
         <w:spacing w:after="120" w:line="360"/>
         <w:jc w:val="both"/>
@@ -2083,9 +2116,10 @@
     </w:p>
     <w:p>
       <w:pPr>
+        <w:pStyle w:val="Heading3"/>
         <w:keepNext/>
-        <w:bidi/>
-        <w:spacing w:after="80" w:before="60" w:line="360"/>
+        <w:keepLines/>
+        <w:bidi/>
         <w:jc w:val="right"/>
       </w:pPr>
       <w:r>
@@ -2104,6 +2138,7 @@
     </w:p>
     <w:p>
       <w:pPr>
+        <w:widowControl/>
         <w:bidi/>
         <w:spacing w:after="120" w:line="360"/>
         <w:jc w:val="both"/>
@@ -2342,6 +2377,7 @@
     </w:p>
     <w:p>
       <w:pPr>
+        <w:widowControl/>
         <w:bidi/>
         <w:spacing w:after="120" w:line="360"/>
         <w:jc w:val="both"/>
@@ -2404,9 +2440,10 @@
     </w:p>
     <w:p>
       <w:pPr>
+        <w:pStyle w:val="Heading3"/>
         <w:keepNext/>
-        <w:bidi/>
-        <w:spacing w:after="80" w:before="60" w:line="360"/>
+        <w:keepLines/>
+        <w:bidi/>
         <w:jc w:val="right"/>
       </w:pPr>
       <w:r>
@@ -2425,6 +2462,7 @@
     </w:p>
     <w:p>
       <w:pPr>
+        <w:widowControl/>
         <w:bidi/>
         <w:spacing w:after="120" w:line="360"/>
         <w:jc w:val="both"/>
@@ -2531,9 +2569,10 @@
     </w:p>
     <w:p>
       <w:pPr>
+        <w:pStyle w:val="Heading2"/>
         <w:keepNext/>
-        <w:bidi/>
-        <w:spacing w:after="80" w:before="200" w:line="360"/>
+        <w:keepLines/>
+        <w:bidi/>
         <w:jc w:val="right"/>
       </w:pPr>
       <w:r>
@@ -2552,6 +2591,7 @@
     </w:p>
     <w:p>
       <w:pPr>
+        <w:widowControl/>
         <w:bidi/>
         <w:spacing w:after="120" w:line="360"/>
         <w:jc w:val="both"/>
@@ -2570,9 +2610,10 @@
     </w:p>
     <w:p>
       <w:pPr>
+        <w:pStyle w:val="Heading3"/>
         <w:keepNext/>
-        <w:bidi/>
-        <w:spacing w:after="80" w:before="60" w:line="360"/>
+        <w:keepLines/>
+        <w:bidi/>
         <w:jc w:val="right"/>
       </w:pPr>
       <w:r>
@@ -2591,6 +2632,7 @@
     </w:p>
     <w:p>
       <w:pPr>
+        <w:widowControl/>
         <w:bidi/>
         <w:spacing w:after="120" w:line="360"/>
         <w:jc w:val="both"/>
@@ -2741,6 +2783,7 @@
     </w:p>
     <w:p>
       <w:pPr>
+        <w:widowControl/>
         <w:bidi/>
         <w:spacing w:after="120" w:line="360"/>
         <w:jc w:val="both"/>
@@ -2847,9 +2890,10 @@
     </w:p>
     <w:p>
       <w:pPr>
+        <w:pStyle w:val="Heading3"/>
         <w:keepNext/>
-        <w:bidi/>
-        <w:spacing w:after="80" w:before="60" w:line="360"/>
+        <w:keepLines/>
+        <w:bidi/>
         <w:jc w:val="right"/>
       </w:pPr>
       <w:r>
@@ -2868,6 +2912,7 @@
     </w:p>
     <w:p>
       <w:pPr>
+        <w:widowControl/>
         <w:bidi/>
         <w:spacing w:after="120" w:line="360"/>
         <w:jc w:val="both"/>
@@ -2974,9 +3019,10 @@
     </w:p>
     <w:p>
       <w:pPr>
+        <w:pStyle w:val="Heading3"/>
         <w:keepNext/>
-        <w:bidi/>
-        <w:spacing w:after="80" w:before="60" w:line="360"/>
+        <w:keepLines/>
+        <w:bidi/>
         <w:jc w:val="right"/>
       </w:pPr>
       <w:r>
@@ -2995,6 +3041,7 @@
     </w:p>
     <w:p>
       <w:pPr>
+        <w:widowControl/>
         <w:bidi/>
         <w:spacing w:after="120" w:line="360"/>
         <w:jc w:val="both"/>
@@ -3057,6 +3104,7 @@
     </w:p>
     <w:p>
       <w:pPr>
+        <w:widowControl/>
         <w:bidi/>
         <w:spacing w:after="120" w:line="360"/>
         <w:jc w:val="both"/>
@@ -3119,10 +3167,11 @@
     </w:p>
     <w:p>
       <w:pPr>
+        <w:pStyle w:val="Heading1"/>
         <w:keepNext/>
+        <w:keepLines/>
         <w:pageBreakBefore/>
         <w:bidi/>
-        <w:spacing w:after="80" w:before="200" w:line="360"/>
         <w:jc w:val="center"/>
       </w:pPr>
       <w:r>
@@ -3141,9 +3190,10 @@
     </w:p>
     <w:p>
       <w:pPr>
+        <w:pStyle w:val="Heading2"/>
         <w:keepNext/>
-        <w:bidi/>
-        <w:spacing w:after="80" w:before="200" w:line="360"/>
+        <w:keepLines/>
+        <w:bidi/>
         <w:jc w:val="right"/>
       </w:pPr>
       <w:r>
@@ -3162,9 +3212,10 @@
     </w:p>
     <w:p>
       <w:pPr>
+        <w:pStyle w:val="Heading3"/>
         <w:keepNext/>
-        <w:bidi/>
-        <w:spacing w:after="80" w:before="60" w:line="360"/>
+        <w:keepLines/>
+        <w:bidi/>
         <w:jc w:val="right"/>
       </w:pPr>
       <w:r>
@@ -3183,6 +3234,7 @@
     </w:p>
     <w:p>
       <w:pPr>
+        <w:widowControl/>
         <w:bidi/>
         <w:spacing w:after="120" w:line="360"/>
         <w:jc w:val="both"/>
@@ -3245,6 +3297,7 @@
     </w:p>
     <w:p>
       <w:pPr>
+        <w:widowControl/>
         <w:bidi/>
         <w:spacing w:after="120" w:line="360"/>
         <w:jc w:val="both"/>
@@ -3263,6 +3316,7 @@
     </w:p>
     <w:p>
       <w:pPr>
+        <w:widowControl/>
         <w:bidi/>
         <w:spacing w:after="120" w:line="360"/>
         <w:jc w:val="both"/>
@@ -3281,6 +3335,7 @@
     </w:p>
     <w:p>
       <w:pPr>
+        <w:widowControl/>
         <w:bidi/>
         <w:spacing w:after="120" w:line="360"/>
         <w:jc w:val="both"/>
@@ -3299,6 +3354,7 @@
     </w:p>
     <w:p>
       <w:pPr>
+        <w:widowControl/>
         <w:bidi/>
         <w:spacing w:after="120" w:line="360"/>
         <w:jc w:val="both"/>
@@ -3361,9 +3417,10 @@
     </w:p>
     <w:p>
       <w:pPr>
+        <w:pStyle w:val="Heading3"/>
         <w:keepNext/>
-        <w:bidi/>
-        <w:spacing w:after="80" w:before="60" w:line="360"/>
+        <w:keepLines/>
+        <w:bidi/>
         <w:jc w:val="right"/>
       </w:pPr>
       <w:r>
@@ -3382,6 +3439,7 @@
     </w:p>
     <w:p>
       <w:pPr>
+        <w:widowControl/>
         <w:bidi/>
         <w:spacing w:after="120" w:line="360"/>
         <w:jc w:val="both"/>
@@ -3400,6 +3458,7 @@
     </w:p>
     <w:p>
       <w:pPr>
+        <w:widowControl/>
         <w:bidi/>
         <w:spacing w:after="120" w:line="360"/>
         <w:jc w:val="both"/>
@@ -3462,6 +3521,7 @@
     </w:p>
     <w:p>
       <w:pPr>
+        <w:widowControl/>
         <w:bidi/>
         <w:spacing w:after="120" w:line="360"/>
         <w:jc w:val="both"/>
@@ -3480,6 +3540,7 @@
     </w:p>
     <w:p>
       <w:pPr>
+        <w:widowControl/>
         <w:bidi/>
         <w:spacing w:after="120" w:line="360"/>
         <w:jc w:val="both"/>
@@ -3498,6 +3559,7 @@
     </w:p>
     <w:p>
       <w:pPr>
+        <w:widowControl/>
         <w:bidi/>
         <w:spacing w:after="120" w:line="360"/>
         <w:jc w:val="both"/>
@@ -3560,6 +3622,7 @@
     </w:p>
     <w:p>
       <w:pPr>
+        <w:widowControl/>
         <w:bidi/>
         <w:spacing w:after="120" w:line="360"/>
         <w:jc w:val="both"/>
@@ -3578,9 +3641,10 @@
     </w:p>
     <w:p>
       <w:pPr>
+        <w:pStyle w:val="Heading3"/>
         <w:keepNext/>
-        <w:bidi/>
-        <w:spacing w:after="80" w:before="60" w:line="360"/>
+        <w:keepLines/>
+        <w:bidi/>
         <w:jc w:val="right"/>
       </w:pPr>
       <w:r>
@@ -3599,6 +3663,7 @@
     </w:p>
     <w:p>
       <w:pPr>
+        <w:widowControl/>
         <w:bidi/>
         <w:spacing w:after="120" w:line="360"/>
         <w:jc w:val="both"/>
@@ -3617,10 +3682,11 @@
     </w:p>
     <w:p>
       <w:pPr>
+        <w:pStyle w:val="Heading2"/>
         <w:keepNext/>
+        <w:keepLines/>
         <w:pageBreakBefore/>
         <w:bidi/>
-        <w:spacing w:after="80" w:before="200" w:line="360"/>
         <w:jc w:val="right"/>
       </w:pPr>
       <w:r>
@@ -3639,9 +3705,10 @@
     </w:p>
     <w:p>
       <w:pPr>
+        <w:pStyle w:val="Heading3"/>
         <w:keepNext/>
-        <w:bidi/>
-        <w:spacing w:after="80" w:before="60" w:line="360"/>
+        <w:keepLines/>
+        <w:bidi/>
         <w:jc w:val="right"/>
       </w:pPr>
       <w:r>
@@ -3660,6 +3727,7 @@
     </w:p>
     <w:p>
       <w:pPr>
+        <w:widowControl/>
         <w:bidi/>
         <w:spacing w:after="120" w:line="360"/>
         <w:jc w:val="both"/>
@@ -3722,6 +3790,7 @@
     </w:p>
     <w:p>
       <w:pPr>
+        <w:widowControl/>
         <w:bidi/>
         <w:spacing w:after="120" w:line="360"/>
         <w:jc w:val="both"/>
@@ -3828,6 +3897,7 @@
     </w:p>
     <w:p>
       <w:pPr>
+        <w:widowControl/>
         <w:bidi/>
         <w:spacing w:after="120" w:line="360"/>
         <w:jc w:val="both"/>
@@ -3890,6 +3960,7 @@
     </w:p>
     <w:p>
       <w:pPr>
+        <w:widowControl/>
         <w:bidi/>
         <w:spacing w:after="120" w:line="360"/>
         <w:jc w:val="both"/>
@@ -3908,6 +3979,7 @@
     </w:p>
     <w:p>
       <w:pPr>
+        <w:widowControl/>
         <w:bidi/>
         <w:spacing w:after="120" w:line="360"/>
         <w:jc w:val="both"/>
@@ -3926,6 +3998,7 @@
     </w:p>
     <w:p>
       <w:pPr>
+        <w:widowControl/>
         <w:bidi/>
         <w:spacing w:after="120" w:line="360"/>
         <w:jc w:val="both"/>
@@ -3988,6 +4061,7 @@
     </w:p>
     <w:p>
       <w:pPr>
+        <w:widowControl/>
         <w:bidi/>
         <w:spacing w:after="120" w:line="360"/>
         <w:jc w:val="both"/>
@@ -4006,9 +4080,10 @@
     </w:p>
     <w:p>
       <w:pPr>
+        <w:pStyle w:val="Heading3"/>
         <w:keepNext/>
-        <w:bidi/>
-        <w:spacing w:after="80" w:before="60" w:line="360"/>
+        <w:keepLines/>
+        <w:bidi/>
         <w:jc w:val="right"/>
       </w:pPr>
       <w:r>
@@ -4027,6 +4102,7 @@
     </w:p>
     <w:p>
       <w:pPr>
+        <w:widowControl/>
         <w:bidi/>
         <w:spacing w:after="120" w:line="360"/>
         <w:jc w:val="both"/>
@@ -4045,6 +4121,7 @@
     </w:p>
     <w:p>
       <w:pPr>
+        <w:widowControl/>
         <w:bidi/>
         <w:spacing w:after="120" w:line="360"/>
         <w:jc w:val="both"/>
@@ -4107,6 +4184,7 @@
     </w:p>
     <w:p>
       <w:pPr>
+        <w:widowControl/>
         <w:bidi/>
         <w:spacing w:after="120" w:line="360"/>
         <w:jc w:val="both"/>
@@ -4169,6 +4247,7 @@
     </w:p>
     <w:p>
       <w:pPr>
+        <w:widowControl/>
         <w:bidi/>
         <w:spacing w:after="120" w:line="360"/>
         <w:jc w:val="both"/>
@@ -4187,6 +4266,7 @@
     </w:p>
     <w:p>
       <w:pPr>
+        <w:widowControl/>
         <w:bidi/>
         <w:spacing w:after="120" w:line="360"/>
         <w:jc w:val="both"/>
@@ -4205,9 +4285,10 @@
     </w:p>
     <w:p>
       <w:pPr>
+        <w:pStyle w:val="Heading3"/>
         <w:keepNext/>
-        <w:bidi/>
-        <w:spacing w:after="80" w:before="60" w:line="360"/>
+        <w:keepLines/>
+        <w:bidi/>
         <w:jc w:val="right"/>
       </w:pPr>
       <w:r>
@@ -4226,6 +4307,7 @@
     </w:p>
     <w:p>
       <w:pPr>
+        <w:widowControl/>
         <w:bidi/>
         <w:spacing w:after="120" w:line="360"/>
         <w:jc w:val="both"/>
@@ -4244,10 +4326,11 @@
     </w:p>
     <w:p>
       <w:pPr>
+        <w:pStyle w:val="Heading2"/>
         <w:keepNext/>
+        <w:keepLines/>
         <w:pageBreakBefore/>
         <w:bidi/>
-        <w:spacing w:after="80" w:before="200" w:line="360"/>
         <w:jc w:val="right"/>
       </w:pPr>
       <w:r>
@@ -4266,9 +4349,10 @@
     </w:p>
     <w:p>
       <w:pPr>
+        <w:pStyle w:val="Heading3"/>
         <w:keepNext/>
-        <w:bidi/>
-        <w:spacing w:after="80" w:before="60" w:line="360"/>
+        <w:keepLines/>
+        <w:bidi/>
         <w:jc w:val="right"/>
       </w:pPr>
       <w:r>
@@ -4287,6 +4371,7 @@
     </w:p>
     <w:p>
       <w:pPr>
+        <w:widowControl/>
         <w:bidi/>
         <w:spacing w:after="120" w:line="360"/>
         <w:jc w:val="both"/>
@@ -4305,6 +4390,7 @@
     </w:p>
     <w:p>
       <w:pPr>
+        <w:widowControl/>
         <w:bidi/>
         <w:spacing w:after="120" w:line="360"/>
         <w:jc w:val="both"/>
@@ -4323,6 +4409,7 @@
     </w:p>
     <w:p>
       <w:pPr>
+        <w:widowControl/>
         <w:bidi/>
         <w:spacing w:after="120" w:line="360"/>
         <w:jc w:val="both"/>
@@ -4385,6 +4472,7 @@
     </w:p>
     <w:p>
       <w:pPr>
+        <w:widowControl/>
         <w:bidi/>
         <w:spacing w:after="120" w:line="360"/>
         <w:jc w:val="both"/>
@@ -4403,6 +4491,7 @@
     </w:p>
     <w:p>
       <w:pPr>
+        <w:widowControl/>
         <w:bidi/>
         <w:spacing w:after="120" w:line="360"/>
         <w:jc w:val="both"/>
@@ -4421,6 +4510,7 @@
     </w:p>
     <w:p>
       <w:pPr>
+        <w:widowControl/>
         <w:bidi/>
         <w:spacing w:after="120" w:line="360"/>
         <w:jc w:val="both"/>
@@ -4439,9 +4529,10 @@
     </w:p>
     <w:p>
       <w:pPr>
+        <w:pStyle w:val="Heading3"/>
         <w:keepNext/>
-        <w:bidi/>
-        <w:spacing w:after="80" w:before="60" w:line="360"/>
+        <w:keepLines/>
+        <w:bidi/>
         <w:jc w:val="right"/>
       </w:pPr>
       <w:r>
@@ -4460,6 +4551,7 @@
     </w:p>
     <w:p>
       <w:pPr>
+        <w:widowControl/>
         <w:bidi/>
         <w:spacing w:after="120" w:line="360"/>
         <w:jc w:val="both"/>
@@ -4478,6 +4570,7 @@
     </w:p>
     <w:p>
       <w:pPr>
+        <w:widowControl/>
         <w:bidi/>
         <w:spacing w:after="120" w:line="360"/>
         <w:jc w:val="both"/>
@@ -4496,6 +4589,7 @@
     </w:p>
     <w:p>
       <w:pPr>
+        <w:widowControl/>
         <w:bidi/>
         <w:spacing w:after="120" w:line="360"/>
         <w:jc w:val="both"/>
@@ -4514,6 +4608,7 @@
     </w:p>
     <w:p>
       <w:pPr>
+        <w:widowControl/>
         <w:bidi/>
         <w:spacing w:after="120" w:line="360"/>
         <w:jc w:val="both"/>
@@ -4532,6 +4627,7 @@
     </w:p>
     <w:p>
       <w:pPr>
+        <w:widowControl/>
         <w:bidi/>
         <w:spacing w:after="120" w:line="360"/>
         <w:jc w:val="both"/>
@@ -4594,9 +4690,10 @@
     </w:p>
     <w:p>
       <w:pPr>
+        <w:pStyle w:val="Heading3"/>
         <w:keepNext/>
-        <w:bidi/>
-        <w:spacing w:after="80" w:before="60" w:line="360"/>
+        <w:keepLines/>
+        <w:bidi/>
         <w:jc w:val="right"/>
       </w:pPr>
       <w:r>
@@ -4615,6 +4712,7 @@
     </w:p>
     <w:p>
       <w:pPr>
+        <w:widowControl/>
         <w:bidi/>
         <w:spacing w:after="120" w:line="360"/>
         <w:jc w:val="both"/>
@@ -4633,10 +4731,11 @@
     </w:p>
     <w:p>
       <w:pPr>
+        <w:pStyle w:val="Heading1"/>
         <w:keepNext/>
+        <w:keepLines/>
         <w:pageBreakBefore/>
         <w:bidi/>
-        <w:spacing w:after="80" w:before="200" w:line="360"/>
         <w:jc w:val="center"/>
       </w:pPr>
       <w:r>
@@ -5377,39 +5476,6 @@
     <w:rPr>
       <w:sz w:val="56"/>
       <w:szCs w:val="56"/>
-    </w:rPr>
-  </w:style>
-  <w:style w:type="paragraph" w:styleId="Heading1">
-    <w:name w:val="Heading 1"/>
-    <w:basedOn w:val="Normal"/>
-    <w:next w:val="Normal"/>
-    <w:qFormat/>
-    <w:rPr>
-      <w:color w:val="2E74B5"/>
-      <w:sz w:val="32"/>
-      <w:szCs w:val="32"/>
-    </w:rPr>
-  </w:style>
-  <w:style w:type="paragraph" w:styleId="Heading2">
-    <w:name w:val="Heading 2"/>
-    <w:basedOn w:val="Normal"/>
-    <w:next w:val="Normal"/>
-    <w:qFormat/>
-    <w:rPr>
-      <w:color w:val="2E74B5"/>
-      <w:sz w:val="26"/>
-      <w:szCs w:val="26"/>
-    </w:rPr>
-  </w:style>
-  <w:style w:type="paragraph" w:styleId="Heading3">
-    <w:name w:val="Heading 3"/>
-    <w:basedOn w:val="Normal"/>
-    <w:next w:val="Normal"/>
-    <w:qFormat/>
-    <w:rPr>
-      <w:color w:val="1F4D78"/>
-      <w:sz w:val="24"/>
-      <w:szCs w:val="24"/>
     </w:rPr>
   </w:style>
   <w:style w:type="paragraph" w:styleId="Heading4">
@@ -5538,6 +5604,75 @@
     <w:rPr>
       <w:sz w:val="20"/>
       <w:szCs w:val="20"/>
+    </w:rPr>
+  </w:style>
+  <w:style w:type="paragraph" w:styleId="Heading1">
+    <w:name w:val="Heading 1"/>
+    <w:basedOn w:val="Normal"/>
+    <w:next w:val="Normal"/>
+    <w:qFormat/>
+    <w:pPr>
+      <w:keepNext/>
+      <w:keepLines/>
+      <w:spacing w:after="120" w:before="240" w:line="360"/>
+      <w:outlineLvl w:val="0"/>
+    </w:pPr>
+    <w:rPr>
+      <w:rFonts w:ascii="David" w:cs="David" w:eastAsia="David" w:hAnsi="David"/>
+      <w:b/>
+      <w:bCs/>
+      <w:noProof/>
+      <w:color w:val="000000"/>
+      <w:sz w:val="32"/>
+      <w:szCs w:val="32"/>
+      <w:rtl/>
+      <w:lang w:val="en-US" w:bidi="he-IL"/>
+    </w:rPr>
+  </w:style>
+  <w:style w:type="paragraph" w:styleId="Heading2">
+    <w:name w:val="Heading 2"/>
+    <w:basedOn w:val="Normal"/>
+    <w:next w:val="Normal"/>
+    <w:qFormat/>
+    <w:pPr>
+      <w:keepNext/>
+      <w:keepLines/>
+      <w:spacing w:after="80" w:before="200" w:line="360"/>
+      <w:outlineLvl w:val="1"/>
+    </w:pPr>
+    <w:rPr>
+      <w:rFonts w:ascii="David" w:cs="David" w:eastAsia="David" w:hAnsi="David"/>
+      <w:b/>
+      <w:bCs/>
+      <w:noProof/>
+      <w:color w:val="000000"/>
+      <w:sz w:val="28"/>
+      <w:szCs w:val="28"/>
+      <w:rtl/>
+      <w:lang w:val="en-US" w:bidi="he-IL"/>
+    </w:rPr>
+  </w:style>
+  <w:style w:type="paragraph" w:styleId="Heading3">
+    <w:name w:val="Heading 3"/>
+    <w:basedOn w:val="Normal"/>
+    <w:next w:val="Normal"/>
+    <w:qFormat/>
+    <w:pPr>
+      <w:keepNext/>
+      <w:keepLines/>
+      <w:spacing w:after="40" w:before="60" w:line="360"/>
+      <w:outlineLvl w:val="2"/>
+    </w:pPr>
+    <w:rPr>
+      <w:rFonts w:ascii="David" w:cs="David" w:eastAsia="David" w:hAnsi="David"/>
+      <w:b/>
+      <w:bCs/>
+      <w:noProof/>
+      <w:color w:val="000000"/>
+      <w:sz w:val="24"/>
+      <w:szCs w:val="24"/>
+      <w:rtl/>
+      <w:lang w:val="en-US" w:bidi="he-IL"/>
     </w:rPr>
   </w:style>
 </w:styles>

</xml_diff>